<commit_message>
Add my name to the student list
</commit_message>
<xml_diff>
--- a/Admin/students_names.docx
+++ b/Admin/students_names.docx
@@ -1,6 +1,6 @@
 
 <file path=word/document.xml><?xml version="1.0" encoding="utf-8"?>
-<w:document xmlns:wpc="http://schemas.microsoft.com/office/word/2010/wordprocessingCanvas" xmlns:cx="http://schemas.microsoft.com/office/drawing/2014/chartex" xmlns:cx1="http://schemas.microsoft.com/office/drawing/2015/9/8/chartex" xmlns:cx2="http://schemas.microsoft.com/office/drawing/2015/10/21/chartex" xmlns:cx3="http://schemas.microsoft.com/office/drawing/2016/5/9/chartex" xmlns:cx4="http://schemas.microsoft.com/office/drawing/2016/5/10/chartex" xmlns:cx5="http://schemas.microsoft.com/office/drawing/2016/5/11/chartex" xmlns:cx6="http://schemas.microsoft.com/office/drawing/2016/5/12/chartex" xmlns:cx7="http://schemas.microsoft.com/office/drawing/2016/5/13/chartex" xmlns:cx8="http://schemas.microsoft.com/office/drawing/2016/5/14/chartex" xmlns:mc="http://schemas.openxmlformats.org/markup-compatibility/2006" xmlns:aink="http://schemas.microsoft.com/office/drawing/2016/ink" xmlns:am3d="http://schemas.microsoft.com/office/drawing/2017/model3d" xmlns:o="urn:schemas-microsoft-com:office:office" xmlns:oel="http://schemas.microsoft.com/office/2019/extlst" xmlns:r="http://schemas.openxmlformats.org/officeDocument/2006/relationships" xmlns:m="http://schemas.openxmlformats.org/officeDocument/2006/math" xmlns:v="urn:schemas-microsoft-com:vml" xmlns:wp14="http://schemas.microsoft.com/office/word/2010/wordprocessingDrawing" xmlns:wp="http://schemas.openxmlformats.org/drawingml/2006/wordprocessingDrawing" xmlns:w10="urn:schemas-microsoft-com:office:word" xmlns:w="http://schemas.openxmlformats.org/wordprocessingml/2006/main" xmlns:w14="http://schemas.microsoft.com/office/word/2010/wordml" xmlns:w15="http://schemas.microsoft.com/office/word/2012/wordml" xmlns:w16cex="http://schemas.microsoft.com/office/word/2018/wordml/cex" xmlns:w16cid="http://schemas.microsoft.com/office/word/2016/wordml/cid" xmlns:w16="http://schemas.microsoft.com/office/word/2018/wordml" xmlns:w16du="http://schemas.microsoft.com/office/word/2023/wordml/word16du" xmlns:w16sdtdh="http://schemas.microsoft.com/office/word/2020/wordml/sdtdatahash" xmlns:w16sdtfl="http://schemas.microsoft.com/office/word/2024/wordml/sdtformatlock" xmlns:w16se="http://schemas.microsoft.com/office/word/2015/wordml/symex" xmlns:wpg="http://schemas.microsoft.com/office/word/2010/wordprocessingGroup" xmlns:wpi="http://schemas.microsoft.com/office/word/2010/wordprocessingInk" xmlns:wne="http://schemas.microsoft.com/office/word/2006/wordml" xmlns:wps="http://schemas.microsoft.com/office/word/2010/wordprocessingShape" mc:Ignorable="w14 w15 w16se w16cid w16 w16cex w16sdtdh w16sdtfl w16du wp14">
+<w:document xmlns:wpc="http://schemas.microsoft.com/office/word/2010/wordprocessingCanvas" xmlns:cx="http://schemas.microsoft.com/office/drawing/2014/chartex" xmlns:cx1="http://schemas.microsoft.com/office/drawing/2015/9/8/chartex" xmlns:cx2="http://schemas.microsoft.com/office/drawing/2015/10/21/chartex" xmlns:cx3="http://schemas.microsoft.com/office/drawing/2016/5/9/chartex" xmlns:cx4="http://schemas.microsoft.com/office/drawing/2016/5/10/chartex" xmlns:cx5="http://schemas.microsoft.com/office/drawing/2016/5/11/chartex" xmlns:cx6="http://schemas.microsoft.com/office/drawing/2016/5/12/chartex" xmlns:cx7="http://schemas.microsoft.com/office/drawing/2016/5/13/chartex" xmlns:cx8="http://schemas.microsoft.com/office/drawing/2016/5/14/chartex" xmlns:mc="http://schemas.openxmlformats.org/markup-compatibility/2006" xmlns:aink="http://schemas.microsoft.com/office/drawing/2016/ink" xmlns:am3d="http://schemas.microsoft.com/office/drawing/2017/model3d" xmlns:o="urn:schemas-microsoft-com:office:office" xmlns:r="http://schemas.openxmlformats.org/officeDocument/2006/relationships" xmlns:m="http://schemas.openxmlformats.org/officeDocument/2006/math" xmlns:v="urn:schemas-microsoft-com:vml" xmlns:wp14="http://schemas.microsoft.com/office/word/2010/wordprocessingDrawing" xmlns:wp="http://schemas.openxmlformats.org/drawingml/2006/wordprocessingDrawing" xmlns:w10="urn:schemas-microsoft-com:office:word" xmlns:w="http://schemas.openxmlformats.org/wordprocessingml/2006/main" xmlns:w14="http://schemas.microsoft.com/office/word/2010/wordml" xmlns:w15="http://schemas.microsoft.com/office/word/2012/wordml" xmlns:w16cex="http://schemas.microsoft.com/office/word/2018/wordml/cex" xmlns:w16cid="http://schemas.microsoft.com/office/word/2016/wordml/cid" xmlns:w16="http://schemas.microsoft.com/office/word/2018/wordml" xmlns:w16sdtdh="http://schemas.microsoft.com/office/word/2020/wordml/sdtdatahash" xmlns:w16se="http://schemas.microsoft.com/office/word/2015/wordml/symex" xmlns:wpg="http://schemas.microsoft.com/office/word/2010/wordprocessingGroup" xmlns:wpi="http://schemas.microsoft.com/office/word/2010/wordprocessingInk" xmlns:wne="http://schemas.microsoft.com/office/word/2006/wordml" xmlns:wps="http://schemas.microsoft.com/office/word/2010/wordprocessingShape" mc:Ignorable="w14 w15 w16se w16cid w16 w16cex w16sdtdh wp14">
   <w:body>
     <w:p>
       <w:pPr>
@@ -29,6 +29,34 @@
       <w:r>
         <w:t xml:space="preserve"> </w:t>
       </w:r>
+    </w:p>
+    <w:p>
+      <w:pPr>
+        <w:pStyle w:val="BodyText"/>
+        <w:numPr>
+          <w:ilvl w:val="0"/>
+          <w:numId w:val="1"/>
+        </w:numPr>
+      </w:pPr>
+      <w:r>
+        <w:t xml:space="preserve">Ebrima O. Jallow </w:t>
+      </w:r>
+      <w:r>
+        <w:tab/>
+      </w:r>
+      <w:r>
+        <w:tab/>
+        <w:t>Mat #: 22713045</w:t>
+      </w:r>
+    </w:p>
+    <w:p>
+      <w:pPr>
+        <w:pStyle w:val="BodyText"/>
+        <w:numPr>
+          <w:ilvl w:val="0"/>
+          <w:numId w:val="1"/>
+        </w:numPr>
+      </w:pPr>
     </w:p>
     <w:p>
       <w:pPr>
@@ -47,7 +75,7 @@
 </file>
 
 <file path=word/numbering.xml><?xml version="1.0" encoding="utf-8"?>
-<w:numbering xmlns:wpc="http://schemas.microsoft.com/office/word/2010/wordprocessingCanvas" xmlns:cx="http://schemas.microsoft.com/office/drawing/2014/chartex" xmlns:cx1="http://schemas.microsoft.com/office/drawing/2015/9/8/chartex" xmlns:cx2="http://schemas.microsoft.com/office/drawing/2015/10/21/chartex" xmlns:cx3="http://schemas.microsoft.com/office/drawing/2016/5/9/chartex" xmlns:cx4="http://schemas.microsoft.com/office/drawing/2016/5/10/chartex" xmlns:cx5="http://schemas.microsoft.com/office/drawing/2016/5/11/chartex" xmlns:cx6="http://schemas.microsoft.com/office/drawing/2016/5/12/chartex" xmlns:cx7="http://schemas.microsoft.com/office/drawing/2016/5/13/chartex" xmlns:cx8="http://schemas.microsoft.com/office/drawing/2016/5/14/chartex" xmlns:mc="http://schemas.openxmlformats.org/markup-compatibility/2006" xmlns:aink="http://schemas.microsoft.com/office/drawing/2016/ink" xmlns:am3d="http://schemas.microsoft.com/office/drawing/2017/model3d" xmlns:o="urn:schemas-microsoft-com:office:office" xmlns:oel="http://schemas.microsoft.com/office/2019/extlst" xmlns:r="http://schemas.openxmlformats.org/officeDocument/2006/relationships" xmlns:m="http://schemas.openxmlformats.org/officeDocument/2006/math" xmlns:v="urn:schemas-microsoft-com:vml" xmlns:wp14="http://schemas.microsoft.com/office/word/2010/wordprocessingDrawing" xmlns:wp="http://schemas.openxmlformats.org/drawingml/2006/wordprocessingDrawing" xmlns:w10="urn:schemas-microsoft-com:office:word" xmlns:w="http://schemas.openxmlformats.org/wordprocessingml/2006/main" xmlns:w14="http://schemas.microsoft.com/office/word/2010/wordml" xmlns:w15="http://schemas.microsoft.com/office/word/2012/wordml" xmlns:w16cex="http://schemas.microsoft.com/office/word/2018/wordml/cex" xmlns:w16cid="http://schemas.microsoft.com/office/word/2016/wordml/cid" xmlns:w16="http://schemas.microsoft.com/office/word/2018/wordml" xmlns:w16du="http://schemas.microsoft.com/office/word/2023/wordml/word16du" xmlns:w16sdtdh="http://schemas.microsoft.com/office/word/2020/wordml/sdtdatahash" xmlns:w16sdtfl="http://schemas.microsoft.com/office/word/2024/wordml/sdtformatlock" xmlns:w16se="http://schemas.microsoft.com/office/word/2015/wordml/symex" xmlns:wpg="http://schemas.microsoft.com/office/word/2010/wordprocessingGroup" xmlns:wpi="http://schemas.microsoft.com/office/word/2010/wordprocessingInk" xmlns:wne="http://schemas.microsoft.com/office/word/2006/wordml" xmlns:wps="http://schemas.microsoft.com/office/word/2010/wordprocessingShape" mc:Ignorable="w14 w15 w16se w16cid w16 w16cex w16sdtdh w16sdtfl w16du wp14">
+<w:numbering xmlns:wpc="http://schemas.microsoft.com/office/word/2010/wordprocessingCanvas" xmlns:cx="http://schemas.microsoft.com/office/drawing/2014/chartex" xmlns:cx1="http://schemas.microsoft.com/office/drawing/2015/9/8/chartex" xmlns:cx2="http://schemas.microsoft.com/office/drawing/2015/10/21/chartex" xmlns:cx3="http://schemas.microsoft.com/office/drawing/2016/5/9/chartex" xmlns:cx4="http://schemas.microsoft.com/office/drawing/2016/5/10/chartex" xmlns:cx5="http://schemas.microsoft.com/office/drawing/2016/5/11/chartex" xmlns:cx6="http://schemas.microsoft.com/office/drawing/2016/5/12/chartex" xmlns:cx7="http://schemas.microsoft.com/office/drawing/2016/5/13/chartex" xmlns:cx8="http://schemas.microsoft.com/office/drawing/2016/5/14/chartex" xmlns:mc="http://schemas.openxmlformats.org/markup-compatibility/2006" xmlns:aink="http://schemas.microsoft.com/office/drawing/2016/ink" xmlns:am3d="http://schemas.microsoft.com/office/drawing/2017/model3d" xmlns:o="urn:schemas-microsoft-com:office:office" xmlns:r="http://schemas.openxmlformats.org/officeDocument/2006/relationships" xmlns:m="http://schemas.openxmlformats.org/officeDocument/2006/math" xmlns:v="urn:schemas-microsoft-com:vml" xmlns:wp14="http://schemas.microsoft.com/office/word/2010/wordprocessingDrawing" xmlns:wp="http://schemas.openxmlformats.org/drawingml/2006/wordprocessingDrawing" xmlns:w10="urn:schemas-microsoft-com:office:word" xmlns:w="http://schemas.openxmlformats.org/wordprocessingml/2006/main" xmlns:w14="http://schemas.microsoft.com/office/word/2010/wordml" xmlns:w15="http://schemas.microsoft.com/office/word/2012/wordml" xmlns:w16cex="http://schemas.microsoft.com/office/word/2018/wordml/cex" xmlns:w16cid="http://schemas.microsoft.com/office/word/2016/wordml/cid" xmlns:w16="http://schemas.microsoft.com/office/word/2018/wordml" xmlns:w16sdtdh="http://schemas.microsoft.com/office/word/2020/wordml/sdtdatahash" xmlns:w16se="http://schemas.microsoft.com/office/word/2015/wordml/symex" xmlns:wpg="http://schemas.microsoft.com/office/word/2010/wordprocessingGroup" xmlns:wpi="http://schemas.microsoft.com/office/word/2010/wordprocessingInk" xmlns:wne="http://schemas.microsoft.com/office/word/2006/wordml" xmlns:wps="http://schemas.microsoft.com/office/word/2010/wordprocessingShape" mc:Ignorable="w14 w15 w16se w16cid w16 w16cex w16sdtdh wp14">
   <w:abstractNum w:abstractNumId="0" w15:restartNumberingAfterBreak="0">
     <w:nsid w:val="71C97DA2"/>
     <w:multiLevelType w:val="hybridMultilevel"/>
@@ -138,14 +166,14 @@
       </w:pPr>
     </w:lvl>
   </w:abstractNum>
-  <w:num w:numId="1" w16cid:durableId="896284631">
+  <w:num w:numId="1">
     <w:abstractNumId w:val="0"/>
   </w:num>
 </w:numbering>
 </file>
 
 <file path=word/styles.xml><?xml version="1.0" encoding="utf-8"?>
-<w:styles xmlns:mc="http://schemas.openxmlformats.org/markup-compatibility/2006" xmlns:r="http://schemas.openxmlformats.org/officeDocument/2006/relationships" xmlns:w="http://schemas.openxmlformats.org/wordprocessingml/2006/main" xmlns:w14="http://schemas.microsoft.com/office/word/2010/wordml" xmlns:w15="http://schemas.microsoft.com/office/word/2012/wordml" xmlns:w16cex="http://schemas.microsoft.com/office/word/2018/wordml/cex" xmlns:w16cid="http://schemas.microsoft.com/office/word/2016/wordml/cid" xmlns:w16="http://schemas.microsoft.com/office/word/2018/wordml" xmlns:w16du="http://schemas.microsoft.com/office/word/2023/wordml/word16du" xmlns:w16sdtdh="http://schemas.microsoft.com/office/word/2020/wordml/sdtdatahash" xmlns:w16sdtfl="http://schemas.microsoft.com/office/word/2024/wordml/sdtformatlock" xmlns:w16se="http://schemas.microsoft.com/office/word/2015/wordml/symex" mc:Ignorable="w14 w15 w16se w16cid w16 w16cex w16sdtdh w16sdtfl w16du">
+<w:styles xmlns:mc="http://schemas.openxmlformats.org/markup-compatibility/2006" xmlns:r="http://schemas.openxmlformats.org/officeDocument/2006/relationships" xmlns:w="http://schemas.openxmlformats.org/wordprocessingml/2006/main" xmlns:w14="http://schemas.microsoft.com/office/word/2010/wordml" xmlns:w15="http://schemas.microsoft.com/office/word/2012/wordml" xmlns:w16cex="http://schemas.microsoft.com/office/word/2018/wordml/cex" xmlns:w16cid="http://schemas.microsoft.com/office/word/2016/wordml/cid" xmlns:w16="http://schemas.microsoft.com/office/word/2018/wordml" xmlns:w16sdtdh="http://schemas.microsoft.com/office/word/2020/wordml/sdtdatahash" xmlns:w16se="http://schemas.microsoft.com/office/word/2015/wordml/symex" mc:Ignorable="w14 w15 w16se w16cid w16 w16cex w16sdtdh">
   <w:docDefaults>
     <w:rPrDefault>
       <w:rPr>

</xml_diff>

<commit_message>
Add my name to student names list
</commit_message>
<xml_diff>
--- a/Admin/students_names.docx
+++ b/Admin/students_names.docx
@@ -1,6 +1,6 @@
 
 <file path=word/document.xml><?xml version="1.0" encoding="utf-8"?>
-<w:document xmlns:wpc="http://schemas.microsoft.com/office/word/2010/wordprocessingCanvas" xmlns:mc="http://schemas.openxmlformats.org/markup-compatibility/2006" xmlns:o="urn:schemas-microsoft-com:office:office" xmlns:r="http://schemas.openxmlformats.org/officeDocument/2006/relationships" xmlns:m="http://schemas.openxmlformats.org/officeDocument/2006/math" xmlns:v="urn:schemas-microsoft-com:vml" xmlns:wp14="http://schemas.microsoft.com/office/word/2010/wordprocessingDrawing" xmlns:wp="http://schemas.openxmlformats.org/drawingml/2006/wordprocessingDrawing" xmlns:w10="urn:schemas-microsoft-com:office:word" xmlns:w="http://schemas.openxmlformats.org/wordprocessingml/2006/main" xmlns:w14="http://schemas.microsoft.com/office/word/2010/wordml" xmlns:w15="http://schemas.microsoft.com/office/word/2012/wordml" xmlns:wpg="http://schemas.microsoft.com/office/word/2010/wordprocessingGroup" xmlns:wpi="http://schemas.microsoft.com/office/word/2010/wordprocessingInk" xmlns:wne="http://schemas.microsoft.com/office/word/2006/wordml" xmlns:wps="http://schemas.microsoft.com/office/word/2010/wordprocessingShape" mc:Ignorable="w14 w15 wp14">
+<w:document xmlns:wpc="http://schemas.microsoft.com/office/word/2010/wordprocessingCanvas" xmlns:cx="http://schemas.microsoft.com/office/drawing/2014/chartex" xmlns:cx1="http://schemas.microsoft.com/office/drawing/2015/9/8/chartex" xmlns:cx2="http://schemas.microsoft.com/office/drawing/2015/10/21/chartex" xmlns:cx3="http://schemas.microsoft.com/office/drawing/2016/5/9/chartex" xmlns:cx4="http://schemas.microsoft.com/office/drawing/2016/5/10/chartex" xmlns:cx5="http://schemas.microsoft.com/office/drawing/2016/5/11/chartex" xmlns:cx6="http://schemas.microsoft.com/office/drawing/2016/5/12/chartex" xmlns:cx7="http://schemas.microsoft.com/office/drawing/2016/5/13/chartex" xmlns:cx8="http://schemas.microsoft.com/office/drawing/2016/5/14/chartex" xmlns:mc="http://schemas.openxmlformats.org/markup-compatibility/2006" xmlns:aink="http://schemas.microsoft.com/office/drawing/2016/ink" xmlns:am3d="http://schemas.microsoft.com/office/drawing/2017/model3d" xmlns:o="urn:schemas-microsoft-com:office:office" xmlns:r="http://schemas.openxmlformats.org/officeDocument/2006/relationships" xmlns:m="http://schemas.openxmlformats.org/officeDocument/2006/math" xmlns:v="urn:schemas-microsoft-com:vml" xmlns:wp14="http://schemas.microsoft.com/office/word/2010/wordprocessingDrawing" xmlns:wp="http://schemas.openxmlformats.org/drawingml/2006/wordprocessingDrawing" xmlns:w10="urn:schemas-microsoft-com:office:word" xmlns:w="http://schemas.openxmlformats.org/wordprocessingml/2006/main" xmlns:w14="http://schemas.microsoft.com/office/word/2010/wordml" xmlns:w15="http://schemas.microsoft.com/office/word/2012/wordml" xmlns:w16cex="http://schemas.microsoft.com/office/word/2018/wordml/cex" xmlns:w16cid="http://schemas.microsoft.com/office/word/2016/wordml/cid" xmlns:w16="http://schemas.microsoft.com/office/word/2018/wordml" xmlns:w16sdtdh="http://schemas.microsoft.com/office/word/2020/wordml/sdtdatahash" xmlns:w16se="http://schemas.microsoft.com/office/word/2015/wordml/symex" xmlns:wpg="http://schemas.microsoft.com/office/word/2010/wordprocessingGroup" xmlns:wpi="http://schemas.microsoft.com/office/word/2010/wordprocessingInk" xmlns:wne="http://schemas.microsoft.com/office/word/2006/wordml" xmlns:wps="http://schemas.microsoft.com/office/word/2010/wordprocessingShape" mc:Ignorable="w14 w15 w16se w16cid w16 w16cex w16sdtdh wp14">
   <w:body>
     <w:p>
       <w:pPr>
@@ -19,21 +19,12 @@
         </w:numPr>
         <w:jc w:val="left"/>
       </w:pPr>
-      <w:proofErr w:type="spellStart"/>
       <w:r>
         <w:rPr>
           <w:sz w:val="24"/>
           <w:szCs w:val="24"/>
         </w:rPr>
-        <w:t>Banno</w:t>
-      </w:r>
-      <w:proofErr w:type="spellEnd"/>
-      <w:r>
-        <w:rPr>
-          <w:sz w:val="24"/>
-          <w:szCs w:val="24"/>
-        </w:rPr>
-        <w:t xml:space="preserve"> Bah      matt: 22713033</w:t>
+        <w:t>Banno Bah      matt: 22713033</w:t>
       </w:r>
       <w:r>
         <w:t xml:space="preserve"> </w:t>
@@ -50,8 +41,25 @@
       <w:r>
         <w:t>Saikou T. Ceesay Mat#: 22713020</w:t>
       </w:r>
-      <w:bookmarkStart w:id="0" w:name="_GoBack"/>
-      <w:bookmarkEnd w:id="0"/>
+    </w:p>
+    <w:p>
+      <w:pPr>
+        <w:pStyle w:val="BodyText"/>
+        <w:numPr>
+          <w:ilvl w:val="0"/>
+          <w:numId w:val="1"/>
+        </w:numPr>
+      </w:pPr>
+      <w:r>
+        <w:t>Ebrima O. Jallow</w:t>
+      </w:r>
+      <w:r>
+        <w:tab/>
+      </w:r>
+      <w:r>
+        <w:tab/>
+        <w:t>Mat #: 22713045</w:t>
+      </w:r>
     </w:p>
     <w:p>
       <w:pPr>
@@ -70,8 +78,8 @@
 </file>
 
 <file path=word/numbering.xml><?xml version="1.0" encoding="utf-8"?>
-<w:numbering xmlns:wpc="http://schemas.microsoft.com/office/word/2010/wordprocessingCanvas" xmlns:mc="http://schemas.openxmlformats.org/markup-compatibility/2006" xmlns:o="urn:schemas-microsoft-com:office:office" xmlns:r="http://schemas.openxmlformats.org/officeDocument/2006/relationships" xmlns:m="http://schemas.openxmlformats.org/officeDocument/2006/math" xmlns:v="urn:schemas-microsoft-com:vml" xmlns:wp14="http://schemas.microsoft.com/office/word/2010/wordprocessingDrawing" xmlns:wp="http://schemas.openxmlformats.org/drawingml/2006/wordprocessingDrawing" xmlns:w10="urn:schemas-microsoft-com:office:word" xmlns:w="http://schemas.openxmlformats.org/wordprocessingml/2006/main" xmlns:w14="http://schemas.microsoft.com/office/word/2010/wordml" xmlns:w15="http://schemas.microsoft.com/office/word/2012/wordml" xmlns:wpg="http://schemas.microsoft.com/office/word/2010/wordprocessingGroup" xmlns:wpi="http://schemas.microsoft.com/office/word/2010/wordprocessingInk" xmlns:wne="http://schemas.microsoft.com/office/word/2006/wordml" xmlns:wps="http://schemas.microsoft.com/office/word/2010/wordprocessingShape" mc:Ignorable="w14 w15 wp14">
-  <w:abstractNum w:abstractNumId="0">
+<w:numbering xmlns:wpc="http://schemas.microsoft.com/office/word/2010/wordprocessingCanvas" xmlns:cx="http://schemas.microsoft.com/office/drawing/2014/chartex" xmlns:cx1="http://schemas.microsoft.com/office/drawing/2015/9/8/chartex" xmlns:cx2="http://schemas.microsoft.com/office/drawing/2015/10/21/chartex" xmlns:cx3="http://schemas.microsoft.com/office/drawing/2016/5/9/chartex" xmlns:cx4="http://schemas.microsoft.com/office/drawing/2016/5/10/chartex" xmlns:cx5="http://schemas.microsoft.com/office/drawing/2016/5/11/chartex" xmlns:cx6="http://schemas.microsoft.com/office/drawing/2016/5/12/chartex" xmlns:cx7="http://schemas.microsoft.com/office/drawing/2016/5/13/chartex" xmlns:cx8="http://schemas.microsoft.com/office/drawing/2016/5/14/chartex" xmlns:mc="http://schemas.openxmlformats.org/markup-compatibility/2006" xmlns:aink="http://schemas.microsoft.com/office/drawing/2016/ink" xmlns:am3d="http://schemas.microsoft.com/office/drawing/2017/model3d" xmlns:o="urn:schemas-microsoft-com:office:office" xmlns:r="http://schemas.openxmlformats.org/officeDocument/2006/relationships" xmlns:m="http://schemas.openxmlformats.org/officeDocument/2006/math" xmlns:v="urn:schemas-microsoft-com:vml" xmlns:wp14="http://schemas.microsoft.com/office/word/2010/wordprocessingDrawing" xmlns:wp="http://schemas.openxmlformats.org/drawingml/2006/wordprocessingDrawing" xmlns:w10="urn:schemas-microsoft-com:office:word" xmlns:w="http://schemas.openxmlformats.org/wordprocessingml/2006/main" xmlns:w14="http://schemas.microsoft.com/office/word/2010/wordml" xmlns:w15="http://schemas.microsoft.com/office/word/2012/wordml" xmlns:w16cex="http://schemas.microsoft.com/office/word/2018/wordml/cex" xmlns:w16cid="http://schemas.microsoft.com/office/word/2016/wordml/cid" xmlns:w16="http://schemas.microsoft.com/office/word/2018/wordml" xmlns:w16sdtdh="http://schemas.microsoft.com/office/word/2020/wordml/sdtdatahash" xmlns:w16se="http://schemas.microsoft.com/office/word/2015/wordml/symex" xmlns:wpg="http://schemas.microsoft.com/office/word/2010/wordprocessingGroup" xmlns:wpi="http://schemas.microsoft.com/office/word/2010/wordprocessingInk" xmlns:wne="http://schemas.microsoft.com/office/word/2006/wordml" xmlns:wps="http://schemas.microsoft.com/office/word/2010/wordprocessingShape" mc:Ignorable="w14 w15 w16se w16cid w16 w16cex w16sdtdh wp14">
+  <w:abstractNum w:abstractNumId="0" w15:restartNumberingAfterBreak="0">
     <w:nsid w:val="71C97DA2"/>
     <w:multiLevelType w:val="hybridMultilevel"/>
     <w:tmpl w:val="23C0DBB0"/>
@@ -168,7 +176,7 @@
 </file>
 
 <file path=word/styles.xml><?xml version="1.0" encoding="utf-8"?>
-<w:styles xmlns:mc="http://schemas.openxmlformats.org/markup-compatibility/2006" xmlns:r="http://schemas.openxmlformats.org/officeDocument/2006/relationships" xmlns:w="http://schemas.openxmlformats.org/wordprocessingml/2006/main" xmlns:w14="http://schemas.microsoft.com/office/word/2010/wordml" xmlns:w15="http://schemas.microsoft.com/office/word/2012/wordml" mc:Ignorable="w14 w15">
+<w:styles xmlns:mc="http://schemas.openxmlformats.org/markup-compatibility/2006" xmlns:r="http://schemas.openxmlformats.org/officeDocument/2006/relationships" xmlns:w="http://schemas.openxmlformats.org/wordprocessingml/2006/main" xmlns:w14="http://schemas.microsoft.com/office/word/2010/wordml" xmlns:w15="http://schemas.microsoft.com/office/word/2012/wordml" xmlns:w16cex="http://schemas.microsoft.com/office/word/2018/wordml/cex" xmlns:w16cid="http://schemas.microsoft.com/office/word/2016/wordml/cid" xmlns:w16="http://schemas.microsoft.com/office/word/2018/wordml" xmlns:w16sdtdh="http://schemas.microsoft.com/office/word/2020/wordml/sdtdatahash" xmlns:w16se="http://schemas.microsoft.com/office/word/2015/wordml/symex" mc:Ignorable="w14 w15 w16se w16cid w16 w16cex w16sdtdh">
   <w:docDefaults>
     <w:rPrDefault>
       <w:rPr>
@@ -185,7 +193,7 @@
       </w:pPr>
     </w:pPrDefault>
   </w:docDefaults>
-  <w:latentStyles w:defLockedState="0" w:defUIPriority="99" w:defSemiHidden="0" w:defUnhideWhenUsed="0" w:defQFormat="0" w:count="371">
+  <w:latentStyles w:defLockedState="0" w:defUIPriority="99" w:defSemiHidden="0" w:defUnhideWhenUsed="0" w:defQFormat="0" w:count="376">
     <w:lsdException w:name="Normal" w:uiPriority="0" w:qFormat="1"/>
     <w:lsdException w:name="heading 1" w:uiPriority="9" w:qFormat="1"/>
     <w:lsdException w:name="heading 2" w:semiHidden="1" w:uiPriority="9" w:unhideWhenUsed="1" w:qFormat="1"/>
@@ -291,7 +299,6 @@
     <w:lsdException w:name="HTML Sample" w:semiHidden="1" w:unhideWhenUsed="1"/>
     <w:lsdException w:name="HTML Typewriter" w:semiHidden="1" w:unhideWhenUsed="1"/>
     <w:lsdException w:name="HTML Variable" w:semiHidden="1" w:unhideWhenUsed="1"/>
-    <w:lsdException w:name="Normal Table" w:semiHidden="1" w:unhideWhenUsed="1"/>
     <w:lsdException w:name="annotation subject" w:semiHidden="1" w:unhideWhenUsed="1"/>
     <w:lsdException w:name="No List" w:semiHidden="1" w:unhideWhenUsed="1"/>
     <w:lsdException w:name="Outline List 1" w:semiHidden="1" w:unhideWhenUsed="1"/>
@@ -334,11 +341,8 @@
     <w:lsdException w:name="Table Contemporary" w:semiHidden="1" w:unhideWhenUsed="1"/>
     <w:lsdException w:name="Table Elegant" w:semiHidden="1" w:unhideWhenUsed="1"/>
     <w:lsdException w:name="Table Professional" w:semiHidden="1" w:unhideWhenUsed="1"/>
-    <w:lsdException w:name="Table Subtle 1" w:semiHidden="1" w:unhideWhenUsed="1"/>
     <w:lsdException w:name="Table Subtle 2" w:semiHidden="1" w:unhideWhenUsed="1"/>
     <w:lsdException w:name="Table Web 1" w:semiHidden="1" w:unhideWhenUsed="1"/>
-    <w:lsdException w:name="Table Web 2" w:semiHidden="1" w:unhideWhenUsed="1"/>
-    <w:lsdException w:name="Table Web 3" w:semiHidden="1" w:unhideWhenUsed="1"/>
     <w:lsdException w:name="Balloon Text" w:semiHidden="1" w:unhideWhenUsed="1"/>
     <w:lsdException w:name="Table Grid" w:uiPriority="39"/>
     <w:lsdException w:name="Table Theme" w:semiHidden="1" w:unhideWhenUsed="1"/>
@@ -557,6 +561,11 @@
     <w:lsdException w:name="List Table 5 Dark Accent 6" w:uiPriority="50"/>
     <w:lsdException w:name="List Table 6 Colorful Accent 6" w:uiPriority="51"/>
     <w:lsdException w:name="List Table 7 Colorful Accent 6" w:uiPriority="52"/>
+    <w:lsdException w:name="Mention" w:semiHidden="1" w:unhideWhenUsed="1"/>
+    <w:lsdException w:name="Smart Hyperlink" w:semiHidden="1" w:unhideWhenUsed="1"/>
+    <w:lsdException w:name="Hashtag" w:semiHidden="1" w:unhideWhenUsed="1"/>
+    <w:lsdException w:name="Unresolved Mention" w:semiHidden="1" w:unhideWhenUsed="1"/>
+    <w:lsdException w:name="Smart Link" w:semiHidden="1" w:unhideWhenUsed="1"/>
   </w:latentStyles>
   <w:style w:type="paragraph" w:default="1" w:styleId="Normal">
     <w:name w:val="Normal"/>

</xml_diff>

<commit_message>
Add John Syllah to participants list
</commit_message>
<xml_diff>
--- a/Admin/students_names.docx
+++ b/Admin/students_names.docx
@@ -1,6 +1,6 @@
 
 <file path=word/document.xml><?xml version="1.0" encoding="utf-8"?>
-<w:document xmlns:wpc="http://schemas.microsoft.com/office/word/2010/wordprocessingCanvas" xmlns:cx="http://schemas.microsoft.com/office/drawing/2014/chartex" xmlns:cx1="http://schemas.microsoft.com/office/drawing/2015/9/8/chartex" xmlns:mc="http://schemas.openxmlformats.org/markup-compatibility/2006" xmlns:o="urn:schemas-microsoft-com:office:office" xmlns:r="http://schemas.openxmlformats.org/officeDocument/2006/relationships" xmlns:m="http://schemas.openxmlformats.org/officeDocument/2006/math" xmlns:v="urn:schemas-microsoft-com:vml" xmlns:wp14="http://schemas.microsoft.com/office/word/2010/wordprocessingDrawing" xmlns:wp="http://schemas.openxmlformats.org/drawingml/2006/wordprocessingDrawing" xmlns:w10="urn:schemas-microsoft-com:office:word" xmlns:w="http://schemas.openxmlformats.org/wordprocessingml/2006/main" xmlns:w14="http://schemas.microsoft.com/office/word/2010/wordml" xmlns:w15="http://schemas.microsoft.com/office/word/2012/wordml" xmlns:w16se="http://schemas.microsoft.com/office/word/2015/wordml/symex" xmlns:wpg="http://schemas.microsoft.com/office/word/2010/wordprocessingGroup" xmlns:wpi="http://schemas.microsoft.com/office/word/2010/wordprocessingInk" xmlns:wne="http://schemas.microsoft.com/office/word/2006/wordml" xmlns:wps="http://schemas.microsoft.com/office/word/2010/wordprocessingShape" mc:Ignorable="w14 w15 w16se wp14">
+<w:document xmlns:wpc="http://schemas.microsoft.com/office/word/2010/wordprocessingCanvas" xmlns:cx="http://schemas.microsoft.com/office/drawing/2014/chartex" xmlns:cx1="http://schemas.microsoft.com/office/drawing/2015/9/8/chartex" xmlns:cx2="http://schemas.microsoft.com/office/drawing/2015/10/21/chartex" xmlns:cx3="http://schemas.microsoft.com/office/drawing/2016/5/9/chartex" xmlns:cx4="http://schemas.microsoft.com/office/drawing/2016/5/10/chartex" xmlns:cx5="http://schemas.microsoft.com/office/drawing/2016/5/11/chartex" xmlns:cx6="http://schemas.microsoft.com/office/drawing/2016/5/12/chartex" xmlns:cx7="http://schemas.microsoft.com/office/drawing/2016/5/13/chartex" xmlns:cx8="http://schemas.microsoft.com/office/drawing/2016/5/14/chartex" xmlns:mc="http://schemas.openxmlformats.org/markup-compatibility/2006" xmlns:aink="http://schemas.microsoft.com/office/drawing/2016/ink" xmlns:am3d="http://schemas.microsoft.com/office/drawing/2017/model3d" xmlns:o="urn:schemas-microsoft-com:office:office" xmlns:oel="http://schemas.microsoft.com/office/2019/extlst" xmlns:r="http://schemas.openxmlformats.org/officeDocument/2006/relationships" xmlns:m="http://schemas.openxmlformats.org/officeDocument/2006/math" xmlns:v="urn:schemas-microsoft-com:vml" xmlns:wp14="http://schemas.microsoft.com/office/word/2010/wordprocessingDrawing" xmlns:wp="http://schemas.openxmlformats.org/drawingml/2006/wordprocessingDrawing" xmlns:w10="urn:schemas-microsoft-com:office:word" xmlns:w="http://schemas.openxmlformats.org/wordprocessingml/2006/main" xmlns:w14="http://schemas.microsoft.com/office/word/2010/wordml" xmlns:w15="http://schemas.microsoft.com/office/word/2012/wordml" xmlns:w16cex="http://schemas.microsoft.com/office/word/2018/wordml/cex" xmlns:w16cid="http://schemas.microsoft.com/office/word/2016/wordml/cid" xmlns:w16="http://schemas.microsoft.com/office/word/2018/wordml" xmlns:w16du="http://schemas.microsoft.com/office/word/2023/wordml/word16du" xmlns:w16sdtdh="http://schemas.microsoft.com/office/word/2020/wordml/sdtdatahash" xmlns:w16sdtfl="http://schemas.microsoft.com/office/word/2024/wordml/sdtformatlock" xmlns:w16se="http://schemas.microsoft.com/office/word/2015/wordml/symex" xmlns:wpg="http://schemas.microsoft.com/office/word/2010/wordprocessingGroup" xmlns:wpi="http://schemas.microsoft.com/office/word/2010/wordprocessingInk" xmlns:wne="http://schemas.microsoft.com/office/word/2006/wordml" xmlns:wps="http://schemas.microsoft.com/office/word/2010/wordprocessingShape" mc:Ignorable="w14 w15 w16se w16cid w16 w16cex w16sdtdh w16sdtfl w16du wp14">
   <w:body>
     <w:p>
       <w:pPr>
@@ -72,8 +72,18 @@
       <w:r>
         <w:t>Alieu       Jallow      Mat # : 22713015</w:t>
       </w:r>
-      <w:bookmarkStart w:id="0" w:name="_GoBack"/>
-      <w:bookmarkEnd w:id="0"/>
+    </w:p>
+    <w:p>
+      <w:pPr>
+        <w:pStyle w:val="BodyText"/>
+        <w:numPr>
+          <w:ilvl w:val="0"/>
+          <w:numId w:val="1"/>
+        </w:numPr>
+      </w:pPr>
+      <w:r>
+        <w:t>John Syllah  Mat#: 22713043</w:t>
+      </w:r>
     </w:p>
     <w:p>
       <w:pPr>
@@ -92,7 +102,7 @@
 </file>
 
 <file path=word/numbering.xml><?xml version="1.0" encoding="utf-8"?>
-<w:numbering xmlns:wpc="http://schemas.microsoft.com/office/word/2010/wordprocessingCanvas" xmlns:cx="http://schemas.microsoft.com/office/drawing/2014/chartex" xmlns:cx1="http://schemas.microsoft.com/office/drawing/2015/9/8/chartex" xmlns:mc="http://schemas.openxmlformats.org/markup-compatibility/2006" xmlns:o="urn:schemas-microsoft-com:office:office" xmlns:r="http://schemas.openxmlformats.org/officeDocument/2006/relationships" xmlns:m="http://schemas.openxmlformats.org/officeDocument/2006/math" xmlns:v="urn:schemas-microsoft-com:vml" xmlns:wp14="http://schemas.microsoft.com/office/word/2010/wordprocessingDrawing" xmlns:wp="http://schemas.openxmlformats.org/drawingml/2006/wordprocessingDrawing" xmlns:w10="urn:schemas-microsoft-com:office:word" xmlns:w="http://schemas.openxmlformats.org/wordprocessingml/2006/main" xmlns:w14="http://schemas.microsoft.com/office/word/2010/wordml" xmlns:w15="http://schemas.microsoft.com/office/word/2012/wordml" xmlns:w16se="http://schemas.microsoft.com/office/word/2015/wordml/symex" xmlns:wpg="http://schemas.microsoft.com/office/word/2010/wordprocessingGroup" xmlns:wpi="http://schemas.microsoft.com/office/word/2010/wordprocessingInk" xmlns:wne="http://schemas.microsoft.com/office/word/2006/wordml" xmlns:wps="http://schemas.microsoft.com/office/word/2010/wordprocessingShape" mc:Ignorable="w14 w15 w16se wp14">
+<w:numbering xmlns:wpc="http://schemas.microsoft.com/office/word/2010/wordprocessingCanvas" xmlns:cx="http://schemas.microsoft.com/office/drawing/2014/chartex" xmlns:cx1="http://schemas.microsoft.com/office/drawing/2015/9/8/chartex" xmlns:cx2="http://schemas.microsoft.com/office/drawing/2015/10/21/chartex" xmlns:cx3="http://schemas.microsoft.com/office/drawing/2016/5/9/chartex" xmlns:cx4="http://schemas.microsoft.com/office/drawing/2016/5/10/chartex" xmlns:cx5="http://schemas.microsoft.com/office/drawing/2016/5/11/chartex" xmlns:cx6="http://schemas.microsoft.com/office/drawing/2016/5/12/chartex" xmlns:cx7="http://schemas.microsoft.com/office/drawing/2016/5/13/chartex" xmlns:cx8="http://schemas.microsoft.com/office/drawing/2016/5/14/chartex" xmlns:mc="http://schemas.openxmlformats.org/markup-compatibility/2006" xmlns:aink="http://schemas.microsoft.com/office/drawing/2016/ink" xmlns:am3d="http://schemas.microsoft.com/office/drawing/2017/model3d" xmlns:o="urn:schemas-microsoft-com:office:office" xmlns:oel="http://schemas.microsoft.com/office/2019/extlst" xmlns:r="http://schemas.openxmlformats.org/officeDocument/2006/relationships" xmlns:m="http://schemas.openxmlformats.org/officeDocument/2006/math" xmlns:v="urn:schemas-microsoft-com:vml" xmlns:wp14="http://schemas.microsoft.com/office/word/2010/wordprocessingDrawing" xmlns:wp="http://schemas.openxmlformats.org/drawingml/2006/wordprocessingDrawing" xmlns:w10="urn:schemas-microsoft-com:office:word" xmlns:w="http://schemas.openxmlformats.org/wordprocessingml/2006/main" xmlns:w14="http://schemas.microsoft.com/office/word/2010/wordml" xmlns:w15="http://schemas.microsoft.com/office/word/2012/wordml" xmlns:w16cex="http://schemas.microsoft.com/office/word/2018/wordml/cex" xmlns:w16cid="http://schemas.microsoft.com/office/word/2016/wordml/cid" xmlns:w16="http://schemas.microsoft.com/office/word/2018/wordml" xmlns:w16du="http://schemas.microsoft.com/office/word/2023/wordml/word16du" xmlns:w16sdtdh="http://schemas.microsoft.com/office/word/2020/wordml/sdtdatahash" xmlns:w16sdtfl="http://schemas.microsoft.com/office/word/2024/wordml/sdtformatlock" xmlns:w16se="http://schemas.microsoft.com/office/word/2015/wordml/symex" xmlns:wpg="http://schemas.microsoft.com/office/word/2010/wordprocessingGroup" xmlns:wpi="http://schemas.microsoft.com/office/word/2010/wordprocessingInk" xmlns:wne="http://schemas.microsoft.com/office/word/2006/wordml" xmlns:wps="http://schemas.microsoft.com/office/word/2010/wordprocessingShape" mc:Ignorable="w14 w15 w16se w16cid w16 w16cex w16sdtdh w16sdtfl w16du wp14">
   <w:abstractNum w:abstractNumId="0" w15:restartNumberingAfterBreak="0">
     <w:nsid w:val="71C97DA2"/>
     <w:multiLevelType w:val="hybridMultilevel"/>
@@ -183,14 +193,14 @@
       </w:pPr>
     </w:lvl>
   </w:abstractNum>
-  <w:num w:numId="1">
+  <w:num w:numId="1" w16cid:durableId="1738211924">
     <w:abstractNumId w:val="0"/>
   </w:num>
 </w:numbering>
 </file>
 
 <file path=word/styles.xml><?xml version="1.0" encoding="utf-8"?>
-<w:styles xmlns:mc="http://schemas.openxmlformats.org/markup-compatibility/2006" xmlns:r="http://schemas.openxmlformats.org/officeDocument/2006/relationships" xmlns:w="http://schemas.openxmlformats.org/wordprocessingml/2006/main" xmlns:w14="http://schemas.microsoft.com/office/word/2010/wordml" xmlns:w15="http://schemas.microsoft.com/office/word/2012/wordml" xmlns:w16se="http://schemas.microsoft.com/office/word/2015/wordml/symex" mc:Ignorable="w14 w15 w16se">
+<w:styles xmlns:mc="http://schemas.openxmlformats.org/markup-compatibility/2006" xmlns:r="http://schemas.openxmlformats.org/officeDocument/2006/relationships" xmlns:w="http://schemas.openxmlformats.org/wordprocessingml/2006/main" xmlns:w14="http://schemas.microsoft.com/office/word/2010/wordml" xmlns:w15="http://schemas.microsoft.com/office/word/2012/wordml" xmlns:w16cex="http://schemas.microsoft.com/office/word/2018/wordml/cex" xmlns:w16cid="http://schemas.microsoft.com/office/word/2016/wordml/cid" xmlns:w16="http://schemas.microsoft.com/office/word/2018/wordml" xmlns:w16du="http://schemas.microsoft.com/office/word/2023/wordml/word16du" xmlns:w16sdtdh="http://schemas.microsoft.com/office/word/2020/wordml/sdtdatahash" xmlns:w16sdtfl="http://schemas.microsoft.com/office/word/2024/wordml/sdtformatlock" xmlns:w16se="http://schemas.microsoft.com/office/word/2015/wordml/symex" mc:Ignorable="w14 w15 w16se w16cid w16 w16cex w16sdtdh w16sdtfl w16du">
   <w:docDefaults>
     <w:rPrDefault>
       <w:rPr>
@@ -207,7 +217,7 @@
       </w:pPr>
     </w:pPrDefault>
   </w:docDefaults>
-  <w:latentStyles w:defLockedState="0" w:defUIPriority="99" w:defSemiHidden="0" w:defUnhideWhenUsed="0" w:defQFormat="0" w:count="371">
+  <w:latentStyles w:defLockedState="0" w:defUIPriority="99" w:defSemiHidden="0" w:defUnhideWhenUsed="0" w:defQFormat="0" w:count="376">
     <w:lsdException w:name="Normal" w:uiPriority="0" w:qFormat="1"/>
     <w:lsdException w:name="heading 1" w:uiPriority="9" w:qFormat="1"/>
     <w:lsdException w:name="heading 2" w:semiHidden="1" w:uiPriority="9" w:unhideWhenUsed="1" w:qFormat="1"/>
@@ -579,6 +589,11 @@
     <w:lsdException w:name="List Table 5 Dark Accent 6" w:uiPriority="50"/>
     <w:lsdException w:name="List Table 6 Colorful Accent 6" w:uiPriority="51"/>
     <w:lsdException w:name="List Table 7 Colorful Accent 6" w:uiPriority="52"/>
+    <w:lsdException w:name="Mention" w:semiHidden="1" w:unhideWhenUsed="1"/>
+    <w:lsdException w:name="Smart Hyperlink" w:semiHidden="1" w:unhideWhenUsed="1"/>
+    <w:lsdException w:name="Hashtag" w:semiHidden="1" w:unhideWhenUsed="1"/>
+    <w:lsdException w:name="Unresolved Mention" w:semiHidden="1" w:unhideWhenUsed="1"/>
+    <w:lsdException w:name="Smart Link" w:semiHidden="1" w:unhideWhenUsed="1"/>
   </w:latentStyles>
   <w:style w:type="paragraph" w:default="1" w:styleId="Normal">
     <w:name w:val="Normal"/>

</xml_diff>

<commit_message>
Add my names to student list
</commit_message>
<xml_diff>
--- a/Admin/students_names.docx
+++ b/Admin/students_names.docx
@@ -1,6 +1,6 @@
 
 <file path=word/document.xml><?xml version="1.0" encoding="utf-8"?>
-<w:document xmlns:wpc="http://schemas.microsoft.com/office/word/2010/wordprocessingCanvas" xmlns:mc="http://schemas.openxmlformats.org/markup-compatibility/2006" xmlns:o="urn:schemas-microsoft-com:office:office" xmlns:r="http://schemas.openxmlformats.org/officeDocument/2006/relationships" xmlns:m="http://schemas.openxmlformats.org/officeDocument/2006/math" xmlns:v="urn:schemas-microsoft-com:vml" xmlns:wp14="http://schemas.microsoft.com/office/word/2010/wordprocessingDrawing" xmlns:wp="http://schemas.openxmlformats.org/drawingml/2006/wordprocessingDrawing" xmlns:w10="urn:schemas-microsoft-com:office:word" xmlns:w="http://schemas.openxmlformats.org/wordprocessingml/2006/main" xmlns:w14="http://schemas.microsoft.com/office/word/2010/wordml" xmlns:w15="http://schemas.microsoft.com/office/word/2012/wordml" xmlns:wpg="http://schemas.microsoft.com/office/word/2010/wordprocessingGroup" xmlns:wpi="http://schemas.microsoft.com/office/word/2010/wordprocessingInk" xmlns:wne="http://schemas.microsoft.com/office/word/2006/wordml" xmlns:wps="http://schemas.microsoft.com/office/word/2010/wordprocessingShape" mc:Ignorable="w14 w15 wp14">
+<w:document xmlns:wpc="http://schemas.microsoft.com/office/word/2010/wordprocessingCanvas" xmlns:cx="http://schemas.microsoft.com/office/drawing/2014/chartex" xmlns:cx1="http://schemas.microsoft.com/office/drawing/2015/9/8/chartex" xmlns:cx2="http://schemas.microsoft.com/office/drawing/2015/10/21/chartex" xmlns:cx3="http://schemas.microsoft.com/office/drawing/2016/5/9/chartex" xmlns:cx4="http://schemas.microsoft.com/office/drawing/2016/5/10/chartex" xmlns:cx5="http://schemas.microsoft.com/office/drawing/2016/5/11/chartex" xmlns:cx6="http://schemas.microsoft.com/office/drawing/2016/5/12/chartex" xmlns:cx7="http://schemas.microsoft.com/office/drawing/2016/5/13/chartex" xmlns:cx8="http://schemas.microsoft.com/office/drawing/2016/5/14/chartex" xmlns:mc="http://schemas.openxmlformats.org/markup-compatibility/2006" xmlns:aink="http://schemas.microsoft.com/office/drawing/2016/ink" xmlns:am3d="http://schemas.microsoft.com/office/drawing/2017/model3d" xmlns:o="urn:schemas-microsoft-com:office:office" xmlns:oel="http://schemas.microsoft.com/office/2019/extlst" xmlns:r="http://schemas.openxmlformats.org/officeDocument/2006/relationships" xmlns:m="http://schemas.openxmlformats.org/officeDocument/2006/math" xmlns:v="urn:schemas-microsoft-com:vml" xmlns:wp14="http://schemas.microsoft.com/office/word/2010/wordprocessingDrawing" xmlns:wp="http://schemas.openxmlformats.org/drawingml/2006/wordprocessingDrawing" xmlns:w10="urn:schemas-microsoft-com:office:word" xmlns:w="http://schemas.openxmlformats.org/wordprocessingml/2006/main" xmlns:w14="http://schemas.microsoft.com/office/word/2010/wordml" xmlns:w15="http://schemas.microsoft.com/office/word/2012/wordml" xmlns:w16cex="http://schemas.microsoft.com/office/word/2018/wordml/cex" xmlns:w16cid="http://schemas.microsoft.com/office/word/2016/wordml/cid" xmlns:w16="http://schemas.microsoft.com/office/word/2018/wordml" xmlns:w16du="http://schemas.microsoft.com/office/word/2023/wordml/word16du" xmlns:w16sdtdh="http://schemas.microsoft.com/office/word/2020/wordml/sdtdatahash" xmlns:w16sdtfl="http://schemas.microsoft.com/office/word/2024/wordml/sdtformatlock" xmlns:w16se="http://schemas.microsoft.com/office/word/2015/wordml/symex" xmlns:wpg="http://schemas.microsoft.com/office/word/2010/wordprocessingGroup" xmlns:wpi="http://schemas.microsoft.com/office/word/2010/wordprocessingInk" xmlns:wne="http://schemas.microsoft.com/office/word/2006/wordml" xmlns:wps="http://schemas.microsoft.com/office/word/2010/wordprocessingShape" mc:Ignorable="w14 w15 w16se w16cid w16 w16cex w16sdtdh w16sdtfl w16du wp14">
   <w:body>
     <w:p>
       <w:pPr>
@@ -19,21 +19,12 @@
         </w:numPr>
         <w:jc w:val="left"/>
       </w:pPr>
-      <w:proofErr w:type="spellStart"/>
       <w:r>
         <w:rPr>
           <w:sz w:val="24"/>
           <w:szCs w:val="24"/>
         </w:rPr>
-        <w:t>Banno</w:t>
-      </w:r>
-      <w:proofErr w:type="spellEnd"/>
-      <w:r>
-        <w:rPr>
-          <w:sz w:val="24"/>
-          <w:szCs w:val="24"/>
-        </w:rPr>
-        <w:t xml:space="preserve"> Bah      matt: 22713033</w:t>
+        <w:t>Banno Bah      matt: 22713033</w:t>
       </w:r>
       <w:r>
         <w:t xml:space="preserve"> </w:t>
@@ -50,8 +41,18 @@
       <w:r>
         <w:t>Saikou T. Ceesay Mat#: 22713020</w:t>
       </w:r>
-      <w:bookmarkStart w:id="0" w:name="_GoBack"/>
-      <w:bookmarkEnd w:id="0"/>
+    </w:p>
+    <w:p>
+      <w:pPr>
+        <w:pStyle w:val="BodyText"/>
+        <w:numPr>
+          <w:ilvl w:val="0"/>
+          <w:numId w:val="1"/>
+        </w:numPr>
+      </w:pPr>
+      <w:r>
+        <w:t>Abdoulie Ndong Mat#: 22713039</w:t>
+      </w:r>
     </w:p>
     <w:p>
       <w:pPr>
@@ -70,8 +71,8 @@
 </file>
 
 <file path=word/numbering.xml><?xml version="1.0" encoding="utf-8"?>
-<w:numbering xmlns:wpc="http://schemas.microsoft.com/office/word/2010/wordprocessingCanvas" xmlns:mc="http://schemas.openxmlformats.org/markup-compatibility/2006" xmlns:o="urn:schemas-microsoft-com:office:office" xmlns:r="http://schemas.openxmlformats.org/officeDocument/2006/relationships" xmlns:m="http://schemas.openxmlformats.org/officeDocument/2006/math" xmlns:v="urn:schemas-microsoft-com:vml" xmlns:wp14="http://schemas.microsoft.com/office/word/2010/wordprocessingDrawing" xmlns:wp="http://schemas.openxmlformats.org/drawingml/2006/wordprocessingDrawing" xmlns:w10="urn:schemas-microsoft-com:office:word" xmlns:w="http://schemas.openxmlformats.org/wordprocessingml/2006/main" xmlns:w14="http://schemas.microsoft.com/office/word/2010/wordml" xmlns:w15="http://schemas.microsoft.com/office/word/2012/wordml" xmlns:wpg="http://schemas.microsoft.com/office/word/2010/wordprocessingGroup" xmlns:wpi="http://schemas.microsoft.com/office/word/2010/wordprocessingInk" xmlns:wne="http://schemas.microsoft.com/office/word/2006/wordml" xmlns:wps="http://schemas.microsoft.com/office/word/2010/wordprocessingShape" mc:Ignorable="w14 w15 wp14">
-  <w:abstractNum w:abstractNumId="0">
+<w:numbering xmlns:wpc="http://schemas.microsoft.com/office/word/2010/wordprocessingCanvas" xmlns:cx="http://schemas.microsoft.com/office/drawing/2014/chartex" xmlns:cx1="http://schemas.microsoft.com/office/drawing/2015/9/8/chartex" xmlns:cx2="http://schemas.microsoft.com/office/drawing/2015/10/21/chartex" xmlns:cx3="http://schemas.microsoft.com/office/drawing/2016/5/9/chartex" xmlns:cx4="http://schemas.microsoft.com/office/drawing/2016/5/10/chartex" xmlns:cx5="http://schemas.microsoft.com/office/drawing/2016/5/11/chartex" xmlns:cx6="http://schemas.microsoft.com/office/drawing/2016/5/12/chartex" xmlns:cx7="http://schemas.microsoft.com/office/drawing/2016/5/13/chartex" xmlns:cx8="http://schemas.microsoft.com/office/drawing/2016/5/14/chartex" xmlns:mc="http://schemas.openxmlformats.org/markup-compatibility/2006" xmlns:aink="http://schemas.microsoft.com/office/drawing/2016/ink" xmlns:am3d="http://schemas.microsoft.com/office/drawing/2017/model3d" xmlns:o="urn:schemas-microsoft-com:office:office" xmlns:oel="http://schemas.microsoft.com/office/2019/extlst" xmlns:r="http://schemas.openxmlformats.org/officeDocument/2006/relationships" xmlns:m="http://schemas.openxmlformats.org/officeDocument/2006/math" xmlns:v="urn:schemas-microsoft-com:vml" xmlns:wp14="http://schemas.microsoft.com/office/word/2010/wordprocessingDrawing" xmlns:wp="http://schemas.openxmlformats.org/drawingml/2006/wordprocessingDrawing" xmlns:w10="urn:schemas-microsoft-com:office:word" xmlns:w="http://schemas.openxmlformats.org/wordprocessingml/2006/main" xmlns:w14="http://schemas.microsoft.com/office/word/2010/wordml" xmlns:w15="http://schemas.microsoft.com/office/word/2012/wordml" xmlns:w16cex="http://schemas.microsoft.com/office/word/2018/wordml/cex" xmlns:w16cid="http://schemas.microsoft.com/office/word/2016/wordml/cid" xmlns:w16="http://schemas.microsoft.com/office/word/2018/wordml" xmlns:w16du="http://schemas.microsoft.com/office/word/2023/wordml/word16du" xmlns:w16sdtdh="http://schemas.microsoft.com/office/word/2020/wordml/sdtdatahash" xmlns:w16sdtfl="http://schemas.microsoft.com/office/word/2024/wordml/sdtformatlock" xmlns:w16se="http://schemas.microsoft.com/office/word/2015/wordml/symex" xmlns:wpg="http://schemas.microsoft.com/office/word/2010/wordprocessingGroup" xmlns:wpi="http://schemas.microsoft.com/office/word/2010/wordprocessingInk" xmlns:wne="http://schemas.microsoft.com/office/word/2006/wordml" xmlns:wps="http://schemas.microsoft.com/office/word/2010/wordprocessingShape" mc:Ignorable="w14 w15 w16se w16cid w16 w16cex w16sdtdh w16sdtfl w16du wp14">
+  <w:abstractNum w:abstractNumId="0" w15:restartNumberingAfterBreak="0">
     <w:nsid w:val="71C97DA2"/>
     <w:multiLevelType w:val="hybridMultilevel"/>
     <w:tmpl w:val="23C0DBB0"/>
@@ -161,14 +162,14 @@
       </w:pPr>
     </w:lvl>
   </w:abstractNum>
-  <w:num w:numId="1">
+  <w:num w:numId="1" w16cid:durableId="1261371922">
     <w:abstractNumId w:val="0"/>
   </w:num>
 </w:numbering>
 </file>
 
 <file path=word/styles.xml><?xml version="1.0" encoding="utf-8"?>
-<w:styles xmlns:mc="http://schemas.openxmlformats.org/markup-compatibility/2006" xmlns:r="http://schemas.openxmlformats.org/officeDocument/2006/relationships" xmlns:w="http://schemas.openxmlformats.org/wordprocessingml/2006/main" xmlns:w14="http://schemas.microsoft.com/office/word/2010/wordml" xmlns:w15="http://schemas.microsoft.com/office/word/2012/wordml" mc:Ignorable="w14 w15">
+<w:styles xmlns:mc="http://schemas.openxmlformats.org/markup-compatibility/2006" xmlns:r="http://schemas.openxmlformats.org/officeDocument/2006/relationships" xmlns:w="http://schemas.openxmlformats.org/wordprocessingml/2006/main" xmlns:w14="http://schemas.microsoft.com/office/word/2010/wordml" xmlns:w15="http://schemas.microsoft.com/office/word/2012/wordml" xmlns:w16cex="http://schemas.microsoft.com/office/word/2018/wordml/cex" xmlns:w16cid="http://schemas.microsoft.com/office/word/2016/wordml/cid" xmlns:w16="http://schemas.microsoft.com/office/word/2018/wordml" xmlns:w16du="http://schemas.microsoft.com/office/word/2023/wordml/word16du" xmlns:w16sdtdh="http://schemas.microsoft.com/office/word/2020/wordml/sdtdatahash" xmlns:w16sdtfl="http://schemas.microsoft.com/office/word/2024/wordml/sdtformatlock" xmlns:w16se="http://schemas.microsoft.com/office/word/2015/wordml/symex" mc:Ignorable="w14 w15 w16se w16cid w16 w16cex w16sdtdh w16sdtfl w16du">
   <w:docDefaults>
     <w:rPrDefault>
       <w:rPr>
@@ -185,7 +186,7 @@
       </w:pPr>
     </w:pPrDefault>
   </w:docDefaults>
-  <w:latentStyles w:defLockedState="0" w:defUIPriority="99" w:defSemiHidden="0" w:defUnhideWhenUsed="0" w:defQFormat="0" w:count="371">
+  <w:latentStyles w:defLockedState="0" w:defUIPriority="99" w:defSemiHidden="0" w:defUnhideWhenUsed="0" w:defQFormat="0" w:count="376">
     <w:lsdException w:name="Normal" w:uiPriority="0" w:qFormat="1"/>
     <w:lsdException w:name="heading 1" w:uiPriority="9" w:qFormat="1"/>
     <w:lsdException w:name="heading 2" w:semiHidden="1" w:uiPriority="9" w:unhideWhenUsed="1" w:qFormat="1"/>
@@ -557,6 +558,11 @@
     <w:lsdException w:name="List Table 5 Dark Accent 6" w:uiPriority="50"/>
     <w:lsdException w:name="List Table 6 Colorful Accent 6" w:uiPriority="51"/>
     <w:lsdException w:name="List Table 7 Colorful Accent 6" w:uiPriority="52"/>
+    <w:lsdException w:name="Mention" w:semiHidden="1" w:unhideWhenUsed="1"/>
+    <w:lsdException w:name="Smart Hyperlink" w:semiHidden="1" w:unhideWhenUsed="1"/>
+    <w:lsdException w:name="Hashtag" w:semiHidden="1" w:unhideWhenUsed="1"/>
+    <w:lsdException w:name="Unresolved Mention" w:semiHidden="1" w:unhideWhenUsed="1"/>
+    <w:lsdException w:name="Smart Link" w:semiHidden="1" w:unhideWhenUsed="1"/>
   </w:latentStyles>
   <w:style w:type="paragraph" w:default="1" w:styleId="Normal">
     <w:name w:val="Normal"/>

</xml_diff>

<commit_message>
I ahve added my name to list
</commit_message>
<xml_diff>
--- a/Admin/students_names.docx
+++ b/Admin/students_names.docx
@@ -1,6 +1,6 @@
 
 <file path=word/document.xml><?xml version="1.0" encoding="utf-8"?>
-<w:document xmlns:wpc="http://schemas.microsoft.com/office/word/2010/wordprocessingCanvas" xmlns:cx="http://schemas.microsoft.com/office/drawing/2014/chartex" xmlns:cx1="http://schemas.microsoft.com/office/drawing/2015/9/8/chartex" xmlns:cx2="http://schemas.microsoft.com/office/drawing/2015/10/21/chartex" xmlns:cx3="http://schemas.microsoft.com/office/drawing/2016/5/9/chartex" xmlns:cx4="http://schemas.microsoft.com/office/drawing/2016/5/10/chartex" xmlns:cx5="http://schemas.microsoft.com/office/drawing/2016/5/11/chartex" xmlns:cx6="http://schemas.microsoft.com/office/drawing/2016/5/12/chartex" xmlns:cx7="http://schemas.microsoft.com/office/drawing/2016/5/13/chartex" xmlns:cx8="http://schemas.microsoft.com/office/drawing/2016/5/14/chartex" xmlns:mc="http://schemas.openxmlformats.org/markup-compatibility/2006" xmlns:aink="http://schemas.microsoft.com/office/drawing/2016/ink" xmlns:am3d="http://schemas.microsoft.com/office/drawing/2017/model3d" xmlns:o="urn:schemas-microsoft-com:office:office" xmlns:oel="http://schemas.microsoft.com/office/2019/extlst" xmlns:r="http://schemas.openxmlformats.org/officeDocument/2006/relationships" xmlns:m="http://schemas.openxmlformats.org/officeDocument/2006/math" xmlns:v="urn:schemas-microsoft-com:vml" xmlns:wp14="http://schemas.microsoft.com/office/word/2010/wordprocessingDrawing" xmlns:wp="http://schemas.openxmlformats.org/drawingml/2006/wordprocessingDrawing" xmlns:w10="urn:schemas-microsoft-com:office:word" xmlns:w="http://schemas.openxmlformats.org/wordprocessingml/2006/main" xmlns:w14="http://schemas.microsoft.com/office/word/2010/wordml" xmlns:w15="http://schemas.microsoft.com/office/word/2012/wordml" xmlns:w16cex="http://schemas.microsoft.com/office/word/2018/wordml/cex" xmlns:w16cid="http://schemas.microsoft.com/office/word/2016/wordml/cid" xmlns:w16="http://schemas.microsoft.com/office/word/2018/wordml" xmlns:w16du="http://schemas.microsoft.com/office/word/2023/wordml/word16du" xmlns:w16sdtdh="http://schemas.microsoft.com/office/word/2020/wordml/sdtdatahash" xmlns:w16sdtfl="http://schemas.microsoft.com/office/word/2024/wordml/sdtformatlock" xmlns:w16se="http://schemas.microsoft.com/office/word/2015/wordml/symex" xmlns:wpg="http://schemas.microsoft.com/office/word/2010/wordprocessingGroup" xmlns:wpi="http://schemas.microsoft.com/office/word/2010/wordprocessingInk" xmlns:wne="http://schemas.microsoft.com/office/word/2006/wordml" xmlns:wps="http://schemas.microsoft.com/office/word/2010/wordprocessingShape" mc:Ignorable="w14 w15 w16se w16cid w16 w16cex w16sdtdh w16sdtfl w16du wp14">
+<w:document xmlns:wpc="http://schemas.microsoft.com/office/word/2010/wordprocessingCanvas" xmlns:mc="http://schemas.openxmlformats.org/markup-compatibility/2006" xmlns:o="urn:schemas-microsoft-com:office:office" xmlns:r="http://schemas.openxmlformats.org/officeDocument/2006/relationships" xmlns:m="http://schemas.openxmlformats.org/officeDocument/2006/math" xmlns:v="urn:schemas-microsoft-com:vml" xmlns:wp14="http://schemas.microsoft.com/office/word/2010/wordprocessingDrawing" xmlns:wp="http://schemas.openxmlformats.org/drawingml/2006/wordprocessingDrawing" xmlns:w10="urn:schemas-microsoft-com:office:word" xmlns:w="http://schemas.openxmlformats.org/wordprocessingml/2006/main" xmlns:w14="http://schemas.microsoft.com/office/word/2010/wordml" xmlns:w15="http://schemas.microsoft.com/office/word/2012/wordml" xmlns:wpg="http://schemas.microsoft.com/office/word/2010/wordprocessingGroup" xmlns:wpi="http://schemas.microsoft.com/office/word/2010/wordprocessingInk" xmlns:wne="http://schemas.microsoft.com/office/word/2006/wordml" xmlns:wps="http://schemas.microsoft.com/office/word/2010/wordprocessingShape" mc:Ignorable="w14 w15 wp14">
   <w:body>
     <w:p>
       <w:pPr>
@@ -19,12 +19,21 @@
         </w:numPr>
         <w:jc w:val="left"/>
       </w:pPr>
+      <w:proofErr w:type="spellStart"/>
       <w:r>
         <w:rPr>
           <w:sz w:val="24"/>
           <w:szCs w:val="24"/>
         </w:rPr>
-        <w:t>Banno Bah      matt: 22713033</w:t>
+        <w:t>Banno</w:t>
+      </w:r>
+      <w:proofErr w:type="spellEnd"/>
+      <w:r>
+        <w:rPr>
+          <w:sz w:val="24"/>
+          <w:szCs w:val="24"/>
+        </w:rPr>
+        <w:t xml:space="preserve"> Bah      matt: 22713033</w:t>
       </w:r>
       <w:r>
         <w:t xml:space="preserve"> </w:t>
@@ -42,12 +51,21 @@
           <w:bCs/>
         </w:rPr>
       </w:pPr>
-      <w:r>
-        <w:rPr>
-          <w:b/>
-          <w:bCs/>
-        </w:rPr>
-        <w:t>Saikou T. Ceesay Mat#: 22713020</w:t>
+      <w:proofErr w:type="spellStart"/>
+      <w:r>
+        <w:rPr>
+          <w:b/>
+          <w:bCs/>
+        </w:rPr>
+        <w:t>Saikou</w:t>
+      </w:r>
+      <w:proofErr w:type="spellEnd"/>
+      <w:r>
+        <w:rPr>
+          <w:b/>
+          <w:bCs/>
+        </w:rPr>
+        <w:t xml:space="preserve"> T. Ceesay Mat#: 22713020</w:t>
       </w:r>
     </w:p>
     <w:p>
@@ -62,13 +80,85 @@
           <w:bCs/>
         </w:rPr>
       </w:pPr>
-      <w:r>
-        <w:rPr>
-          <w:b/>
-          <w:bCs/>
-        </w:rPr>
-        <w:t>Abdoulie Ndong Mat#: 22713039</w:t>
-      </w:r>
+      <w:proofErr w:type="spellStart"/>
+      <w:r>
+        <w:rPr>
+          <w:b/>
+          <w:bCs/>
+        </w:rPr>
+        <w:t>Abdoulie</w:t>
+      </w:r>
+      <w:proofErr w:type="spellEnd"/>
+      <w:r>
+        <w:rPr>
+          <w:b/>
+          <w:bCs/>
+        </w:rPr>
+        <w:t xml:space="preserve"> </w:t>
+      </w:r>
+      <w:proofErr w:type="spellStart"/>
+      <w:r>
+        <w:rPr>
+          <w:b/>
+          <w:bCs/>
+        </w:rPr>
+        <w:t>Ndong</w:t>
+      </w:r>
+      <w:proofErr w:type="spellEnd"/>
+      <w:r>
+        <w:rPr>
+          <w:b/>
+          <w:bCs/>
+        </w:rPr>
+        <w:t xml:space="preserve"> Mat#: 22713039</w:t>
+      </w:r>
+    </w:p>
+    <w:p>
+      <w:pPr>
+        <w:pStyle w:val="BodyText"/>
+        <w:numPr>
+          <w:ilvl w:val="0"/>
+          <w:numId w:val="1"/>
+        </w:numPr>
+        <w:rPr>
+          <w:b/>
+          <w:bCs/>
+        </w:rPr>
+      </w:pPr>
+      <w:proofErr w:type="spellStart"/>
+      <w:r>
+        <w:rPr>
+          <w:b/>
+          <w:bCs/>
+        </w:rPr>
+        <w:t>Abou</w:t>
+      </w:r>
+      <w:proofErr w:type="spellEnd"/>
+      <w:r>
+        <w:rPr>
+          <w:b/>
+          <w:bCs/>
+        </w:rPr>
+        <w:t xml:space="preserve"> B </w:t>
+      </w:r>
+      <w:proofErr w:type="spellStart"/>
+      <w:r>
+        <w:rPr>
+          <w:b/>
+          <w:bCs/>
+        </w:rPr>
+        <w:t>Nyangado</w:t>
+      </w:r>
+      <w:proofErr w:type="spellEnd"/>
+      <w:r>
+        <w:rPr>
+          <w:b/>
+          <w:bCs/>
+        </w:rPr>
+        <w:t xml:space="preserve"> Mat#: 22713047</w:t>
+      </w:r>
+      <w:bookmarkStart w:id="0" w:name="_GoBack"/>
+      <w:bookmarkEnd w:id="0"/>
     </w:p>
     <w:p>
       <w:pPr>
@@ -100,7 +190,7 @@
 </file>
 
 <file path=word/numbering.xml><?xml version="1.0" encoding="utf-8"?>
-<w:numbering xmlns:wpc="http://schemas.microsoft.com/office/word/2010/wordprocessingCanvas" xmlns:cx="http://schemas.microsoft.com/office/drawing/2014/chartex" xmlns:cx1="http://schemas.microsoft.com/office/drawing/2015/9/8/chartex" xmlns:cx2="http://schemas.microsoft.com/office/drawing/2015/10/21/chartex" xmlns:cx3="http://schemas.microsoft.com/office/drawing/2016/5/9/chartex" xmlns:cx4="http://schemas.microsoft.com/office/drawing/2016/5/10/chartex" xmlns:cx5="http://schemas.microsoft.com/office/drawing/2016/5/11/chartex" xmlns:cx6="http://schemas.microsoft.com/office/drawing/2016/5/12/chartex" xmlns:cx7="http://schemas.microsoft.com/office/drawing/2016/5/13/chartex" xmlns:cx8="http://schemas.microsoft.com/office/drawing/2016/5/14/chartex" xmlns:mc="http://schemas.openxmlformats.org/markup-compatibility/2006" xmlns:aink="http://schemas.microsoft.com/office/drawing/2016/ink" xmlns:am3d="http://schemas.microsoft.com/office/drawing/2017/model3d" xmlns:o="urn:schemas-microsoft-com:office:office" xmlns:oel="http://schemas.microsoft.com/office/2019/extlst" xmlns:r="http://schemas.openxmlformats.org/officeDocument/2006/relationships" xmlns:m="http://schemas.openxmlformats.org/officeDocument/2006/math" xmlns:v="urn:schemas-microsoft-com:vml" xmlns:wp14="http://schemas.microsoft.com/office/word/2010/wordprocessingDrawing" xmlns:wp="http://schemas.openxmlformats.org/drawingml/2006/wordprocessingDrawing" xmlns:w10="urn:schemas-microsoft-com:office:word" xmlns:w="http://schemas.openxmlformats.org/wordprocessingml/2006/main" xmlns:w14="http://schemas.microsoft.com/office/word/2010/wordml" xmlns:w15="http://schemas.microsoft.com/office/word/2012/wordml" xmlns:w16cex="http://schemas.microsoft.com/office/word/2018/wordml/cex" xmlns:w16cid="http://schemas.microsoft.com/office/word/2016/wordml/cid" xmlns:w16="http://schemas.microsoft.com/office/word/2018/wordml" xmlns:w16du="http://schemas.microsoft.com/office/word/2023/wordml/word16du" xmlns:w16sdtdh="http://schemas.microsoft.com/office/word/2020/wordml/sdtdatahash" xmlns:w16sdtfl="http://schemas.microsoft.com/office/word/2024/wordml/sdtformatlock" xmlns:w16se="http://schemas.microsoft.com/office/word/2015/wordml/symex" xmlns:wpg="http://schemas.microsoft.com/office/word/2010/wordprocessingGroup" xmlns:wpi="http://schemas.microsoft.com/office/word/2010/wordprocessingInk" xmlns:wne="http://schemas.microsoft.com/office/word/2006/wordml" xmlns:wps="http://schemas.microsoft.com/office/word/2010/wordprocessingShape" mc:Ignorable="w14 w15 w16se w16cid w16 w16cex w16sdtdh w16sdtfl w16du wp14">
+<w:numbering xmlns:wpc="http://schemas.microsoft.com/office/word/2010/wordprocessingCanvas" xmlns:mc="http://schemas.openxmlformats.org/markup-compatibility/2006" xmlns:o="urn:schemas-microsoft-com:office:office" xmlns:r="http://schemas.openxmlformats.org/officeDocument/2006/relationships" xmlns:m="http://schemas.openxmlformats.org/officeDocument/2006/math" xmlns:v="urn:schemas-microsoft-com:vml" xmlns:wp14="http://schemas.microsoft.com/office/word/2010/wordprocessingDrawing" xmlns:wp="http://schemas.openxmlformats.org/drawingml/2006/wordprocessingDrawing" xmlns:w10="urn:schemas-microsoft-com:office:word" xmlns:w="http://schemas.openxmlformats.org/wordprocessingml/2006/main" xmlns:w14="http://schemas.microsoft.com/office/word/2010/wordml" xmlns:w15="http://schemas.microsoft.com/office/word/2012/wordml" xmlns:wpg="http://schemas.microsoft.com/office/word/2010/wordprocessingGroup" xmlns:wpi="http://schemas.microsoft.com/office/word/2010/wordprocessingInk" xmlns:wne="http://schemas.microsoft.com/office/word/2006/wordml" xmlns:wps="http://schemas.microsoft.com/office/word/2010/wordprocessingShape" mc:Ignorable="w14 w15 wp14">
   <w:abstractNum w:abstractNumId="0" w15:restartNumberingAfterBreak="0">
     <w:nsid w:val="71C97DA2"/>
     <w:multiLevelType w:val="hybridMultilevel"/>
@@ -191,14 +281,14 @@
       </w:pPr>
     </w:lvl>
   </w:abstractNum>
-  <w:num w:numId="1" w16cid:durableId="1261371922">
+  <w:num w:numId="1">
     <w:abstractNumId w:val="0"/>
   </w:num>
 </w:numbering>
 </file>
 
 <file path=word/styles.xml><?xml version="1.0" encoding="utf-8"?>
-<w:styles xmlns:mc="http://schemas.openxmlformats.org/markup-compatibility/2006" xmlns:r="http://schemas.openxmlformats.org/officeDocument/2006/relationships" xmlns:w="http://schemas.openxmlformats.org/wordprocessingml/2006/main" xmlns:w14="http://schemas.microsoft.com/office/word/2010/wordml" xmlns:w15="http://schemas.microsoft.com/office/word/2012/wordml" xmlns:w16cex="http://schemas.microsoft.com/office/word/2018/wordml/cex" xmlns:w16cid="http://schemas.microsoft.com/office/word/2016/wordml/cid" xmlns:w16="http://schemas.microsoft.com/office/word/2018/wordml" xmlns:w16du="http://schemas.microsoft.com/office/word/2023/wordml/word16du" xmlns:w16sdtdh="http://schemas.microsoft.com/office/word/2020/wordml/sdtdatahash" xmlns:w16sdtfl="http://schemas.microsoft.com/office/word/2024/wordml/sdtformatlock" xmlns:w16se="http://schemas.microsoft.com/office/word/2015/wordml/symex" mc:Ignorable="w14 w15 w16se w16cid w16 w16cex w16sdtdh w16sdtfl w16du">
+<w:styles xmlns:mc="http://schemas.openxmlformats.org/markup-compatibility/2006" xmlns:r="http://schemas.openxmlformats.org/officeDocument/2006/relationships" xmlns:w="http://schemas.openxmlformats.org/wordprocessingml/2006/main" xmlns:w14="http://schemas.microsoft.com/office/word/2010/wordml" xmlns:w15="http://schemas.microsoft.com/office/word/2012/wordml" mc:Ignorable="w14 w15">
   <w:docDefaults>
     <w:rPrDefault>
       <w:rPr>
@@ -215,7 +305,7 @@
       </w:pPr>
     </w:pPrDefault>
   </w:docDefaults>
-  <w:latentStyles w:defLockedState="0" w:defUIPriority="99" w:defSemiHidden="0" w:defUnhideWhenUsed="0" w:defQFormat="0" w:count="376">
+  <w:latentStyles w:defLockedState="0" w:defUIPriority="99" w:defSemiHidden="0" w:defUnhideWhenUsed="0" w:defQFormat="0" w:count="371">
     <w:lsdException w:name="Normal" w:uiPriority="0" w:qFormat="1"/>
     <w:lsdException w:name="heading 1" w:uiPriority="9" w:qFormat="1"/>
     <w:lsdException w:name="heading 2" w:semiHidden="1" w:uiPriority="9" w:unhideWhenUsed="1" w:qFormat="1"/>
@@ -587,11 +677,6 @@
     <w:lsdException w:name="List Table 5 Dark Accent 6" w:uiPriority="50"/>
     <w:lsdException w:name="List Table 6 Colorful Accent 6" w:uiPriority="51"/>
     <w:lsdException w:name="List Table 7 Colorful Accent 6" w:uiPriority="52"/>
-    <w:lsdException w:name="Mention" w:semiHidden="1" w:unhideWhenUsed="1"/>
-    <w:lsdException w:name="Smart Hyperlink" w:semiHidden="1" w:unhideWhenUsed="1"/>
-    <w:lsdException w:name="Hashtag" w:semiHidden="1" w:unhideWhenUsed="1"/>
-    <w:lsdException w:name="Unresolved Mention" w:semiHidden="1" w:unhideWhenUsed="1"/>
-    <w:lsdException w:name="Smart Link" w:semiHidden="1" w:unhideWhenUsed="1"/>
   </w:latentStyles>
   <w:style w:type="paragraph" w:default="1" w:styleId="Normal">
     <w:name w:val="Normal"/>

</xml_diff>

<commit_message>
Update students list with Musa Jallow
</commit_message>
<xml_diff>
--- a/Admin/students_names.docx
+++ b/Admin/students_names.docx
@@ -7,7 +7,36 @@
         <w:pStyle w:val="Title"/>
       </w:pPr>
       <w:r>
-        <w:t xml:space="preserve">List of participants </w:t>
+        <w:t>List of participants</w:t>
+      </w:r>
+    </w:p>
+    <w:p>
+      <w:pPr>
+        <w:pStyle w:val="Title"/>
+        <w:numPr>
+          <w:ilvl w:val="0"/>
+          <w:numId w:val="1"/>
+        </w:numPr>
+        <w:jc w:val="left"/>
+      </w:pPr>
+      <w:proofErr w:type="spellStart"/>
+      <w:r>
+        <w:rPr>
+          <w:sz w:val="24"/>
+          <w:szCs w:val="24"/>
+        </w:rPr>
+        <w:t>Banno</w:t>
+      </w:r>
+      <w:proofErr w:type="spellEnd"/>
+      <w:r>
+        <w:rPr>
+          <w:sz w:val="24"/>
+          <w:szCs w:val="24"/>
+        </w:rPr>
+        <w:t xml:space="preserve"> Bah      matt: 22713033</w:t>
+      </w:r>
+      <w:r>
+        <w:t xml:space="preserve"> </w:t>
       </w:r>
     </w:p>
     <w:p>
@@ -17,14 +46,123 @@
           <w:ilvl w:val="0"/>
           <w:numId w:val="1"/>
         </w:numPr>
-      </w:pPr>
-      <w:r>
-        <w:t>Musa Jallow Mat No. 22613535</w:t>
+        <w:rPr>
+          <w:b/>
+          <w:bCs/>
+        </w:rPr>
+      </w:pPr>
+      <w:proofErr w:type="spellStart"/>
+      <w:r>
+        <w:rPr>
+          <w:b/>
+          <w:bCs/>
+        </w:rPr>
+        <w:t>Saikou</w:t>
+      </w:r>
+      <w:proofErr w:type="spellEnd"/>
+      <w:r>
+        <w:rPr>
+          <w:b/>
+          <w:bCs/>
+        </w:rPr>
+        <w:t xml:space="preserve"> T. Ceesay Mat#: 22713020</w:t>
       </w:r>
     </w:p>
     <w:p>
       <w:pPr>
         <w:pStyle w:val="BodyText"/>
+        <w:numPr>
+          <w:ilvl w:val="0"/>
+          <w:numId w:val="1"/>
+        </w:numPr>
+        <w:rPr>
+          <w:b/>
+          <w:bCs/>
+        </w:rPr>
+      </w:pPr>
+      <w:proofErr w:type="gramStart"/>
+      <w:r>
+        <w:rPr>
+          <w:b/>
+          <w:bCs/>
+        </w:rPr>
+        <w:t xml:space="preserve">Abdoulie </w:t>
+      </w:r>
+      <w:r>
+        <w:rPr>
+          <w:b/>
+          <w:bCs/>
+        </w:rPr>
+        <w:t xml:space="preserve"> </w:t>
+      </w:r>
+      <w:r>
+        <w:rPr>
+          <w:b/>
+          <w:bCs/>
+        </w:rPr>
+        <w:t>Ndong</w:t>
+      </w:r>
+      <w:proofErr w:type="gramEnd"/>
+      <w:r>
+        <w:rPr>
+          <w:b/>
+          <w:bCs/>
+        </w:rPr>
+        <w:t xml:space="preserve"> Mat#: 22713039</w:t>
+      </w:r>
+    </w:p>
+    <w:p>
+      <w:pPr>
+        <w:pStyle w:val="BodyText"/>
+        <w:numPr>
+          <w:ilvl w:val="0"/>
+          <w:numId w:val="1"/>
+        </w:numPr>
+        <w:rPr>
+          <w:b/>
+          <w:bCs/>
+        </w:rPr>
+      </w:pPr>
+      <w:r>
+        <w:rPr>
+          <w:b/>
+          <w:bCs/>
+        </w:rPr>
+        <w:t xml:space="preserve">Musa </w:t>
+      </w:r>
+      <w:proofErr w:type="spellStart"/>
+      <w:r>
+        <w:rPr>
+          <w:b/>
+          <w:bCs/>
+        </w:rPr>
+        <w:t>Jallow</w:t>
+      </w:r>
+      <w:proofErr w:type="spellEnd"/>
+      <w:r>
+        <w:rPr>
+          <w:b/>
+          <w:bCs/>
+        </w:rPr>
+        <w:t xml:space="preserve">       Mat #: 22613535</w:t>
+      </w:r>
+    </w:p>
+    <w:p>
+      <w:pPr>
+        <w:pStyle w:val="BodyText"/>
+        <w:rPr>
+          <w:b/>
+          <w:bCs/>
+        </w:rPr>
+      </w:pPr>
+    </w:p>
+    <w:p>
+      <w:pPr>
+        <w:pStyle w:val="BodyText"/>
+        <w:rPr>
+          <w:b/>
+          <w:bCs/>
+        </w:rPr>
       </w:pPr>
     </w:p>
     <w:sectPr>
@@ -41,19 +179,20 @@
 <file path=word/numbering.xml><?xml version="1.0" encoding="utf-8"?>
 <w:numbering xmlns:wpc="http://schemas.microsoft.com/office/word/2010/wordprocessingCanvas" xmlns:cx="http://schemas.microsoft.com/office/drawing/2014/chartex" xmlns:cx1="http://schemas.microsoft.com/office/drawing/2015/9/8/chartex" xmlns:cx2="http://schemas.microsoft.com/office/drawing/2015/10/21/chartex" xmlns:cx3="http://schemas.microsoft.com/office/drawing/2016/5/9/chartex" xmlns:cx4="http://schemas.microsoft.com/office/drawing/2016/5/10/chartex" xmlns:cx5="http://schemas.microsoft.com/office/drawing/2016/5/11/chartex" xmlns:cx6="http://schemas.microsoft.com/office/drawing/2016/5/12/chartex" xmlns:cx7="http://schemas.microsoft.com/office/drawing/2016/5/13/chartex" xmlns:cx8="http://schemas.microsoft.com/office/drawing/2016/5/14/chartex" xmlns:mc="http://schemas.openxmlformats.org/markup-compatibility/2006" xmlns:aink="http://schemas.microsoft.com/office/drawing/2016/ink" xmlns:am3d="http://schemas.microsoft.com/office/drawing/2017/model3d" xmlns:o="urn:schemas-microsoft-com:office:office" xmlns:r="http://schemas.openxmlformats.org/officeDocument/2006/relationships" xmlns:m="http://schemas.openxmlformats.org/officeDocument/2006/math" xmlns:v="urn:schemas-microsoft-com:vml" xmlns:wp14="http://schemas.microsoft.com/office/word/2010/wordprocessingDrawing" xmlns:wp="http://schemas.openxmlformats.org/drawingml/2006/wordprocessingDrawing" xmlns:w10="urn:schemas-microsoft-com:office:word" xmlns:w="http://schemas.openxmlformats.org/wordprocessingml/2006/main" xmlns:w14="http://schemas.microsoft.com/office/word/2010/wordml" xmlns:w15="http://schemas.microsoft.com/office/word/2012/wordml" xmlns:w16cex="http://schemas.microsoft.com/office/word/2018/wordml/cex" xmlns:w16cid="http://schemas.microsoft.com/office/word/2016/wordml/cid" xmlns:w16="http://schemas.microsoft.com/office/word/2018/wordml" xmlns:w16sdtdh="http://schemas.microsoft.com/office/word/2020/wordml/sdtdatahash" xmlns:w16se="http://schemas.microsoft.com/office/word/2015/wordml/symex" xmlns:wpg="http://schemas.microsoft.com/office/word/2010/wordprocessingGroup" xmlns:wpi="http://schemas.microsoft.com/office/word/2010/wordprocessingInk" xmlns:wne="http://schemas.microsoft.com/office/word/2006/wordml" xmlns:wps="http://schemas.microsoft.com/office/word/2010/wordprocessingShape" mc:Ignorable="w14 w15 w16se w16cid w16 w16cex w16sdtdh wp14">
   <w:abstractNum w:abstractNumId="0" w15:restartNumberingAfterBreak="0">
-    <w:nsid w:val="1E427986"/>
+    <w:nsid w:val="71C97DA2"/>
     <w:multiLevelType w:val="hybridMultilevel"/>
-    <w:tmpl w:val="1CC2B83C"/>
-    <w:lvl w:ilvl="0" w:tplc="0409000F">
+    <w:tmpl w:val="23C0DBB0"/>
+    <w:lvl w:ilvl="0" w:tplc="C8B4309C">
       <w:start w:val="1"/>
       <w:numFmt w:val="decimal"/>
       <w:lvlText w:val="%1."/>
       <w:lvlJc w:val="left"/>
       <w:pPr>
-        <w:ind w:left="720" w:hanging="360"/>
+        <w:ind w:left="1080" w:hanging="720"/>
       </w:pPr>
       <w:rPr>
         <w:rFonts w:hint="default"/>
+        <w:sz w:val="24"/>
       </w:rPr>
     </w:lvl>
     <w:lvl w:ilvl="1" w:tplc="04090019" w:tentative="1">

</xml_diff>

<commit_message>
Add my name to the students list
</commit_message>
<xml_diff>
--- a/Admin/students_names.docx
+++ b/Admin/students_names.docx
@@ -1,6 +1,6 @@
 
 <file path=word/document.xml><?xml version="1.0" encoding="utf-8"?>
-<w:document xmlns:wpc="http://schemas.microsoft.com/office/word/2010/wordprocessingCanvas" xmlns:cx="http://schemas.microsoft.com/office/drawing/2014/chartex" xmlns:cx1="http://schemas.microsoft.com/office/drawing/2015/9/8/chartex" xmlns:cx2="http://schemas.microsoft.com/office/drawing/2015/10/21/chartex" xmlns:cx3="http://schemas.microsoft.com/office/drawing/2016/5/9/chartex" xmlns:cx4="http://schemas.microsoft.com/office/drawing/2016/5/10/chartex" xmlns:cx5="http://schemas.microsoft.com/office/drawing/2016/5/11/chartex" xmlns:cx6="http://schemas.microsoft.com/office/drawing/2016/5/12/chartex" xmlns:cx7="http://schemas.microsoft.com/office/drawing/2016/5/13/chartex" xmlns:cx8="http://schemas.microsoft.com/office/drawing/2016/5/14/chartex" xmlns:mc="http://schemas.openxmlformats.org/markup-compatibility/2006" xmlns:aink="http://schemas.microsoft.com/office/drawing/2016/ink" xmlns:am3d="http://schemas.microsoft.com/office/drawing/2017/model3d" xmlns:o="urn:schemas-microsoft-com:office:office" xmlns:r="http://schemas.openxmlformats.org/officeDocument/2006/relationships" xmlns:m="http://schemas.openxmlformats.org/officeDocument/2006/math" xmlns:v="urn:schemas-microsoft-com:vml" xmlns:wp14="http://schemas.microsoft.com/office/word/2010/wordprocessingDrawing" xmlns:wp="http://schemas.openxmlformats.org/drawingml/2006/wordprocessingDrawing" xmlns:w10="urn:schemas-microsoft-com:office:word" xmlns:w="http://schemas.openxmlformats.org/wordprocessingml/2006/main" xmlns:w14="http://schemas.microsoft.com/office/word/2010/wordml" xmlns:w15="http://schemas.microsoft.com/office/word/2012/wordml" xmlns:w16cex="http://schemas.microsoft.com/office/word/2018/wordml/cex" xmlns:w16cid="http://schemas.microsoft.com/office/word/2016/wordml/cid" xmlns:w16="http://schemas.microsoft.com/office/word/2018/wordml" xmlns:w16sdtdh="http://schemas.microsoft.com/office/word/2020/wordml/sdtdatahash" xmlns:w16se="http://schemas.microsoft.com/office/word/2015/wordml/symex" xmlns:wpg="http://schemas.microsoft.com/office/word/2010/wordprocessingGroup" xmlns:wpi="http://schemas.microsoft.com/office/word/2010/wordprocessingInk" xmlns:wne="http://schemas.microsoft.com/office/word/2006/wordml" xmlns:wps="http://schemas.microsoft.com/office/word/2010/wordprocessingShape" mc:Ignorable="w14 w15 w16se w16cid w16 w16cex w16sdtdh wp14">
+<w:document xmlns:wpc="http://schemas.microsoft.com/office/word/2010/wordprocessingCanvas" xmlns:cx="http://schemas.microsoft.com/office/drawing/2014/chartex" xmlns:cx1="http://schemas.microsoft.com/office/drawing/2015/9/8/chartex" xmlns:cx2="http://schemas.microsoft.com/office/drawing/2015/10/21/chartex" xmlns:cx3="http://schemas.microsoft.com/office/drawing/2016/5/9/chartex" xmlns:cx4="http://schemas.microsoft.com/office/drawing/2016/5/10/chartex" xmlns:cx5="http://schemas.microsoft.com/office/drawing/2016/5/11/chartex" xmlns:cx6="http://schemas.microsoft.com/office/drawing/2016/5/12/chartex" xmlns:cx7="http://schemas.microsoft.com/office/drawing/2016/5/13/chartex" xmlns:cx8="http://schemas.microsoft.com/office/drawing/2016/5/14/chartex" xmlns:mc="http://schemas.openxmlformats.org/markup-compatibility/2006" xmlns:aink="http://schemas.microsoft.com/office/drawing/2016/ink" xmlns:am3d="http://schemas.microsoft.com/office/drawing/2017/model3d" xmlns:o="urn:schemas-microsoft-com:office:office" xmlns:oel="http://schemas.microsoft.com/office/2019/extlst" xmlns:r="http://schemas.openxmlformats.org/officeDocument/2006/relationships" xmlns:m="http://schemas.openxmlformats.org/officeDocument/2006/math" xmlns:v="urn:schemas-microsoft-com:vml" xmlns:wp14="http://schemas.microsoft.com/office/word/2010/wordprocessingDrawing" xmlns:wp="http://schemas.openxmlformats.org/drawingml/2006/wordprocessingDrawing" xmlns:w10="urn:schemas-microsoft-com:office:word" xmlns:w="http://schemas.openxmlformats.org/wordprocessingml/2006/main" xmlns:w14="http://schemas.microsoft.com/office/word/2010/wordml" xmlns:w15="http://schemas.microsoft.com/office/word/2012/wordml" xmlns:w16cex="http://schemas.microsoft.com/office/word/2018/wordml/cex" xmlns:w16cid="http://schemas.microsoft.com/office/word/2016/wordml/cid" xmlns:w16="http://schemas.microsoft.com/office/word/2018/wordml" xmlns:w16du="http://schemas.microsoft.com/office/word/2023/wordml/word16du" xmlns:w16sdtdh="http://schemas.microsoft.com/office/word/2020/wordml/sdtdatahash" xmlns:w16sdtfl="http://schemas.microsoft.com/office/word/2024/wordml/sdtformatlock" xmlns:w16se="http://schemas.microsoft.com/office/word/2015/wordml/symex" xmlns:wpg="http://schemas.microsoft.com/office/word/2010/wordprocessingGroup" xmlns:wpi="http://schemas.microsoft.com/office/word/2010/wordprocessingInk" xmlns:wne="http://schemas.microsoft.com/office/word/2006/wordml" xmlns:wps="http://schemas.microsoft.com/office/word/2010/wordprocessingShape" mc:Ignorable="w14 w15 w16se w16cid w16 w16cex w16sdtdh w16sdtfl w16du wp14">
   <w:body>
     <w:p>
       <w:pPr>
@@ -19,21 +19,12 @@
         </w:numPr>
         <w:jc w:val="left"/>
       </w:pPr>
-      <w:proofErr w:type="spellStart"/>
       <w:r>
         <w:rPr>
           <w:sz w:val="24"/>
           <w:szCs w:val="24"/>
         </w:rPr>
-        <w:t>Banno</w:t>
-      </w:r>
-      <w:proofErr w:type="spellEnd"/>
-      <w:r>
-        <w:rPr>
-          <w:sz w:val="24"/>
-          <w:szCs w:val="24"/>
-        </w:rPr>
-        <w:t xml:space="preserve"> Bah      matt: 22713033</w:t>
+        <w:t>Banno Bah      matt: 22713033</w:t>
       </w:r>
       <w:r>
         <w:t xml:space="preserve"> </w:t>
@@ -51,21 +42,12 @@
           <w:bCs/>
         </w:rPr>
       </w:pPr>
-      <w:proofErr w:type="spellStart"/>
-      <w:r>
-        <w:rPr>
-          <w:b/>
-          <w:bCs/>
-        </w:rPr>
-        <w:t>Saikou</w:t>
-      </w:r>
-      <w:proofErr w:type="spellEnd"/>
-      <w:r>
-        <w:rPr>
-          <w:b/>
-          <w:bCs/>
-        </w:rPr>
-        <w:t xml:space="preserve"> T. Ceesay Mat#: 22713020</w:t>
+      <w:r>
+        <w:rPr>
+          <w:b/>
+          <w:bCs/>
+        </w:rPr>
+        <w:t>Saikou T. Ceesay Mat#: 22713020</w:t>
       </w:r>
     </w:p>
     <w:p>
@@ -224,23 +206,43 @@
         </w:rPr>
         <w:t xml:space="preserve">Musa </w:t>
       </w:r>
-      <w:proofErr w:type="spellStart"/>
+      <w:proofErr w:type="gramStart"/>
       <w:r>
         <w:rPr>
           <w:b/>
           <w:bCs/>
           <w:sz w:val="18"/>
         </w:rPr>
-        <w:t>Jallow</w:t>
-      </w:r>
-      <w:proofErr w:type="spellEnd"/>
+        <w:t>Jallow  Mat</w:t>
+      </w:r>
+      <w:proofErr w:type="gramEnd"/>
       <w:r>
         <w:rPr>
           <w:b/>
           <w:bCs/>
           <w:sz w:val="18"/>
         </w:rPr>
-        <w:t xml:space="preserve">  Mat #: 22613535</w:t>
+        <w:t xml:space="preserve"> #: 22613535</w:t>
+      </w:r>
+    </w:p>
+    <w:p>
+      <w:pPr>
+        <w:pStyle w:val="BodyText"/>
+        <w:numPr>
+          <w:ilvl w:val="0"/>
+          <w:numId w:val="1"/>
+        </w:numPr>
+        <w:rPr>
+          <w:b/>
+          <w:bCs/>
+        </w:rPr>
+      </w:pPr>
+      <w:r>
+        <w:rPr>
+          <w:b/>
+          <w:bCs/>
+        </w:rPr>
+        <w:t>Sheriff Jammeh Mat#: 22713014</w:t>
       </w:r>
     </w:p>
     <w:p>
@@ -273,7 +275,7 @@
 </file>
 
 <file path=word/numbering.xml><?xml version="1.0" encoding="utf-8"?>
-<w:numbering xmlns:wpc="http://schemas.microsoft.com/office/word/2010/wordprocessingCanvas" xmlns:cx="http://schemas.microsoft.com/office/drawing/2014/chartex" xmlns:cx1="http://schemas.microsoft.com/office/drawing/2015/9/8/chartex" xmlns:cx2="http://schemas.microsoft.com/office/drawing/2015/10/21/chartex" xmlns:cx3="http://schemas.microsoft.com/office/drawing/2016/5/9/chartex" xmlns:cx4="http://schemas.microsoft.com/office/drawing/2016/5/10/chartex" xmlns:cx5="http://schemas.microsoft.com/office/drawing/2016/5/11/chartex" xmlns:cx6="http://schemas.microsoft.com/office/drawing/2016/5/12/chartex" xmlns:cx7="http://schemas.microsoft.com/office/drawing/2016/5/13/chartex" xmlns:cx8="http://schemas.microsoft.com/office/drawing/2016/5/14/chartex" xmlns:mc="http://schemas.openxmlformats.org/markup-compatibility/2006" xmlns:aink="http://schemas.microsoft.com/office/drawing/2016/ink" xmlns:am3d="http://schemas.microsoft.com/office/drawing/2017/model3d" xmlns:o="urn:schemas-microsoft-com:office:office" xmlns:r="http://schemas.openxmlformats.org/officeDocument/2006/relationships" xmlns:m="http://schemas.openxmlformats.org/officeDocument/2006/math" xmlns:v="urn:schemas-microsoft-com:vml" xmlns:wp14="http://schemas.microsoft.com/office/word/2010/wordprocessingDrawing" xmlns:wp="http://schemas.openxmlformats.org/drawingml/2006/wordprocessingDrawing" xmlns:w10="urn:schemas-microsoft-com:office:word" xmlns:w="http://schemas.openxmlformats.org/wordprocessingml/2006/main" xmlns:w14="http://schemas.microsoft.com/office/word/2010/wordml" xmlns:w15="http://schemas.microsoft.com/office/word/2012/wordml" xmlns:w16cex="http://schemas.microsoft.com/office/word/2018/wordml/cex" xmlns:w16cid="http://schemas.microsoft.com/office/word/2016/wordml/cid" xmlns:w16="http://schemas.microsoft.com/office/word/2018/wordml" xmlns:w16sdtdh="http://schemas.microsoft.com/office/word/2020/wordml/sdtdatahash" xmlns:w16se="http://schemas.microsoft.com/office/word/2015/wordml/symex" xmlns:wpg="http://schemas.microsoft.com/office/word/2010/wordprocessingGroup" xmlns:wpi="http://schemas.microsoft.com/office/word/2010/wordprocessingInk" xmlns:wne="http://schemas.microsoft.com/office/word/2006/wordml" xmlns:wps="http://schemas.microsoft.com/office/word/2010/wordprocessingShape" mc:Ignorable="w14 w15 w16se w16cid w16 w16cex w16sdtdh wp14">
+<w:numbering xmlns:wpc="http://schemas.microsoft.com/office/word/2010/wordprocessingCanvas" xmlns:cx="http://schemas.microsoft.com/office/drawing/2014/chartex" xmlns:cx1="http://schemas.microsoft.com/office/drawing/2015/9/8/chartex" xmlns:cx2="http://schemas.microsoft.com/office/drawing/2015/10/21/chartex" xmlns:cx3="http://schemas.microsoft.com/office/drawing/2016/5/9/chartex" xmlns:cx4="http://schemas.microsoft.com/office/drawing/2016/5/10/chartex" xmlns:cx5="http://schemas.microsoft.com/office/drawing/2016/5/11/chartex" xmlns:cx6="http://schemas.microsoft.com/office/drawing/2016/5/12/chartex" xmlns:cx7="http://schemas.microsoft.com/office/drawing/2016/5/13/chartex" xmlns:cx8="http://schemas.microsoft.com/office/drawing/2016/5/14/chartex" xmlns:mc="http://schemas.openxmlformats.org/markup-compatibility/2006" xmlns:aink="http://schemas.microsoft.com/office/drawing/2016/ink" xmlns:am3d="http://schemas.microsoft.com/office/drawing/2017/model3d" xmlns:o="urn:schemas-microsoft-com:office:office" xmlns:oel="http://schemas.microsoft.com/office/2019/extlst" xmlns:r="http://schemas.openxmlformats.org/officeDocument/2006/relationships" xmlns:m="http://schemas.openxmlformats.org/officeDocument/2006/math" xmlns:v="urn:schemas-microsoft-com:vml" xmlns:wp14="http://schemas.microsoft.com/office/word/2010/wordprocessingDrawing" xmlns:wp="http://schemas.openxmlformats.org/drawingml/2006/wordprocessingDrawing" xmlns:w10="urn:schemas-microsoft-com:office:word" xmlns:w="http://schemas.openxmlformats.org/wordprocessingml/2006/main" xmlns:w14="http://schemas.microsoft.com/office/word/2010/wordml" xmlns:w15="http://schemas.microsoft.com/office/word/2012/wordml" xmlns:w16cex="http://schemas.microsoft.com/office/word/2018/wordml/cex" xmlns:w16cid="http://schemas.microsoft.com/office/word/2016/wordml/cid" xmlns:w16="http://schemas.microsoft.com/office/word/2018/wordml" xmlns:w16du="http://schemas.microsoft.com/office/word/2023/wordml/word16du" xmlns:w16sdtdh="http://schemas.microsoft.com/office/word/2020/wordml/sdtdatahash" xmlns:w16sdtfl="http://schemas.microsoft.com/office/word/2024/wordml/sdtformatlock" xmlns:w16se="http://schemas.microsoft.com/office/word/2015/wordml/symex" xmlns:wpg="http://schemas.microsoft.com/office/word/2010/wordprocessingGroup" xmlns:wpi="http://schemas.microsoft.com/office/word/2010/wordprocessingInk" xmlns:wne="http://schemas.microsoft.com/office/word/2006/wordml" xmlns:wps="http://schemas.microsoft.com/office/word/2010/wordprocessingShape" mc:Ignorable="w14 w15 w16se w16cid w16 w16cex w16sdtdh w16sdtfl w16du wp14">
   <w:abstractNum w:abstractNumId="0" w15:restartNumberingAfterBreak="0">
     <w:nsid w:val="71C97DA2"/>
     <w:multiLevelType w:val="hybridMultilevel"/>
@@ -364,14 +366,14 @@
       </w:pPr>
     </w:lvl>
   </w:abstractNum>
-  <w:num w:numId="1">
+  <w:num w:numId="1" w16cid:durableId="1416592207">
     <w:abstractNumId w:val="0"/>
   </w:num>
 </w:numbering>
 </file>
 
 <file path=word/styles.xml><?xml version="1.0" encoding="utf-8"?>
-<w:styles xmlns:mc="http://schemas.openxmlformats.org/markup-compatibility/2006" xmlns:r="http://schemas.openxmlformats.org/officeDocument/2006/relationships" xmlns:w="http://schemas.openxmlformats.org/wordprocessingml/2006/main" xmlns:w14="http://schemas.microsoft.com/office/word/2010/wordml" xmlns:w15="http://schemas.microsoft.com/office/word/2012/wordml" xmlns:w16cex="http://schemas.microsoft.com/office/word/2018/wordml/cex" xmlns:w16cid="http://schemas.microsoft.com/office/word/2016/wordml/cid" xmlns:w16="http://schemas.microsoft.com/office/word/2018/wordml" xmlns:w16sdtdh="http://schemas.microsoft.com/office/word/2020/wordml/sdtdatahash" xmlns:w16se="http://schemas.microsoft.com/office/word/2015/wordml/symex" mc:Ignorable="w14 w15 w16se w16cid w16 w16cex w16sdtdh">
+<w:styles xmlns:mc="http://schemas.openxmlformats.org/markup-compatibility/2006" xmlns:r="http://schemas.openxmlformats.org/officeDocument/2006/relationships" xmlns:w="http://schemas.openxmlformats.org/wordprocessingml/2006/main" xmlns:w14="http://schemas.microsoft.com/office/word/2010/wordml" xmlns:w15="http://schemas.microsoft.com/office/word/2012/wordml" xmlns:w16cex="http://schemas.microsoft.com/office/word/2018/wordml/cex" xmlns:w16cid="http://schemas.microsoft.com/office/word/2016/wordml/cid" xmlns:w16="http://schemas.microsoft.com/office/word/2018/wordml" xmlns:w16du="http://schemas.microsoft.com/office/word/2023/wordml/word16du" xmlns:w16sdtdh="http://schemas.microsoft.com/office/word/2020/wordml/sdtdatahash" xmlns:w16sdtfl="http://schemas.microsoft.com/office/word/2024/wordml/sdtformatlock" xmlns:w16se="http://schemas.microsoft.com/office/word/2015/wordml/symex" mc:Ignorable="w14 w15 w16se w16cid w16 w16cex w16sdtdh w16sdtfl w16du">
   <w:docDefaults>
     <w:rPrDefault>
       <w:rPr>
@@ -494,6 +496,7 @@
     <w:lsdException w:name="HTML Sample" w:semiHidden="1" w:unhideWhenUsed="1"/>
     <w:lsdException w:name="HTML Typewriter" w:semiHidden="1" w:unhideWhenUsed="1"/>
     <w:lsdException w:name="HTML Variable" w:semiHidden="1" w:unhideWhenUsed="1"/>
+    <w:lsdException w:name="Normal Table" w:semiHidden="1" w:unhideWhenUsed="1"/>
     <w:lsdException w:name="annotation subject" w:semiHidden="1" w:unhideWhenUsed="1"/>
     <w:lsdException w:name="No List" w:semiHidden="1" w:unhideWhenUsed="1"/>
     <w:lsdException w:name="Outline List 1" w:semiHidden="1" w:unhideWhenUsed="1"/>
@@ -536,8 +539,11 @@
     <w:lsdException w:name="Table Contemporary" w:semiHidden="1" w:unhideWhenUsed="1"/>
     <w:lsdException w:name="Table Elegant" w:semiHidden="1" w:unhideWhenUsed="1"/>
     <w:lsdException w:name="Table Professional" w:semiHidden="1" w:unhideWhenUsed="1"/>
+    <w:lsdException w:name="Table Subtle 1" w:semiHidden="1" w:unhideWhenUsed="1"/>
     <w:lsdException w:name="Table Subtle 2" w:semiHidden="1" w:unhideWhenUsed="1"/>
     <w:lsdException w:name="Table Web 1" w:semiHidden="1" w:unhideWhenUsed="1"/>
+    <w:lsdException w:name="Table Web 2" w:semiHidden="1" w:unhideWhenUsed="1"/>
+    <w:lsdException w:name="Table Web 3" w:semiHidden="1" w:unhideWhenUsed="1"/>
     <w:lsdException w:name="Balloon Text" w:semiHidden="1" w:unhideWhenUsed="1"/>
     <w:lsdException w:name="Table Grid" w:uiPriority="39"/>
     <w:lsdException w:name="Table Theme" w:semiHidden="1" w:unhideWhenUsed="1"/>

</xml_diff>

<commit_message>
Add Musa Jallow to student list
</commit_message>
<xml_diff>
--- a/Admin/students_names.docx
+++ b/Admin/students_names.docx
@@ -1,6 +1,6 @@
 
 <file path=word/document.xml><?xml version="1.0" encoding="utf-8"?>
-<w:document xmlns:wpc="http://schemas.microsoft.com/office/word/2010/wordprocessingCanvas" xmlns:mc="http://schemas.openxmlformats.org/markup-compatibility/2006" xmlns:o="urn:schemas-microsoft-com:office:office" xmlns:r="http://schemas.openxmlformats.org/officeDocument/2006/relationships" xmlns:m="http://schemas.openxmlformats.org/officeDocument/2006/math" xmlns:v="urn:schemas-microsoft-com:vml" xmlns:wp14="http://schemas.microsoft.com/office/word/2010/wordprocessingDrawing" xmlns:wp="http://schemas.openxmlformats.org/drawingml/2006/wordprocessingDrawing" xmlns:w10="urn:schemas-microsoft-com:office:word" xmlns:w="http://schemas.openxmlformats.org/wordprocessingml/2006/main" xmlns:w14="http://schemas.microsoft.com/office/word/2010/wordml" xmlns:w15="http://schemas.microsoft.com/office/word/2012/wordml" xmlns:wpg="http://schemas.microsoft.com/office/word/2010/wordprocessingGroup" xmlns:wpi="http://schemas.microsoft.com/office/word/2010/wordprocessingInk" xmlns:wne="http://schemas.microsoft.com/office/word/2006/wordml" xmlns:wps="http://schemas.microsoft.com/office/word/2010/wordprocessingShape" mc:Ignorable="w14 w15 wp14">
+<w:document xmlns:wpc="http://schemas.microsoft.com/office/word/2010/wordprocessingCanvas" xmlns:cx="http://schemas.microsoft.com/office/drawing/2014/chartex" xmlns:cx1="http://schemas.microsoft.com/office/drawing/2015/9/8/chartex" xmlns:cx2="http://schemas.microsoft.com/office/drawing/2015/10/21/chartex" xmlns:cx3="http://schemas.microsoft.com/office/drawing/2016/5/9/chartex" xmlns:cx4="http://schemas.microsoft.com/office/drawing/2016/5/10/chartex" xmlns:cx5="http://schemas.microsoft.com/office/drawing/2016/5/11/chartex" xmlns:cx6="http://schemas.microsoft.com/office/drawing/2016/5/12/chartex" xmlns:cx7="http://schemas.microsoft.com/office/drawing/2016/5/13/chartex" xmlns:cx8="http://schemas.microsoft.com/office/drawing/2016/5/14/chartex" xmlns:mc="http://schemas.openxmlformats.org/markup-compatibility/2006" xmlns:aink="http://schemas.microsoft.com/office/drawing/2016/ink" xmlns:am3d="http://schemas.microsoft.com/office/drawing/2017/model3d" xmlns:o="urn:schemas-microsoft-com:office:office" xmlns:r="http://schemas.openxmlformats.org/officeDocument/2006/relationships" xmlns:m="http://schemas.openxmlformats.org/officeDocument/2006/math" xmlns:v="urn:schemas-microsoft-com:vml" xmlns:wp14="http://schemas.microsoft.com/office/word/2010/wordprocessingDrawing" xmlns:wp="http://schemas.openxmlformats.org/drawingml/2006/wordprocessingDrawing" xmlns:w10="urn:schemas-microsoft-com:office:word" xmlns:w="http://schemas.openxmlformats.org/wordprocessingml/2006/main" xmlns:w14="http://schemas.microsoft.com/office/word/2010/wordml" xmlns:w15="http://schemas.microsoft.com/office/word/2012/wordml" xmlns:w16cex="http://schemas.microsoft.com/office/word/2018/wordml/cex" xmlns:w16cid="http://schemas.microsoft.com/office/word/2016/wordml/cid" xmlns:w16="http://schemas.microsoft.com/office/word/2018/wordml" xmlns:w16sdtdh="http://schemas.microsoft.com/office/word/2020/wordml/sdtdatahash" xmlns:w16se="http://schemas.microsoft.com/office/word/2015/wordml/symex" xmlns:wpg="http://schemas.microsoft.com/office/word/2010/wordprocessingGroup" xmlns:wpi="http://schemas.microsoft.com/office/word/2010/wordprocessingInk" xmlns:wne="http://schemas.microsoft.com/office/word/2006/wordml" xmlns:wps="http://schemas.microsoft.com/office/word/2010/wordprocessingShape" mc:Ignorable="w14 w15 w16se w16cid w16 w16cex w16sdtdh wp14">
   <w:body>
     <w:p>
       <w:pPr>
@@ -80,37 +80,12 @@
           <w:bCs/>
         </w:rPr>
       </w:pPr>
-      <w:proofErr w:type="spellStart"/>
-      <w:r>
-        <w:rPr>
-          <w:b/>
-          <w:bCs/>
-        </w:rPr>
-        <w:t>Abdoulie</w:t>
-      </w:r>
-      <w:proofErr w:type="spellEnd"/>
-      <w:r>
-        <w:rPr>
-          <w:b/>
-          <w:bCs/>
-        </w:rPr>
-        <w:t xml:space="preserve"> </w:t>
-      </w:r>
-      <w:proofErr w:type="spellStart"/>
-      <w:r>
-        <w:rPr>
-          <w:b/>
-          <w:bCs/>
-        </w:rPr>
-        <w:t>Ndong</w:t>
-      </w:r>
-      <w:proofErr w:type="spellEnd"/>
-      <w:r>
-        <w:rPr>
-          <w:b/>
-          <w:bCs/>
-        </w:rPr>
-        <w:t xml:space="preserve"> Mat#: 22713039</w:t>
+      <w:r>
+        <w:rPr>
+          <w:b/>
+          <w:bCs/>
+        </w:rPr>
+        <w:t>Abdoulie Ndong Mat#: 22713039</w:t>
       </w:r>
     </w:p>
     <w:p>
@@ -125,21 +100,12 @@
           <w:bCs/>
         </w:rPr>
       </w:pPr>
-      <w:proofErr w:type="spellStart"/>
-      <w:r>
-        <w:rPr>
-          <w:b/>
-          <w:bCs/>
-        </w:rPr>
-        <w:t>Abou</w:t>
-      </w:r>
-      <w:proofErr w:type="spellEnd"/>
-      <w:r>
-        <w:rPr>
-          <w:b/>
-          <w:bCs/>
-        </w:rPr>
-        <w:t xml:space="preserve"> B </w:t>
+      <w:r>
+        <w:rPr>
+          <w:b/>
+          <w:bCs/>
+        </w:rPr>
+        <w:t xml:space="preserve">Abou B </w:t>
       </w:r>
       <w:proofErr w:type="spellStart"/>
       <w:r>
@@ -214,8 +180,50 @@
           <w:bCs/>
           <w:sz w:val="18"/>
         </w:rPr>
+        <w:t xml:space="preserve"> Mendy Mat</w:t>
+      </w:r>
+      <w:r>
+        <w:rPr>
+          <w:b/>
+          <w:bCs/>
+        </w:rPr>
+        <w:t xml:space="preserve">#: </w:t>
+      </w:r>
+      <w:r>
+        <w:rPr>
+          <w:b/>
+          <w:bCs/>
+        </w:rPr>
         <w:t xml:space="preserve"> </w:t>
       </w:r>
+      <w:r>
+        <w:rPr>
+          <w:b/>
+          <w:bCs/>
+        </w:rPr>
+        <w:t>22613536</w:t>
+      </w:r>
+    </w:p>
+    <w:p>
+      <w:pPr>
+        <w:pStyle w:val="BodyText"/>
+        <w:numPr>
+          <w:ilvl w:val="0"/>
+          <w:numId w:val="1"/>
+        </w:numPr>
+        <w:rPr>
+          <w:b/>
+          <w:bCs/>
+        </w:rPr>
+      </w:pPr>
+      <w:r>
+        <w:rPr>
+          <w:b/>
+          <w:bCs/>
+          <w:sz w:val="18"/>
+        </w:rPr>
+        <w:t xml:space="preserve">Musa </w:t>
+      </w:r>
       <w:proofErr w:type="spellStart"/>
       <w:r>
         <w:rPr>
@@ -223,7 +231,7 @@
           <w:bCs/>
           <w:sz w:val="18"/>
         </w:rPr>
-        <w:t>Mendy</w:t>
+        <w:t>Jallow</w:t>
       </w:r>
       <w:proofErr w:type="spellEnd"/>
       <w:r>
@@ -232,37 +240,7 @@
           <w:bCs/>
           <w:sz w:val="18"/>
         </w:rPr>
-        <w:t xml:space="preserve"> Mat</w:t>
-      </w:r>
-      <w:r>
-        <w:rPr>
-          <w:b/>
-          <w:bCs/>
-        </w:rPr>
-        <w:t>#</w:t>
-      </w:r>
-      <w:r>
-        <w:rPr>
-          <w:b/>
-          <w:bCs/>
-        </w:rPr>
-        <w:t xml:space="preserve">: </w:t>
-      </w:r>
-      <w:r>
-        <w:rPr>
-          <w:b/>
-          <w:bCs/>
-        </w:rPr>
-        <w:t xml:space="preserve"> </w:t>
-      </w:r>
-      <w:bookmarkStart w:id="0" w:name="_GoBack"/>
-      <w:bookmarkEnd w:id="0"/>
-      <w:r>
-        <w:rPr>
-          <w:b/>
-          <w:bCs/>
-        </w:rPr>
-        <w:t>22613536</w:t>
+        <w:t xml:space="preserve">  Mat #: 22613535</w:t>
       </w:r>
     </w:p>
     <w:p>
@@ -295,8 +273,8 @@
 </file>
 
 <file path=word/numbering.xml><?xml version="1.0" encoding="utf-8"?>
-<w:numbering xmlns:wpc="http://schemas.microsoft.com/office/word/2010/wordprocessingCanvas" xmlns:mc="http://schemas.openxmlformats.org/markup-compatibility/2006" xmlns:o="urn:schemas-microsoft-com:office:office" xmlns:r="http://schemas.openxmlformats.org/officeDocument/2006/relationships" xmlns:m="http://schemas.openxmlformats.org/officeDocument/2006/math" xmlns:v="urn:schemas-microsoft-com:vml" xmlns:wp14="http://schemas.microsoft.com/office/word/2010/wordprocessingDrawing" xmlns:wp="http://schemas.openxmlformats.org/drawingml/2006/wordprocessingDrawing" xmlns:w10="urn:schemas-microsoft-com:office:word" xmlns:w="http://schemas.openxmlformats.org/wordprocessingml/2006/main" xmlns:w14="http://schemas.microsoft.com/office/word/2010/wordml" xmlns:w15="http://schemas.microsoft.com/office/word/2012/wordml" xmlns:wpg="http://schemas.microsoft.com/office/word/2010/wordprocessingGroup" xmlns:wpi="http://schemas.microsoft.com/office/word/2010/wordprocessingInk" xmlns:wne="http://schemas.microsoft.com/office/word/2006/wordml" xmlns:wps="http://schemas.microsoft.com/office/word/2010/wordprocessingShape" mc:Ignorable="w14 w15 wp14">
-  <w:abstractNum w:abstractNumId="0">
+<w:numbering xmlns:wpc="http://schemas.microsoft.com/office/word/2010/wordprocessingCanvas" xmlns:cx="http://schemas.microsoft.com/office/drawing/2014/chartex" xmlns:cx1="http://schemas.microsoft.com/office/drawing/2015/9/8/chartex" xmlns:cx2="http://schemas.microsoft.com/office/drawing/2015/10/21/chartex" xmlns:cx3="http://schemas.microsoft.com/office/drawing/2016/5/9/chartex" xmlns:cx4="http://schemas.microsoft.com/office/drawing/2016/5/10/chartex" xmlns:cx5="http://schemas.microsoft.com/office/drawing/2016/5/11/chartex" xmlns:cx6="http://schemas.microsoft.com/office/drawing/2016/5/12/chartex" xmlns:cx7="http://schemas.microsoft.com/office/drawing/2016/5/13/chartex" xmlns:cx8="http://schemas.microsoft.com/office/drawing/2016/5/14/chartex" xmlns:mc="http://schemas.openxmlformats.org/markup-compatibility/2006" xmlns:aink="http://schemas.microsoft.com/office/drawing/2016/ink" xmlns:am3d="http://schemas.microsoft.com/office/drawing/2017/model3d" xmlns:o="urn:schemas-microsoft-com:office:office" xmlns:r="http://schemas.openxmlformats.org/officeDocument/2006/relationships" xmlns:m="http://schemas.openxmlformats.org/officeDocument/2006/math" xmlns:v="urn:schemas-microsoft-com:vml" xmlns:wp14="http://schemas.microsoft.com/office/word/2010/wordprocessingDrawing" xmlns:wp="http://schemas.openxmlformats.org/drawingml/2006/wordprocessingDrawing" xmlns:w10="urn:schemas-microsoft-com:office:word" xmlns:w="http://schemas.openxmlformats.org/wordprocessingml/2006/main" xmlns:w14="http://schemas.microsoft.com/office/word/2010/wordml" xmlns:w15="http://schemas.microsoft.com/office/word/2012/wordml" xmlns:w16cex="http://schemas.microsoft.com/office/word/2018/wordml/cex" xmlns:w16cid="http://schemas.microsoft.com/office/word/2016/wordml/cid" xmlns:w16="http://schemas.microsoft.com/office/word/2018/wordml" xmlns:w16sdtdh="http://schemas.microsoft.com/office/word/2020/wordml/sdtdatahash" xmlns:w16se="http://schemas.microsoft.com/office/word/2015/wordml/symex" xmlns:wpg="http://schemas.microsoft.com/office/word/2010/wordprocessingGroup" xmlns:wpi="http://schemas.microsoft.com/office/word/2010/wordprocessingInk" xmlns:wne="http://schemas.microsoft.com/office/word/2006/wordml" xmlns:wps="http://schemas.microsoft.com/office/word/2010/wordprocessingShape" mc:Ignorable="w14 w15 w16se w16cid w16 w16cex w16sdtdh wp14">
+  <w:abstractNum w:abstractNumId="0" w15:restartNumberingAfterBreak="0">
     <w:nsid w:val="71C97DA2"/>
     <w:multiLevelType w:val="hybridMultilevel"/>
     <w:tmpl w:val="23C0DBB0"/>
@@ -393,7 +371,7 @@
 </file>
 
 <file path=word/styles.xml><?xml version="1.0" encoding="utf-8"?>
-<w:styles xmlns:mc="http://schemas.openxmlformats.org/markup-compatibility/2006" xmlns:r="http://schemas.openxmlformats.org/officeDocument/2006/relationships" xmlns:w="http://schemas.openxmlformats.org/wordprocessingml/2006/main" xmlns:w14="http://schemas.microsoft.com/office/word/2010/wordml" xmlns:w15="http://schemas.microsoft.com/office/word/2012/wordml" mc:Ignorable="w14 w15">
+<w:styles xmlns:mc="http://schemas.openxmlformats.org/markup-compatibility/2006" xmlns:r="http://schemas.openxmlformats.org/officeDocument/2006/relationships" xmlns:w="http://schemas.openxmlformats.org/wordprocessingml/2006/main" xmlns:w14="http://schemas.microsoft.com/office/word/2010/wordml" xmlns:w15="http://schemas.microsoft.com/office/word/2012/wordml" xmlns:w16cex="http://schemas.microsoft.com/office/word/2018/wordml/cex" xmlns:w16cid="http://schemas.microsoft.com/office/word/2016/wordml/cid" xmlns:w16="http://schemas.microsoft.com/office/word/2018/wordml" xmlns:w16sdtdh="http://schemas.microsoft.com/office/word/2020/wordml/sdtdatahash" xmlns:w16se="http://schemas.microsoft.com/office/word/2015/wordml/symex" mc:Ignorable="w14 w15 w16se w16cid w16 w16cex w16sdtdh">
   <w:docDefaults>
     <w:rPrDefault>
       <w:rPr>
@@ -410,7 +388,7 @@
       </w:pPr>
     </w:pPrDefault>
   </w:docDefaults>
-  <w:latentStyles w:defLockedState="0" w:defUIPriority="99" w:defSemiHidden="0" w:defUnhideWhenUsed="0" w:defQFormat="0" w:count="371">
+  <w:latentStyles w:defLockedState="0" w:defUIPriority="99" w:defSemiHidden="0" w:defUnhideWhenUsed="0" w:defQFormat="0" w:count="376">
     <w:lsdException w:name="Normal" w:uiPriority="0" w:qFormat="1"/>
     <w:lsdException w:name="heading 1" w:uiPriority="9" w:qFormat="1"/>
     <w:lsdException w:name="heading 2" w:semiHidden="1" w:uiPriority="9" w:unhideWhenUsed="1" w:qFormat="1"/>
@@ -516,7 +494,6 @@
     <w:lsdException w:name="HTML Sample" w:semiHidden="1" w:unhideWhenUsed="1"/>
     <w:lsdException w:name="HTML Typewriter" w:semiHidden="1" w:unhideWhenUsed="1"/>
     <w:lsdException w:name="HTML Variable" w:semiHidden="1" w:unhideWhenUsed="1"/>
-    <w:lsdException w:name="Normal Table" w:semiHidden="1" w:unhideWhenUsed="1"/>
     <w:lsdException w:name="annotation subject" w:semiHidden="1" w:unhideWhenUsed="1"/>
     <w:lsdException w:name="No List" w:semiHidden="1" w:unhideWhenUsed="1"/>
     <w:lsdException w:name="Outline List 1" w:semiHidden="1" w:unhideWhenUsed="1"/>
@@ -559,11 +536,8 @@
     <w:lsdException w:name="Table Contemporary" w:semiHidden="1" w:unhideWhenUsed="1"/>
     <w:lsdException w:name="Table Elegant" w:semiHidden="1" w:unhideWhenUsed="1"/>
     <w:lsdException w:name="Table Professional" w:semiHidden="1" w:unhideWhenUsed="1"/>
-    <w:lsdException w:name="Table Subtle 1" w:semiHidden="1" w:unhideWhenUsed="1"/>
     <w:lsdException w:name="Table Subtle 2" w:semiHidden="1" w:unhideWhenUsed="1"/>
     <w:lsdException w:name="Table Web 1" w:semiHidden="1" w:unhideWhenUsed="1"/>
-    <w:lsdException w:name="Table Web 2" w:semiHidden="1" w:unhideWhenUsed="1"/>
-    <w:lsdException w:name="Table Web 3" w:semiHidden="1" w:unhideWhenUsed="1"/>
     <w:lsdException w:name="Balloon Text" w:semiHidden="1" w:unhideWhenUsed="1"/>
     <w:lsdException w:name="Table Grid" w:uiPriority="39"/>
     <w:lsdException w:name="Table Theme" w:semiHidden="1" w:unhideWhenUsed="1"/>
@@ -782,6 +756,11 @@
     <w:lsdException w:name="List Table 5 Dark Accent 6" w:uiPriority="50"/>
     <w:lsdException w:name="List Table 6 Colorful Accent 6" w:uiPriority="51"/>
     <w:lsdException w:name="List Table 7 Colorful Accent 6" w:uiPriority="52"/>
+    <w:lsdException w:name="Mention" w:semiHidden="1" w:unhideWhenUsed="1"/>
+    <w:lsdException w:name="Smart Hyperlink" w:semiHidden="1" w:unhideWhenUsed="1"/>
+    <w:lsdException w:name="Hashtag" w:semiHidden="1" w:unhideWhenUsed="1"/>
+    <w:lsdException w:name="Unresolved Mention" w:semiHidden="1" w:unhideWhenUsed="1"/>
+    <w:lsdException w:name="Smart Link" w:semiHidden="1" w:unhideWhenUsed="1"/>
   </w:latentStyles>
   <w:style w:type="paragraph" w:default="1" w:styleId="Normal">
     <w:name w:val="Normal"/>

</xml_diff>

<commit_message>
i have added Abdoulie Cham
</commit_message>
<xml_diff>
--- a/Admin/students_names.docx
+++ b/Admin/students_names.docx
@@ -4,7 +4,7 @@
   <w:body>
     <w:p>
       <w:pPr>
-        <w:pStyle w:val="Titel"/>
+        <w:pStyle w:val="Title"/>
       </w:pPr>
       <w:r>
         <w:t>List of participants</w:t>
@@ -12,7 +12,7 @@
     </w:p>
     <w:p>
       <w:pPr>
-        <w:pStyle w:val="Titel"/>
+        <w:pStyle w:val="Title"/>
         <w:numPr>
           <w:ilvl w:val="0"/>
           <w:numId w:val="1"/>
@@ -32,7 +32,7 @@
     </w:p>
     <w:p>
       <w:pPr>
-        <w:pStyle w:val="Plattetekst"/>
+        <w:pStyle w:val="BodyText"/>
         <w:numPr>
           <w:ilvl w:val="0"/>
           <w:numId w:val="1"/>
@@ -52,7 +52,7 @@
     </w:p>
     <w:p>
       <w:pPr>
-        <w:pStyle w:val="Plattetekst"/>
+        <w:pStyle w:val="BodyText"/>
         <w:numPr>
           <w:ilvl w:val="0"/>
           <w:numId w:val="1"/>
@@ -72,7 +72,7 @@
     </w:p>
     <w:p>
       <w:pPr>
-        <w:pStyle w:val="Plattetekst"/>
+        <w:pStyle w:val="BodyText"/>
         <w:numPr>
           <w:ilvl w:val="0"/>
           <w:numId w:val="1"/>
@@ -92,7 +92,7 @@
     </w:p>
     <w:p>
       <w:pPr>
-        <w:pStyle w:val="Plattetekst"/>
+        <w:pStyle w:val="BodyText"/>
         <w:numPr>
           <w:ilvl w:val="0"/>
           <w:numId w:val="1"/>
@@ -120,7 +120,7 @@
     </w:p>
     <w:p>
       <w:pPr>
-        <w:pStyle w:val="Plattetekst"/>
+        <w:pStyle w:val="BodyText"/>
         <w:numPr>
           <w:ilvl w:val="0"/>
           <w:numId w:val="1"/>
@@ -162,7 +162,7 @@
     </w:p>
     <w:p>
       <w:pPr>
-        <w:pStyle w:val="Plattetekst"/>
+        <w:pStyle w:val="BodyText"/>
         <w:numPr>
           <w:ilvl w:val="0"/>
           <w:numId w:val="1"/>
@@ -183,7 +183,7 @@
     </w:p>
     <w:p>
       <w:pPr>
-        <w:pStyle w:val="Plattetekst"/>
+        <w:pStyle w:val="BodyText"/>
         <w:numPr>
           <w:ilvl w:val="0"/>
           <w:numId w:val="1"/>
@@ -203,7 +203,7 @@
     </w:p>
     <w:p>
       <w:pPr>
-        <w:pStyle w:val="Plattetekst"/>
+        <w:pStyle w:val="BodyText"/>
         <w:numPr>
           <w:ilvl w:val="0"/>
           <w:numId w:val="1"/>
@@ -237,16 +237,36 @@
     </w:p>
     <w:p>
       <w:pPr>
-        <w:pStyle w:val="Plattetekst"/>
-        <w:rPr>
-          <w:b/>
-          <w:bCs/>
-        </w:rPr>
-      </w:pPr>
-    </w:p>
-    <w:p>
-      <w:pPr>
-        <w:pStyle w:val="Plattetekst"/>
+        <w:pStyle w:val="BodyText"/>
+        <w:numPr>
+          <w:ilvl w:val="0"/>
+          <w:numId w:val="1"/>
+        </w:numPr>
+        <w:rPr>
+          <w:b/>
+          <w:bCs/>
+        </w:rPr>
+      </w:pPr>
+      <w:r>
+        <w:rPr>
+          <w:b/>
+          <w:bCs/>
+        </w:rPr>
+        <w:t>Abdoulie Cham Mat#: 22713764</w:t>
+      </w:r>
+    </w:p>
+    <w:p>
+      <w:pPr>
+        <w:pStyle w:val="BodyText"/>
+        <w:rPr>
+          <w:b/>
+          <w:bCs/>
+        </w:rPr>
+      </w:pPr>
+    </w:p>
+    <w:p>
+      <w:pPr>
+        <w:pStyle w:val="BodyText"/>
         <w:rPr>
           <w:b/>
           <w:bCs/>
@@ -758,17 +778,17 @@
     <w:lsdException w:name="Unresolved Mention" w:semiHidden="1" w:unhideWhenUsed="1"/>
     <w:lsdException w:name="Smart Link" w:semiHidden="1" w:unhideWhenUsed="1"/>
   </w:latentStyles>
-  <w:style w:type="paragraph" w:default="1" w:styleId="Standaard">
+  <w:style w:type="paragraph" w:default="1" w:styleId="Normal">
     <w:name w:val="Normal"/>
     <w:qFormat/>
   </w:style>
-  <w:style w:type="character" w:default="1" w:styleId="Standaardalinea-lettertype">
+  <w:style w:type="character" w:default="1" w:styleId="DefaultParagraphFont">
     <w:name w:val="Default Paragraph Font"/>
     <w:uiPriority w:val="1"/>
     <w:semiHidden/>
     <w:unhideWhenUsed/>
   </w:style>
-  <w:style w:type="table" w:default="1" w:styleId="Standaardtabel">
+  <w:style w:type="table" w:default="1" w:styleId="TableNormal">
     <w:name w:val="Normal Table"/>
     <w:uiPriority w:val="99"/>
     <w:semiHidden/>
@@ -783,7 +803,7 @@
       </w:tblCellMar>
     </w:tblPr>
   </w:style>
-  <w:style w:type="numbering" w:default="1" w:styleId="Geenlijst">
+  <w:style w:type="numbering" w:default="1" w:styleId="NoList">
     <w:name w:val="No List"/>
     <w:uiPriority w:val="99"/>
     <w:semiHidden/>
@@ -791,8 +811,8 @@
   </w:style>
   <w:style w:type="paragraph" w:customStyle="1" w:styleId="Heading">
     <w:name w:val="Heading"/>
-    <w:basedOn w:val="Standaard"/>
-    <w:next w:val="Plattetekst"/>
+    <w:basedOn w:val="Normal"/>
+    <w:next w:val="BodyText"/>
     <w:qFormat/>
     <w:pPr>
       <w:keepNext/>
@@ -804,20 +824,20 @@
       <w:szCs w:val="28"/>
     </w:rPr>
   </w:style>
-  <w:style w:type="paragraph" w:styleId="Plattetekst">
+  <w:style w:type="paragraph" w:styleId="BodyText">
     <w:name w:val="Body Text"/>
-    <w:basedOn w:val="Standaard"/>
+    <w:basedOn w:val="Normal"/>
     <w:pPr>
       <w:spacing w:after="140" w:line="276" w:lineRule="auto"/>
     </w:pPr>
   </w:style>
-  <w:style w:type="paragraph" w:styleId="Lijst">
+  <w:style w:type="paragraph" w:styleId="List">
     <w:name w:val="List"/>
-    <w:basedOn w:val="Plattetekst"/>
-  </w:style>
-  <w:style w:type="paragraph" w:styleId="Bijschrift">
+    <w:basedOn w:val="BodyText"/>
+  </w:style>
+  <w:style w:type="paragraph" w:styleId="Caption">
     <w:name w:val="caption"/>
-    <w:basedOn w:val="Standaard"/>
+    <w:basedOn w:val="Normal"/>
     <w:qFormat/>
     <w:pPr>
       <w:suppressLineNumbers/>
@@ -830,16 +850,16 @@
   </w:style>
   <w:style w:type="paragraph" w:customStyle="1" w:styleId="Index">
     <w:name w:val="Index"/>
-    <w:basedOn w:val="Standaard"/>
+    <w:basedOn w:val="Normal"/>
     <w:qFormat/>
     <w:pPr>
       <w:suppressLineNumbers/>
     </w:pPr>
   </w:style>
-  <w:style w:type="paragraph" w:styleId="Titel">
+  <w:style w:type="paragraph" w:styleId="Title">
     <w:name w:val="Title"/>
     <w:basedOn w:val="Heading"/>
-    <w:next w:val="Plattetekst"/>
+    <w:next w:val="BodyText"/>
     <w:uiPriority w:val="10"/>
     <w:qFormat/>
     <w:pPr>
@@ -854,7 +874,7 @@
   </w:style>
   <w:style w:type="paragraph" w:customStyle="1" w:styleId="TableContents">
     <w:name w:val="Table Contents"/>
-    <w:basedOn w:val="Standaard"/>
+    <w:basedOn w:val="Normal"/>
     <w:qFormat/>
     <w:pPr>
       <w:widowControl w:val="0"/>

</xml_diff>

<commit_message>
adding my name, sheriff jallow
</commit_message>
<xml_diff>
--- a/Admin/students_names.docx
+++ b/Admin/students_names.docx
@@ -1,6 +1,6 @@
 
 <file path=word/document.xml><?xml version="1.0" encoding="utf-8"?>
-<w:document xmlns:wpc="http://schemas.microsoft.com/office/word/2010/wordprocessingCanvas" xmlns:cx="http://schemas.microsoft.com/office/drawing/2014/chartex" xmlns:cx1="http://schemas.microsoft.com/office/drawing/2015/9/8/chartex" xmlns:cx2="http://schemas.microsoft.com/office/drawing/2015/10/21/chartex" xmlns:cx3="http://schemas.microsoft.com/office/drawing/2016/5/9/chartex" xmlns:cx4="http://schemas.microsoft.com/office/drawing/2016/5/10/chartex" xmlns:cx5="http://schemas.microsoft.com/office/drawing/2016/5/11/chartex" xmlns:cx6="http://schemas.microsoft.com/office/drawing/2016/5/12/chartex" xmlns:cx7="http://schemas.microsoft.com/office/drawing/2016/5/13/chartex" xmlns:cx8="http://schemas.microsoft.com/office/drawing/2016/5/14/chartex" xmlns:mc="http://schemas.openxmlformats.org/markup-compatibility/2006" xmlns:aink="http://schemas.microsoft.com/office/drawing/2016/ink" xmlns:am3d="http://schemas.microsoft.com/office/drawing/2017/model3d" xmlns:o="urn:schemas-microsoft-com:office:office" xmlns:oel="http://schemas.microsoft.com/office/2019/extlst" xmlns:r="http://schemas.openxmlformats.org/officeDocument/2006/relationships" xmlns:m="http://schemas.openxmlformats.org/officeDocument/2006/math" xmlns:v="urn:schemas-microsoft-com:vml" xmlns:wp14="http://schemas.microsoft.com/office/word/2010/wordprocessingDrawing" xmlns:wp="http://schemas.openxmlformats.org/drawingml/2006/wordprocessingDrawing" xmlns:w10="urn:schemas-microsoft-com:office:word" xmlns:w="http://schemas.openxmlformats.org/wordprocessingml/2006/main" xmlns:w14="http://schemas.microsoft.com/office/word/2010/wordml" xmlns:w15="http://schemas.microsoft.com/office/word/2012/wordml" xmlns:w16cex="http://schemas.microsoft.com/office/word/2018/wordml/cex" xmlns:w16cid="http://schemas.microsoft.com/office/word/2016/wordml/cid" xmlns:w16="http://schemas.microsoft.com/office/word/2018/wordml" xmlns:w16du="http://schemas.microsoft.com/office/word/2023/wordml/word16du" xmlns:w16sdtdh="http://schemas.microsoft.com/office/word/2020/wordml/sdtdatahash" xmlns:w16sdtfl="http://schemas.microsoft.com/office/word/2024/wordml/sdtformatlock" xmlns:w16se="http://schemas.microsoft.com/office/word/2015/wordml/symex" xmlns:wpg="http://schemas.microsoft.com/office/word/2010/wordprocessingGroup" xmlns:wpi="http://schemas.microsoft.com/office/word/2010/wordprocessingInk" xmlns:wne="http://schemas.microsoft.com/office/word/2006/wordml" xmlns:wps="http://schemas.microsoft.com/office/word/2010/wordprocessingShape" mc:Ignorable="w14 w15 w16se w16cid w16 w16cex w16sdtdh w16sdtfl w16du wp14">
+<w:document xmlns:wpc="http://schemas.microsoft.com/office/word/2010/wordprocessingCanvas" xmlns:cx="http://schemas.microsoft.com/office/drawing/2014/chartex" xmlns:cx1="http://schemas.microsoft.com/office/drawing/2015/9/8/chartex" xmlns:cx2="http://schemas.microsoft.com/office/drawing/2015/10/21/chartex" xmlns:cx3="http://schemas.microsoft.com/office/drawing/2016/5/9/chartex" xmlns:cx4="http://schemas.microsoft.com/office/drawing/2016/5/10/chartex" xmlns:cx5="http://schemas.microsoft.com/office/drawing/2016/5/11/chartex" xmlns:cx6="http://schemas.microsoft.com/office/drawing/2016/5/12/chartex" xmlns:cx7="http://schemas.microsoft.com/office/drawing/2016/5/13/chartex" xmlns:cx8="http://schemas.microsoft.com/office/drawing/2016/5/14/chartex" xmlns:mc="http://schemas.openxmlformats.org/markup-compatibility/2006" xmlns:aink="http://schemas.microsoft.com/office/drawing/2016/ink" xmlns:am3d="http://schemas.microsoft.com/office/drawing/2017/model3d" xmlns:o="urn:schemas-microsoft-com:office:office" xmlns:r="http://schemas.openxmlformats.org/officeDocument/2006/relationships" xmlns:m="http://schemas.openxmlformats.org/officeDocument/2006/math" xmlns:v="urn:schemas-microsoft-com:vml" xmlns:wp14="http://schemas.microsoft.com/office/word/2010/wordprocessingDrawing" xmlns:wp="http://schemas.openxmlformats.org/drawingml/2006/wordprocessingDrawing" xmlns:w10="urn:schemas-microsoft-com:office:word" xmlns:w="http://schemas.openxmlformats.org/wordprocessingml/2006/main" xmlns:w14="http://schemas.microsoft.com/office/word/2010/wordml" xmlns:w15="http://schemas.microsoft.com/office/word/2012/wordml" xmlns:w16cex="http://schemas.microsoft.com/office/word/2018/wordml/cex" xmlns:w16cid="http://schemas.microsoft.com/office/word/2016/wordml/cid" xmlns:w16="http://schemas.microsoft.com/office/word/2018/wordml" xmlns:w16sdtdh="http://schemas.microsoft.com/office/word/2020/wordml/sdtdatahash" xmlns:w16se="http://schemas.microsoft.com/office/word/2015/wordml/symex" xmlns:wpg="http://schemas.microsoft.com/office/word/2010/wordprocessingGroup" xmlns:wpi="http://schemas.microsoft.com/office/word/2010/wordprocessingInk" xmlns:wne="http://schemas.microsoft.com/office/word/2006/wordml" xmlns:wps="http://schemas.microsoft.com/office/word/2010/wordprocessingShape" mc:Ignorable="w14 w15 w16se w16cid w16 w16cex w16sdtdh wp14">
   <w:body>
     <w:p>
       <w:pPr>
@@ -67,53 +67,84 @@
           <w:b/>
           <w:bCs/>
         </w:rPr>
-        <w:t xml:space="preserve">Abdoulie Ndong </w:t>
-      </w:r>
-      <w:proofErr w:type="gramStart"/>
-      <w:r>
-        <w:rPr>
-          <w:b/>
-          <w:bCs/>
-        </w:rPr>
-        <w:t>Mat#:</w:t>
-      </w:r>
-      <w:proofErr w:type="gramEnd"/>
-      <w:r>
-        <w:rPr>
-          <w:b/>
-          <w:bCs/>
-        </w:rPr>
-        <w:t xml:space="preserve"> 22713039</w:t>
-      </w:r>
-    </w:p>
-    <w:p>
-      <w:pPr>
-        <w:pStyle w:val="BodyText"/>
-        <w:numPr>
-          <w:ilvl w:val="0"/>
-          <w:numId w:val="1"/>
-        </w:numPr>
-        <w:rPr>
-          <w:b/>
-          <w:bCs/>
-        </w:rPr>
-      </w:pPr>
-      <w:r>
-        <w:rPr>
-          <w:b/>
-          <w:bCs/>
-        </w:rPr>
-        <w:t xml:space="preserve">Abou B </w:t>
-      </w:r>
-      <w:proofErr w:type="spellStart"/>
-      <w:r>
-        <w:rPr>
-          <w:b/>
-          <w:bCs/>
-        </w:rPr>
-        <w:t>Nyangado</w:t>
-      </w:r>
-      <w:proofErr w:type="spellEnd"/>
+        <w:t>Abdoulie Ndong Mat#: 22713039</w:t>
+      </w:r>
+    </w:p>
+    <w:p>
+      <w:pPr>
+        <w:pStyle w:val="BodyText"/>
+        <w:numPr>
+          <w:ilvl w:val="0"/>
+          <w:numId w:val="1"/>
+        </w:numPr>
+        <w:rPr>
+          <w:b/>
+          <w:bCs/>
+        </w:rPr>
+      </w:pPr>
+      <w:r>
+        <w:rPr>
+          <w:b/>
+          <w:bCs/>
+        </w:rPr>
+        <w:t>Abou B Nyangado Mat#: 22713047</w:t>
+      </w:r>
+    </w:p>
+    <w:p>
+      <w:pPr>
+        <w:pStyle w:val="BodyText"/>
+        <w:numPr>
+          <w:ilvl w:val="0"/>
+          <w:numId w:val="1"/>
+        </w:numPr>
+        <w:rPr>
+          <w:b/>
+          <w:bCs/>
+        </w:rPr>
+      </w:pPr>
+      <w:r>
+        <w:rPr>
+          <w:b/>
+          <w:bCs/>
+          <w:sz w:val="18"/>
+        </w:rPr>
+        <w:t>MANSOUR JALLOW MATT</w:t>
+      </w:r>
+      <w:r>
+        <w:rPr>
+          <w:b/>
+          <w:bCs/>
+        </w:rPr>
+        <w:t>:22713046</w:t>
+      </w:r>
+    </w:p>
+    <w:p>
+      <w:pPr>
+        <w:pStyle w:val="BodyText"/>
+        <w:numPr>
+          <w:ilvl w:val="0"/>
+          <w:numId w:val="1"/>
+        </w:numPr>
+        <w:rPr>
+          <w:b/>
+          <w:bCs/>
+        </w:rPr>
+      </w:pPr>
+      <w:r>
+        <w:rPr>
+          <w:b/>
+          <w:bCs/>
+          <w:sz w:val="18"/>
+        </w:rPr>
+        <w:t>Ebou Mendy Mat</w:t>
+      </w:r>
+      <w:r>
+        <w:rPr>
+          <w:b/>
+          <w:bCs/>
+        </w:rPr>
+        <w:t xml:space="preserve">#: </w:t>
+      </w:r>
       <w:r>
         <w:rPr>
           <w:b/>
@@ -121,21 +152,12 @@
         </w:rPr>
         <w:t xml:space="preserve"> </w:t>
       </w:r>
-      <w:proofErr w:type="gramStart"/>
-      <w:r>
-        <w:rPr>
-          <w:b/>
-          <w:bCs/>
-        </w:rPr>
-        <w:t>Mat#:</w:t>
-      </w:r>
-      <w:proofErr w:type="gramEnd"/>
-      <w:r>
-        <w:rPr>
-          <w:b/>
-          <w:bCs/>
-        </w:rPr>
-        <w:t xml:space="preserve"> 22713047</w:t>
+      <w:r>
+        <w:rPr>
+          <w:b/>
+          <w:bCs/>
+        </w:rPr>
+        <w:t>22613536</w:t>
       </w:r>
     </w:p>
     <w:p>
@@ -156,181 +178,48 @@
           <w:bCs/>
           <w:sz w:val="18"/>
         </w:rPr>
-        <w:t>MANSOUR JALLOW MATT</w:t>
-      </w:r>
-      <w:r>
-        <w:rPr>
-          <w:b/>
-          <w:bCs/>
-        </w:rPr>
-        <w:t>:22713046</w:t>
-      </w:r>
-    </w:p>
-    <w:p>
-      <w:pPr>
-        <w:pStyle w:val="BodyText"/>
-        <w:numPr>
-          <w:ilvl w:val="0"/>
-          <w:numId w:val="1"/>
-        </w:numPr>
-        <w:rPr>
-          <w:b/>
-          <w:bCs/>
-        </w:rPr>
-      </w:pPr>
-      <w:proofErr w:type="spellStart"/>
-      <w:r>
-        <w:rPr>
-          <w:b/>
-          <w:bCs/>
-          <w:sz w:val="18"/>
-        </w:rPr>
-        <w:t>Ebou</w:t>
-      </w:r>
-      <w:proofErr w:type="spellEnd"/>
-      <w:r>
-        <w:rPr>
-          <w:b/>
-          <w:bCs/>
-          <w:sz w:val="18"/>
-        </w:rPr>
-        <w:t xml:space="preserve"> Mendy </w:t>
-      </w:r>
-      <w:proofErr w:type="gramStart"/>
-      <w:r>
-        <w:rPr>
-          <w:b/>
-          <w:bCs/>
-          <w:sz w:val="18"/>
-        </w:rPr>
-        <w:t>Mat</w:t>
-      </w:r>
-      <w:r>
-        <w:rPr>
-          <w:b/>
-          <w:bCs/>
-        </w:rPr>
-        <w:t xml:space="preserve">#: </w:t>
-      </w:r>
-      <w:proofErr w:type="gramEnd"/>
-      <w:r>
-        <w:rPr>
-          <w:b/>
-          <w:bCs/>
-        </w:rPr>
-        <w:t xml:space="preserve"> </w:t>
-      </w:r>
-      <w:r>
-        <w:rPr>
-          <w:b/>
-          <w:bCs/>
-        </w:rPr>
-        <w:t>22613536</w:t>
-      </w:r>
-    </w:p>
-    <w:p>
-      <w:pPr>
-        <w:pStyle w:val="BodyText"/>
-        <w:numPr>
-          <w:ilvl w:val="0"/>
-          <w:numId w:val="1"/>
-        </w:numPr>
-        <w:rPr>
-          <w:b/>
-          <w:bCs/>
-        </w:rPr>
-      </w:pPr>
-      <w:r>
-        <w:rPr>
-          <w:b/>
-          <w:bCs/>
-          <w:sz w:val="18"/>
-        </w:rPr>
-        <w:t xml:space="preserve">Musa </w:t>
-      </w:r>
-      <w:proofErr w:type="gramStart"/>
-      <w:r>
-        <w:rPr>
-          <w:b/>
-          <w:bCs/>
-          <w:sz w:val="18"/>
-        </w:rPr>
-        <w:t>Jallow  Mat</w:t>
-      </w:r>
-      <w:proofErr w:type="gramEnd"/>
-      <w:r>
-        <w:rPr>
-          <w:b/>
-          <w:bCs/>
-          <w:sz w:val="18"/>
-        </w:rPr>
-        <w:t xml:space="preserve"> #: 22613535</w:t>
-      </w:r>
-    </w:p>
-    <w:p>
-      <w:pPr>
-        <w:pStyle w:val="BodyText"/>
-        <w:numPr>
-          <w:ilvl w:val="0"/>
-          <w:numId w:val="1"/>
-        </w:numPr>
-        <w:rPr>
-          <w:b/>
-          <w:bCs/>
-        </w:rPr>
-      </w:pPr>
-      <w:r>
-        <w:rPr>
-          <w:b/>
-          <w:bCs/>
-        </w:rPr>
-        <w:t xml:space="preserve">Sheriff Jammeh </w:t>
-      </w:r>
-      <w:proofErr w:type="gramStart"/>
-      <w:r>
-        <w:rPr>
-          <w:b/>
-          <w:bCs/>
-        </w:rPr>
-        <w:t>Mat#:</w:t>
-      </w:r>
-      <w:proofErr w:type="gramEnd"/>
-      <w:r>
-        <w:rPr>
-          <w:b/>
-          <w:bCs/>
-        </w:rPr>
-        <w:t xml:space="preserve"> 22713014</w:t>
-      </w:r>
-    </w:p>
-    <w:p>
-      <w:pPr>
-        <w:pStyle w:val="BodyText"/>
-        <w:numPr>
-          <w:ilvl w:val="0"/>
-          <w:numId w:val="1"/>
-        </w:numPr>
-        <w:rPr>
-          <w:b/>
-          <w:bCs/>
-        </w:rPr>
-      </w:pPr>
-      <w:r>
-        <w:rPr>
-          <w:b/>
-          <w:bCs/>
-        </w:rPr>
-        <w:t xml:space="preserve">Muhammed </w:t>
-      </w:r>
-      <w:proofErr w:type="gramStart"/>
-      <w:r>
-        <w:rPr>
-          <w:b/>
-          <w:bCs/>
-        </w:rPr>
-        <w:t>Kurubally  mat</w:t>
-      </w:r>
-      <w:proofErr w:type="gramEnd"/>
+        <w:t>Musa Jallow  Mat #: 22613535</w:t>
+      </w:r>
+    </w:p>
+    <w:p>
+      <w:pPr>
+        <w:pStyle w:val="BodyText"/>
+        <w:numPr>
+          <w:ilvl w:val="0"/>
+          <w:numId w:val="1"/>
+        </w:numPr>
+        <w:rPr>
+          <w:b/>
+          <w:bCs/>
+        </w:rPr>
+      </w:pPr>
+      <w:r>
+        <w:rPr>
+          <w:b/>
+          <w:bCs/>
+        </w:rPr>
+        <w:t>Sheriff Jammeh Mat#: 22713014</w:t>
+      </w:r>
+    </w:p>
+    <w:p>
+      <w:pPr>
+        <w:pStyle w:val="BodyText"/>
+        <w:numPr>
+          <w:ilvl w:val="0"/>
+          <w:numId w:val="1"/>
+        </w:numPr>
+        <w:rPr>
+          <w:b/>
+          <w:bCs/>
+        </w:rPr>
+      </w:pPr>
+      <w:r>
+        <w:rPr>
+          <w:b/>
+          <w:bCs/>
+        </w:rPr>
+        <w:t>Muhammed Kurubally  mat</w:t>
+      </w:r>
       <w:r>
         <w:rPr>
           <w:b/>
@@ -363,23 +252,7 @@
           <w:b/>
           <w:bCs/>
         </w:rPr>
-        <w:t xml:space="preserve">Abdoulie Cham </w:t>
-      </w:r>
-      <w:proofErr w:type="gramStart"/>
-      <w:r>
-        <w:rPr>
-          <w:b/>
-          <w:bCs/>
-        </w:rPr>
-        <w:t>Mat#:</w:t>
-      </w:r>
-      <w:proofErr w:type="gramEnd"/>
-      <w:r>
-        <w:rPr>
-          <w:b/>
-          <w:bCs/>
-        </w:rPr>
-        <w:t xml:space="preserve"> 22713764</w:t>
+        <w:t>Abdoulie Cham Mat#: 22713764</w:t>
       </w:r>
     </w:p>
     <w:p>
@@ -400,6 +273,26 @@
           <w:bCs/>
         </w:rPr>
         <w:t>John Syllah Mat#: 22713043</w:t>
+      </w:r>
+    </w:p>
+    <w:p>
+      <w:pPr>
+        <w:pStyle w:val="BodyText"/>
+        <w:numPr>
+          <w:ilvl w:val="0"/>
+          <w:numId w:val="1"/>
+        </w:numPr>
+        <w:rPr>
+          <w:b/>
+          <w:bCs/>
+        </w:rPr>
+      </w:pPr>
+      <w:r>
+        <w:rPr>
+          <w:b/>
+          <w:bCs/>
+        </w:rPr>
+        <w:t>Sheriff Jallow Mat# 22713024</w:t>
       </w:r>
     </w:p>
     <w:p>
@@ -432,7 +325,7 @@
 </file>
 
 <file path=word/numbering.xml><?xml version="1.0" encoding="utf-8"?>
-<w:numbering xmlns:wpc="http://schemas.microsoft.com/office/word/2010/wordprocessingCanvas" xmlns:cx="http://schemas.microsoft.com/office/drawing/2014/chartex" xmlns:cx1="http://schemas.microsoft.com/office/drawing/2015/9/8/chartex" xmlns:cx2="http://schemas.microsoft.com/office/drawing/2015/10/21/chartex" xmlns:cx3="http://schemas.microsoft.com/office/drawing/2016/5/9/chartex" xmlns:cx4="http://schemas.microsoft.com/office/drawing/2016/5/10/chartex" xmlns:cx5="http://schemas.microsoft.com/office/drawing/2016/5/11/chartex" xmlns:cx6="http://schemas.microsoft.com/office/drawing/2016/5/12/chartex" xmlns:cx7="http://schemas.microsoft.com/office/drawing/2016/5/13/chartex" xmlns:cx8="http://schemas.microsoft.com/office/drawing/2016/5/14/chartex" xmlns:mc="http://schemas.openxmlformats.org/markup-compatibility/2006" xmlns:aink="http://schemas.microsoft.com/office/drawing/2016/ink" xmlns:am3d="http://schemas.microsoft.com/office/drawing/2017/model3d" xmlns:o="urn:schemas-microsoft-com:office:office" xmlns:oel="http://schemas.microsoft.com/office/2019/extlst" xmlns:r="http://schemas.openxmlformats.org/officeDocument/2006/relationships" xmlns:m="http://schemas.openxmlformats.org/officeDocument/2006/math" xmlns:v="urn:schemas-microsoft-com:vml" xmlns:wp14="http://schemas.microsoft.com/office/word/2010/wordprocessingDrawing" xmlns:wp="http://schemas.openxmlformats.org/drawingml/2006/wordprocessingDrawing" xmlns:w10="urn:schemas-microsoft-com:office:word" xmlns:w="http://schemas.openxmlformats.org/wordprocessingml/2006/main" xmlns:w14="http://schemas.microsoft.com/office/word/2010/wordml" xmlns:w15="http://schemas.microsoft.com/office/word/2012/wordml" xmlns:w16cex="http://schemas.microsoft.com/office/word/2018/wordml/cex" xmlns:w16cid="http://schemas.microsoft.com/office/word/2016/wordml/cid" xmlns:w16="http://schemas.microsoft.com/office/word/2018/wordml" xmlns:w16du="http://schemas.microsoft.com/office/word/2023/wordml/word16du" xmlns:w16sdtdh="http://schemas.microsoft.com/office/word/2020/wordml/sdtdatahash" xmlns:w16sdtfl="http://schemas.microsoft.com/office/word/2024/wordml/sdtformatlock" xmlns:w16se="http://schemas.microsoft.com/office/word/2015/wordml/symex" xmlns:wpg="http://schemas.microsoft.com/office/word/2010/wordprocessingGroup" xmlns:wpi="http://schemas.microsoft.com/office/word/2010/wordprocessingInk" xmlns:wne="http://schemas.microsoft.com/office/word/2006/wordml" xmlns:wps="http://schemas.microsoft.com/office/word/2010/wordprocessingShape" mc:Ignorable="w14 w15 w16se w16cid w16 w16cex w16sdtdh w16sdtfl w16du wp14">
+<w:numbering xmlns:wpc="http://schemas.microsoft.com/office/word/2010/wordprocessingCanvas" xmlns:cx="http://schemas.microsoft.com/office/drawing/2014/chartex" xmlns:cx1="http://schemas.microsoft.com/office/drawing/2015/9/8/chartex" xmlns:cx2="http://schemas.microsoft.com/office/drawing/2015/10/21/chartex" xmlns:cx3="http://schemas.microsoft.com/office/drawing/2016/5/9/chartex" xmlns:cx4="http://schemas.microsoft.com/office/drawing/2016/5/10/chartex" xmlns:cx5="http://schemas.microsoft.com/office/drawing/2016/5/11/chartex" xmlns:cx6="http://schemas.microsoft.com/office/drawing/2016/5/12/chartex" xmlns:cx7="http://schemas.microsoft.com/office/drawing/2016/5/13/chartex" xmlns:cx8="http://schemas.microsoft.com/office/drawing/2016/5/14/chartex" xmlns:mc="http://schemas.openxmlformats.org/markup-compatibility/2006" xmlns:aink="http://schemas.microsoft.com/office/drawing/2016/ink" xmlns:am3d="http://schemas.microsoft.com/office/drawing/2017/model3d" xmlns:o="urn:schemas-microsoft-com:office:office" xmlns:r="http://schemas.openxmlformats.org/officeDocument/2006/relationships" xmlns:m="http://schemas.openxmlformats.org/officeDocument/2006/math" xmlns:v="urn:schemas-microsoft-com:vml" xmlns:wp14="http://schemas.microsoft.com/office/word/2010/wordprocessingDrawing" xmlns:wp="http://schemas.openxmlformats.org/drawingml/2006/wordprocessingDrawing" xmlns:w10="urn:schemas-microsoft-com:office:word" xmlns:w="http://schemas.openxmlformats.org/wordprocessingml/2006/main" xmlns:w14="http://schemas.microsoft.com/office/word/2010/wordml" xmlns:w15="http://schemas.microsoft.com/office/word/2012/wordml" xmlns:w16cex="http://schemas.microsoft.com/office/word/2018/wordml/cex" xmlns:w16cid="http://schemas.microsoft.com/office/word/2016/wordml/cid" xmlns:w16="http://schemas.microsoft.com/office/word/2018/wordml" xmlns:w16sdtdh="http://schemas.microsoft.com/office/word/2020/wordml/sdtdatahash" xmlns:w16se="http://schemas.microsoft.com/office/word/2015/wordml/symex" xmlns:wpg="http://schemas.microsoft.com/office/word/2010/wordprocessingGroup" xmlns:wpi="http://schemas.microsoft.com/office/word/2010/wordprocessingInk" xmlns:wne="http://schemas.microsoft.com/office/word/2006/wordml" xmlns:wps="http://schemas.microsoft.com/office/word/2010/wordprocessingShape" mc:Ignorable="w14 w15 w16se w16cid w16 w16cex w16sdtdh wp14">
   <w:abstractNum w:abstractNumId="0" w15:restartNumberingAfterBreak="0">
     <w:nsid w:val="71C97DA2"/>
     <w:multiLevelType w:val="hybridMultilevel"/>
@@ -523,14 +416,14 @@
       </w:pPr>
     </w:lvl>
   </w:abstractNum>
-  <w:num w:numId="1" w16cid:durableId="1416592207">
+  <w:num w:numId="1">
     <w:abstractNumId w:val="0"/>
   </w:num>
 </w:numbering>
 </file>
 
 <file path=word/styles.xml><?xml version="1.0" encoding="utf-8"?>
-<w:styles xmlns:mc="http://schemas.openxmlformats.org/markup-compatibility/2006" xmlns:r="http://schemas.openxmlformats.org/officeDocument/2006/relationships" xmlns:w="http://schemas.openxmlformats.org/wordprocessingml/2006/main" xmlns:w14="http://schemas.microsoft.com/office/word/2010/wordml" xmlns:w15="http://schemas.microsoft.com/office/word/2012/wordml" xmlns:w16cex="http://schemas.microsoft.com/office/word/2018/wordml/cex" xmlns:w16cid="http://schemas.microsoft.com/office/word/2016/wordml/cid" xmlns:w16="http://schemas.microsoft.com/office/word/2018/wordml" xmlns:w16du="http://schemas.microsoft.com/office/word/2023/wordml/word16du" xmlns:w16sdtdh="http://schemas.microsoft.com/office/word/2020/wordml/sdtdatahash" xmlns:w16sdtfl="http://schemas.microsoft.com/office/word/2024/wordml/sdtformatlock" xmlns:w16se="http://schemas.microsoft.com/office/word/2015/wordml/symex" mc:Ignorable="w14 w15 w16se w16cid w16 w16cex w16sdtdh w16sdtfl w16du">
+<w:styles xmlns:mc="http://schemas.openxmlformats.org/markup-compatibility/2006" xmlns:r="http://schemas.openxmlformats.org/officeDocument/2006/relationships" xmlns:w="http://schemas.openxmlformats.org/wordprocessingml/2006/main" xmlns:w14="http://schemas.microsoft.com/office/word/2010/wordml" xmlns:w15="http://schemas.microsoft.com/office/word/2012/wordml" xmlns:w16cex="http://schemas.microsoft.com/office/word/2018/wordml/cex" xmlns:w16cid="http://schemas.microsoft.com/office/word/2016/wordml/cid" xmlns:w16="http://schemas.microsoft.com/office/word/2018/wordml" xmlns:w16sdtdh="http://schemas.microsoft.com/office/word/2020/wordml/sdtdatahash" xmlns:w16se="http://schemas.microsoft.com/office/word/2015/wordml/symex" mc:Ignorable="w14 w15 w16se w16cid w16 w16cex w16sdtdh">
   <w:docDefaults>
     <w:rPrDefault>
       <w:rPr>

</xml_diff>

<commit_message>
Add Alasan Bility to students names
</commit_message>
<xml_diff>
--- a/Admin/students_names.docx
+++ b/Admin/students_names.docx
@@ -1,6 +1,6 @@
 
 <file path=word/document.xml><?xml version="1.0" encoding="utf-8"?>
-<w:document xmlns:wpc="http://schemas.microsoft.com/office/word/2010/wordprocessingCanvas" xmlns:cx="http://schemas.microsoft.com/office/drawing/2014/chartex" xmlns:cx1="http://schemas.microsoft.com/office/drawing/2015/9/8/chartex" xmlns:cx2="http://schemas.microsoft.com/office/drawing/2015/10/21/chartex" xmlns:cx3="http://schemas.microsoft.com/office/drawing/2016/5/9/chartex" xmlns:cx4="http://schemas.microsoft.com/office/drawing/2016/5/10/chartex" xmlns:cx5="http://schemas.microsoft.com/office/drawing/2016/5/11/chartex" xmlns:cx6="http://schemas.microsoft.com/office/drawing/2016/5/12/chartex" xmlns:cx7="http://schemas.microsoft.com/office/drawing/2016/5/13/chartex" xmlns:cx8="http://schemas.microsoft.com/office/drawing/2016/5/14/chartex" xmlns:mc="http://schemas.openxmlformats.org/markup-compatibility/2006" xmlns:aink="http://schemas.microsoft.com/office/drawing/2016/ink" xmlns:am3d="http://schemas.microsoft.com/office/drawing/2017/model3d" xmlns:o="urn:schemas-microsoft-com:office:office" xmlns:r="http://schemas.openxmlformats.org/officeDocument/2006/relationships" xmlns:m="http://schemas.openxmlformats.org/officeDocument/2006/math" xmlns:v="urn:schemas-microsoft-com:vml" xmlns:wp14="http://schemas.microsoft.com/office/word/2010/wordprocessingDrawing" xmlns:wp="http://schemas.openxmlformats.org/drawingml/2006/wordprocessingDrawing" xmlns:w10="urn:schemas-microsoft-com:office:word" xmlns:w="http://schemas.openxmlformats.org/wordprocessingml/2006/main" xmlns:w14="http://schemas.microsoft.com/office/word/2010/wordml" xmlns:w15="http://schemas.microsoft.com/office/word/2012/wordml" xmlns:w16cex="http://schemas.microsoft.com/office/word/2018/wordml/cex" xmlns:w16cid="http://schemas.microsoft.com/office/word/2016/wordml/cid" xmlns:w16="http://schemas.microsoft.com/office/word/2018/wordml" xmlns:w16sdtdh="http://schemas.microsoft.com/office/word/2020/wordml/sdtdatahash" xmlns:w16se="http://schemas.microsoft.com/office/word/2015/wordml/symex" xmlns:wpg="http://schemas.microsoft.com/office/word/2010/wordprocessingGroup" xmlns:wpi="http://schemas.microsoft.com/office/word/2010/wordprocessingInk" xmlns:wne="http://schemas.microsoft.com/office/word/2006/wordml" xmlns:wps="http://schemas.microsoft.com/office/word/2010/wordprocessingShape" mc:Ignorable="w14 w15 w16se w16cid w16 w16cex w16sdtdh wp14">
+<w:document xmlns:wpc="http://schemas.microsoft.com/office/word/2010/wordprocessingCanvas" xmlns:cx="http://schemas.microsoft.com/office/drawing/2014/chartex" xmlns:cx1="http://schemas.microsoft.com/office/drawing/2015/9/8/chartex" xmlns:cx2="http://schemas.microsoft.com/office/drawing/2015/10/21/chartex" xmlns:cx3="http://schemas.microsoft.com/office/drawing/2016/5/9/chartex" xmlns:cx4="http://schemas.microsoft.com/office/drawing/2016/5/10/chartex" xmlns:cx5="http://schemas.microsoft.com/office/drawing/2016/5/11/chartex" xmlns:cx6="http://schemas.microsoft.com/office/drawing/2016/5/12/chartex" xmlns:cx7="http://schemas.microsoft.com/office/drawing/2016/5/13/chartex" xmlns:cx8="http://schemas.microsoft.com/office/drawing/2016/5/14/chartex" xmlns:mc="http://schemas.openxmlformats.org/markup-compatibility/2006" xmlns:aink="http://schemas.microsoft.com/office/drawing/2016/ink" xmlns:am3d="http://schemas.microsoft.com/office/drawing/2017/model3d" xmlns:o="urn:schemas-microsoft-com:office:office" xmlns:oel="http://schemas.microsoft.com/office/2019/extlst" xmlns:r="http://schemas.openxmlformats.org/officeDocument/2006/relationships" xmlns:m="http://schemas.openxmlformats.org/officeDocument/2006/math" xmlns:v="urn:schemas-microsoft-com:vml" xmlns:wp14="http://schemas.microsoft.com/office/word/2010/wordprocessingDrawing" xmlns:wp="http://schemas.openxmlformats.org/drawingml/2006/wordprocessingDrawing" xmlns:w10="urn:schemas-microsoft-com:office:word" xmlns:w="http://schemas.openxmlformats.org/wordprocessingml/2006/main" xmlns:w14="http://schemas.microsoft.com/office/word/2010/wordml" xmlns:w15="http://schemas.microsoft.com/office/word/2012/wordml" xmlns:w16cex="http://schemas.microsoft.com/office/word/2018/wordml/cex" xmlns:w16cid="http://schemas.microsoft.com/office/word/2016/wordml/cid" xmlns:w16="http://schemas.microsoft.com/office/word/2018/wordml" xmlns:w16sdtdh="http://schemas.microsoft.com/office/word/2020/wordml/sdtdatahash" xmlns:w16se="http://schemas.microsoft.com/office/word/2015/wordml/symex" xmlns:wpg="http://schemas.microsoft.com/office/word/2010/wordprocessingGroup" xmlns:wpi="http://schemas.microsoft.com/office/word/2010/wordprocessingInk" xmlns:wne="http://schemas.microsoft.com/office/word/2006/wordml" xmlns:wps="http://schemas.microsoft.com/office/word/2010/wordprocessingShape" mc:Ignorable="w14 w15 w16se w16cid w16 w16cex w16sdtdh wp14">
   <w:body>
     <w:p>
       <w:pPr>
@@ -19,12 +19,21 @@
         </w:numPr>
         <w:jc w:val="left"/>
       </w:pPr>
+      <w:proofErr w:type="spellStart"/>
       <w:r>
         <w:rPr>
           <w:sz w:val="24"/>
           <w:szCs w:val="24"/>
         </w:rPr>
-        <w:t>Banno Bah      matt: 22713033</w:t>
+        <w:t>Banno</w:t>
+      </w:r>
+      <w:proofErr w:type="spellEnd"/>
+      <w:r>
+        <w:rPr>
+          <w:sz w:val="24"/>
+          <w:szCs w:val="24"/>
+        </w:rPr>
+        <w:t xml:space="preserve"> Bah      matt: 22713033</w:t>
       </w:r>
       <w:r>
         <w:t xml:space="preserve"> </w:t>
@@ -42,12 +51,21 @@
           <w:bCs/>
         </w:rPr>
       </w:pPr>
-      <w:r>
-        <w:rPr>
-          <w:b/>
-          <w:bCs/>
-        </w:rPr>
-        <w:t>Saikou T. Ceesay Mat#: 22713020</w:t>
+      <w:proofErr w:type="spellStart"/>
+      <w:r>
+        <w:rPr>
+          <w:b/>
+          <w:bCs/>
+        </w:rPr>
+        <w:t>Saikou</w:t>
+      </w:r>
+      <w:proofErr w:type="spellEnd"/>
+      <w:r>
+        <w:rPr>
+          <w:b/>
+          <w:bCs/>
+        </w:rPr>
+        <w:t xml:space="preserve"> T. Ceesay Mat#: 22713020</w:t>
       </w:r>
     </w:p>
     <w:p>
@@ -87,7 +105,23 @@
           <w:b/>
           <w:bCs/>
         </w:rPr>
-        <w:t>Abou B Nyangado Mat#: 22713047</w:t>
+        <w:t xml:space="preserve">Abou B </w:t>
+      </w:r>
+      <w:proofErr w:type="spellStart"/>
+      <w:r>
+        <w:rPr>
+          <w:b/>
+          <w:bCs/>
+        </w:rPr>
+        <w:t>Nyangado</w:t>
+      </w:r>
+      <w:proofErr w:type="spellEnd"/>
+      <w:r>
+        <w:rPr>
+          <w:b/>
+          <w:bCs/>
+        </w:rPr>
+        <w:t xml:space="preserve"> Mat#: 22713047</w:t>
       </w:r>
     </w:p>
     <w:p>
@@ -130,13 +164,23 @@
           <w:bCs/>
         </w:rPr>
       </w:pPr>
+      <w:proofErr w:type="spellStart"/>
       <w:r>
         <w:rPr>
           <w:b/>
           <w:bCs/>
           <w:sz w:val="18"/>
         </w:rPr>
-        <w:t>Ebou Mendy Mat</w:t>
+        <w:t>Ebou</w:t>
+      </w:r>
+      <w:proofErr w:type="spellEnd"/>
+      <w:r>
+        <w:rPr>
+          <w:b/>
+          <w:bCs/>
+          <w:sz w:val="18"/>
+        </w:rPr>
+        <w:t xml:space="preserve"> Mendy Mat</w:t>
       </w:r>
       <w:r>
         <w:rPr>
@@ -178,7 +222,35 @@
           <w:bCs/>
           <w:sz w:val="18"/>
         </w:rPr>
-        <w:t>Musa Jallow  Mat #: 22613535</w:t>
+        <w:t xml:space="preserve">Musa </w:t>
+      </w:r>
+      <w:proofErr w:type="spellStart"/>
+      <w:proofErr w:type="gramStart"/>
+      <w:r>
+        <w:rPr>
+          <w:b/>
+          <w:bCs/>
+          <w:sz w:val="18"/>
+        </w:rPr>
+        <w:t>Jallow</w:t>
+      </w:r>
+      <w:proofErr w:type="spellEnd"/>
+      <w:r>
+        <w:rPr>
+          <w:b/>
+          <w:bCs/>
+          <w:sz w:val="18"/>
+        </w:rPr>
+        <w:t xml:space="preserve">  Mat</w:t>
+      </w:r>
+      <w:proofErr w:type="gramEnd"/>
+      <w:r>
+        <w:rPr>
+          <w:b/>
+          <w:bCs/>
+          <w:sz w:val="18"/>
+        </w:rPr>
+        <w:t xml:space="preserve"> #: 22613535</w:t>
       </w:r>
     </w:p>
     <w:p>
@@ -218,8 +290,26 @@
           <w:b/>
           <w:bCs/>
         </w:rPr>
-        <w:t>Muhammed Kurubally  mat</w:t>
-      </w:r>
+        <w:t xml:space="preserve">Muhammed </w:t>
+      </w:r>
+      <w:proofErr w:type="spellStart"/>
+      <w:proofErr w:type="gramStart"/>
+      <w:r>
+        <w:rPr>
+          <w:b/>
+          <w:bCs/>
+        </w:rPr>
+        <w:t>Kurubally</w:t>
+      </w:r>
+      <w:proofErr w:type="spellEnd"/>
+      <w:r>
+        <w:rPr>
+          <w:b/>
+          <w:bCs/>
+        </w:rPr>
+        <w:t xml:space="preserve">  mat</w:t>
+      </w:r>
+      <w:proofErr w:type="gramEnd"/>
       <w:r>
         <w:rPr>
           <w:b/>
@@ -272,7 +362,23 @@
           <w:b/>
           <w:bCs/>
         </w:rPr>
-        <w:t>John Syllah Mat#: 22713043</w:t>
+        <w:t xml:space="preserve">John </w:t>
+      </w:r>
+      <w:proofErr w:type="spellStart"/>
+      <w:r>
+        <w:rPr>
+          <w:b/>
+          <w:bCs/>
+        </w:rPr>
+        <w:t>Syllah</w:t>
+      </w:r>
+      <w:proofErr w:type="spellEnd"/>
+      <w:r>
+        <w:rPr>
+          <w:b/>
+          <w:bCs/>
+        </w:rPr>
+        <w:t xml:space="preserve"> Mat#: 22713043</w:t>
       </w:r>
     </w:p>
     <w:p>
@@ -292,7 +398,68 @@
           <w:b/>
           <w:bCs/>
         </w:rPr>
-        <w:t>Sheriff Jallow Mat# 22713024</w:t>
+        <w:t xml:space="preserve">Sheriff </w:t>
+      </w:r>
+      <w:proofErr w:type="spellStart"/>
+      <w:r>
+        <w:rPr>
+          <w:b/>
+          <w:bCs/>
+        </w:rPr>
+        <w:t>Jallow</w:t>
+      </w:r>
+      <w:proofErr w:type="spellEnd"/>
+      <w:r>
+        <w:rPr>
+          <w:b/>
+          <w:bCs/>
+        </w:rPr>
+        <w:t xml:space="preserve"> Mat# 22713024</w:t>
+      </w:r>
+    </w:p>
+    <w:p>
+      <w:pPr>
+        <w:pStyle w:val="BodyText"/>
+        <w:numPr>
+          <w:ilvl w:val="0"/>
+          <w:numId w:val="1"/>
+        </w:numPr>
+        <w:rPr>
+          <w:b/>
+          <w:bCs/>
+        </w:rPr>
+      </w:pPr>
+      <w:proofErr w:type="spellStart"/>
+      <w:r>
+        <w:rPr>
+          <w:b/>
+          <w:bCs/>
+        </w:rPr>
+        <w:t>Alasan</w:t>
+      </w:r>
+      <w:proofErr w:type="spellEnd"/>
+      <w:r>
+        <w:rPr>
+          <w:b/>
+          <w:bCs/>
+        </w:rPr>
+        <w:t xml:space="preserve"> </w:t>
+      </w:r>
+      <w:proofErr w:type="spellStart"/>
+      <w:r>
+        <w:rPr>
+          <w:b/>
+          <w:bCs/>
+        </w:rPr>
+        <w:t>Bility</w:t>
+      </w:r>
+      <w:proofErr w:type="spellEnd"/>
+      <w:r>
+        <w:rPr>
+          <w:b/>
+          <w:bCs/>
+        </w:rPr>
+        <w:t xml:space="preserve"> Mat#22713765</w:t>
       </w:r>
     </w:p>
     <w:p>
@@ -325,7 +492,7 @@
 </file>
 
 <file path=word/numbering.xml><?xml version="1.0" encoding="utf-8"?>
-<w:numbering xmlns:wpc="http://schemas.microsoft.com/office/word/2010/wordprocessingCanvas" xmlns:cx="http://schemas.microsoft.com/office/drawing/2014/chartex" xmlns:cx1="http://schemas.microsoft.com/office/drawing/2015/9/8/chartex" xmlns:cx2="http://schemas.microsoft.com/office/drawing/2015/10/21/chartex" xmlns:cx3="http://schemas.microsoft.com/office/drawing/2016/5/9/chartex" xmlns:cx4="http://schemas.microsoft.com/office/drawing/2016/5/10/chartex" xmlns:cx5="http://schemas.microsoft.com/office/drawing/2016/5/11/chartex" xmlns:cx6="http://schemas.microsoft.com/office/drawing/2016/5/12/chartex" xmlns:cx7="http://schemas.microsoft.com/office/drawing/2016/5/13/chartex" xmlns:cx8="http://schemas.microsoft.com/office/drawing/2016/5/14/chartex" xmlns:mc="http://schemas.openxmlformats.org/markup-compatibility/2006" xmlns:aink="http://schemas.microsoft.com/office/drawing/2016/ink" xmlns:am3d="http://schemas.microsoft.com/office/drawing/2017/model3d" xmlns:o="urn:schemas-microsoft-com:office:office" xmlns:r="http://schemas.openxmlformats.org/officeDocument/2006/relationships" xmlns:m="http://schemas.openxmlformats.org/officeDocument/2006/math" xmlns:v="urn:schemas-microsoft-com:vml" xmlns:wp14="http://schemas.microsoft.com/office/word/2010/wordprocessingDrawing" xmlns:wp="http://schemas.openxmlformats.org/drawingml/2006/wordprocessingDrawing" xmlns:w10="urn:schemas-microsoft-com:office:word" xmlns:w="http://schemas.openxmlformats.org/wordprocessingml/2006/main" xmlns:w14="http://schemas.microsoft.com/office/word/2010/wordml" xmlns:w15="http://schemas.microsoft.com/office/word/2012/wordml" xmlns:w16cex="http://schemas.microsoft.com/office/word/2018/wordml/cex" xmlns:w16cid="http://schemas.microsoft.com/office/word/2016/wordml/cid" xmlns:w16="http://schemas.microsoft.com/office/word/2018/wordml" xmlns:w16sdtdh="http://schemas.microsoft.com/office/word/2020/wordml/sdtdatahash" xmlns:w16se="http://schemas.microsoft.com/office/word/2015/wordml/symex" xmlns:wpg="http://schemas.microsoft.com/office/word/2010/wordprocessingGroup" xmlns:wpi="http://schemas.microsoft.com/office/word/2010/wordprocessingInk" xmlns:wne="http://schemas.microsoft.com/office/word/2006/wordml" xmlns:wps="http://schemas.microsoft.com/office/word/2010/wordprocessingShape" mc:Ignorable="w14 w15 w16se w16cid w16 w16cex w16sdtdh wp14">
+<w:numbering xmlns:wpc="http://schemas.microsoft.com/office/word/2010/wordprocessingCanvas" xmlns:cx="http://schemas.microsoft.com/office/drawing/2014/chartex" xmlns:cx1="http://schemas.microsoft.com/office/drawing/2015/9/8/chartex" xmlns:cx2="http://schemas.microsoft.com/office/drawing/2015/10/21/chartex" xmlns:cx3="http://schemas.microsoft.com/office/drawing/2016/5/9/chartex" xmlns:cx4="http://schemas.microsoft.com/office/drawing/2016/5/10/chartex" xmlns:cx5="http://schemas.microsoft.com/office/drawing/2016/5/11/chartex" xmlns:cx6="http://schemas.microsoft.com/office/drawing/2016/5/12/chartex" xmlns:cx7="http://schemas.microsoft.com/office/drawing/2016/5/13/chartex" xmlns:cx8="http://schemas.microsoft.com/office/drawing/2016/5/14/chartex" xmlns:mc="http://schemas.openxmlformats.org/markup-compatibility/2006" xmlns:aink="http://schemas.microsoft.com/office/drawing/2016/ink" xmlns:am3d="http://schemas.microsoft.com/office/drawing/2017/model3d" xmlns:o="urn:schemas-microsoft-com:office:office" xmlns:oel="http://schemas.microsoft.com/office/2019/extlst" xmlns:r="http://schemas.openxmlformats.org/officeDocument/2006/relationships" xmlns:m="http://schemas.openxmlformats.org/officeDocument/2006/math" xmlns:v="urn:schemas-microsoft-com:vml" xmlns:wp14="http://schemas.microsoft.com/office/word/2010/wordprocessingDrawing" xmlns:wp="http://schemas.openxmlformats.org/drawingml/2006/wordprocessingDrawing" xmlns:w10="urn:schemas-microsoft-com:office:word" xmlns:w="http://schemas.openxmlformats.org/wordprocessingml/2006/main" xmlns:w14="http://schemas.microsoft.com/office/word/2010/wordml" xmlns:w15="http://schemas.microsoft.com/office/word/2012/wordml" xmlns:w16cex="http://schemas.microsoft.com/office/word/2018/wordml/cex" xmlns:w16cid="http://schemas.microsoft.com/office/word/2016/wordml/cid" xmlns:w16="http://schemas.microsoft.com/office/word/2018/wordml" xmlns:w16sdtdh="http://schemas.microsoft.com/office/word/2020/wordml/sdtdatahash" xmlns:w16se="http://schemas.microsoft.com/office/word/2015/wordml/symex" xmlns:wpg="http://schemas.microsoft.com/office/word/2010/wordprocessingGroup" xmlns:wpi="http://schemas.microsoft.com/office/word/2010/wordprocessingInk" xmlns:wne="http://schemas.microsoft.com/office/word/2006/wordml" xmlns:wps="http://schemas.microsoft.com/office/word/2010/wordprocessingShape" mc:Ignorable="w14 w15 w16se w16cid w16 w16cex w16sdtdh wp14">
   <w:abstractNum w:abstractNumId="0" w15:restartNumberingAfterBreak="0">
     <w:nsid w:val="71C97DA2"/>
     <w:multiLevelType w:val="hybridMultilevel"/>
@@ -416,7 +583,7 @@
       </w:pPr>
     </w:lvl>
   </w:abstractNum>
-  <w:num w:numId="1">
+  <w:num w:numId="1" w16cid:durableId="1975215413">
     <w:abstractNumId w:val="0"/>
   </w:num>
 </w:numbering>

</xml_diff>

<commit_message>
my name added to the file
</commit_message>
<xml_diff>
--- a/Admin/students_names.docx
+++ b/Admin/students_names.docx
@@ -1,16 +1,12 @@
 
 <file path=word/document.xml><?xml version="1.0" encoding="utf-8"?>
-<w:document xmlns:o="urn:schemas-microsoft-com:office:office" xmlns:r="http://schemas.openxmlformats.org/officeDocument/2006/relationships" xmlns:v="urn:schemas-microsoft-com:vml" xmlns:w="http://schemas.openxmlformats.org/wordprocessingml/2006/main" xmlns:w10="urn:schemas-microsoft-com:office:word" xmlns:wp="http://schemas.openxmlformats.org/drawingml/2006/wordprocessingDrawing" xmlns:wps="http://schemas.microsoft.com/office/word/2010/wordprocessingShape" xmlns:wpg="http://schemas.microsoft.com/office/word/2010/wordprocessingGroup" xmlns:mc="http://schemas.openxmlformats.org/markup-compatibility/2006" xmlns:wp14="http://schemas.microsoft.com/office/word/2010/wordprocessingDrawing" xmlns:w14="http://schemas.microsoft.com/office/word/2010/wordml" xmlns:w15="http://schemas.microsoft.com/office/word/2012/wordml" mc:Ignorable="w14 wp14 w15">
+<w:document xmlns:wpc="http://schemas.microsoft.com/office/word/2010/wordprocessingCanvas" xmlns:cx="http://schemas.microsoft.com/office/drawing/2014/chartex" xmlns:cx1="http://schemas.microsoft.com/office/drawing/2015/9/8/chartex" xmlns:mc="http://schemas.openxmlformats.org/markup-compatibility/2006" xmlns:o="urn:schemas-microsoft-com:office:office" xmlns:r="http://schemas.openxmlformats.org/officeDocument/2006/relationships" xmlns:m="http://schemas.openxmlformats.org/officeDocument/2006/math" xmlns:v="urn:schemas-microsoft-com:vml" xmlns:wp14="http://schemas.microsoft.com/office/word/2010/wordprocessingDrawing" xmlns:wp="http://schemas.openxmlformats.org/drawingml/2006/wordprocessingDrawing" xmlns:w10="urn:schemas-microsoft-com:office:word" xmlns:w="http://schemas.openxmlformats.org/wordprocessingml/2006/main" xmlns:w14="http://schemas.microsoft.com/office/word/2010/wordml" xmlns:w15="http://schemas.microsoft.com/office/word/2012/wordml" xmlns:w16se="http://schemas.microsoft.com/office/word/2015/wordml/symex" xmlns:wpg="http://schemas.microsoft.com/office/word/2010/wordprocessingGroup" xmlns:wpi="http://schemas.microsoft.com/office/word/2010/wordprocessingInk" xmlns:wne="http://schemas.microsoft.com/office/word/2006/wordml" xmlns:wps="http://schemas.microsoft.com/office/word/2010/wordprocessingShape" mc:Ignorable="w14 w15 w16se wp14">
   <w:body>
     <w:p>
       <w:pPr>
         <w:pStyle w:val="Title"/>
-        <w:spacing w:before="240" w:after="120"/>
-        <w:jc w:val="center"/>
-        <w:rPr/>
-      </w:pPr>
-      <w:r>
-        <w:rPr/>
+      </w:pPr>
+      <w:r>
         <w:t>List of participants</w:t>
       </w:r>
     </w:p>
@@ -21,11 +17,11 @@
           <w:ilvl w:val="0"/>
           <w:numId w:val="1"/>
         </w:numPr>
-        <w:jc w:val="start"/>
-        <w:rPr>
-          <w:rFonts w:ascii="Amiri" w:hAnsi="Amiri"/>
-          <w:b w:val="false"/>
-          <w:bCs w:val="false"/>
+        <w:jc w:val="left"/>
+        <w:rPr>
+          <w:rFonts w:ascii="Amiri" w:hAnsi="Amiri"/>
+          <w:b w:val="0"/>
+          <w:bCs w:val="0"/>
           <w:sz w:val="24"/>
           <w:szCs w:val="24"/>
         </w:rPr>
@@ -33,8 +29,8 @@
       <w:r>
         <w:rPr>
           <w:rFonts w:ascii="Amiri" w:hAnsi="Amiri"/>
-          <w:b w:val="false"/>
-          <w:bCs w:val="false"/>
+          <w:b w:val="0"/>
+          <w:bCs w:val="0"/>
           <w:sz w:val="24"/>
           <w:szCs w:val="24"/>
         </w:rPr>
@@ -48,22 +44,13 @@
           <w:ilvl w:val="0"/>
           <w:numId w:val="1"/>
         </w:numPr>
-        <w:jc w:val="start"/>
-        <w:rPr>
-          <w:rFonts w:ascii="Amiri" w:hAnsi="Amiri"/>
-          <w:b w:val="false"/>
-          <w:bCs w:val="false"/>
-          <w:sz w:val="24"/>
-          <w:szCs w:val="24"/>
-        </w:rPr>
-      </w:pPr>
-      <w:r>
-        <w:rPr>
-          <w:rFonts w:ascii="Amiri" w:hAnsi="Amiri"/>
-          <w:b w:val="false"/>
-          <w:bCs w:val="false"/>
-          <w:sz w:val="24"/>
-          <w:szCs w:val="24"/>
+        <w:rPr>
+          <w:rFonts w:ascii="Amiri" w:hAnsi="Amiri"/>
+        </w:rPr>
+      </w:pPr>
+      <w:r>
+        <w:rPr>
+          <w:rFonts w:ascii="Amiri" w:hAnsi="Amiri"/>
         </w:rPr>
         <w:t>Saikou T. Ceesay Mat#: 22713020</w:t>
       </w:r>
@@ -75,22 +62,13 @@
           <w:ilvl w:val="0"/>
           <w:numId w:val="1"/>
         </w:numPr>
-        <w:jc w:val="start"/>
-        <w:rPr>
-          <w:rFonts w:ascii="Amiri" w:hAnsi="Amiri"/>
-          <w:b w:val="false"/>
-          <w:bCs w:val="false"/>
-          <w:sz w:val="24"/>
-          <w:szCs w:val="24"/>
-        </w:rPr>
-      </w:pPr>
-      <w:r>
-        <w:rPr>
-          <w:rFonts w:ascii="Amiri" w:hAnsi="Amiri"/>
-          <w:b w:val="false"/>
-          <w:bCs w:val="false"/>
-          <w:sz w:val="24"/>
-          <w:szCs w:val="24"/>
+        <w:rPr>
+          <w:rFonts w:ascii="Amiri" w:hAnsi="Amiri"/>
+        </w:rPr>
+      </w:pPr>
+      <w:r>
+        <w:rPr>
+          <w:rFonts w:ascii="Amiri" w:hAnsi="Amiri"/>
         </w:rPr>
         <w:t>Abdoulie Ndong Mat#: 22713039</w:t>
       </w:r>
@@ -102,22 +80,13 @@
           <w:ilvl w:val="0"/>
           <w:numId w:val="1"/>
         </w:numPr>
-        <w:jc w:val="start"/>
-        <w:rPr>
-          <w:rFonts w:ascii="Amiri" w:hAnsi="Amiri"/>
-          <w:b w:val="false"/>
-          <w:bCs w:val="false"/>
-          <w:sz w:val="24"/>
-          <w:szCs w:val="24"/>
-        </w:rPr>
-      </w:pPr>
-      <w:r>
-        <w:rPr>
-          <w:rFonts w:ascii="Amiri" w:hAnsi="Amiri"/>
-          <w:b w:val="false"/>
-          <w:bCs w:val="false"/>
-          <w:sz w:val="24"/>
-          <w:szCs w:val="24"/>
+        <w:rPr>
+          <w:rFonts w:ascii="Amiri" w:hAnsi="Amiri"/>
+        </w:rPr>
+      </w:pPr>
+      <w:r>
+        <w:rPr>
+          <w:rFonts w:ascii="Amiri" w:hAnsi="Amiri"/>
         </w:rPr>
         <w:t>Abou B Nyangado Mat#: 22713047</w:t>
       </w:r>
@@ -129,22 +98,13 @@
           <w:ilvl w:val="0"/>
           <w:numId w:val="1"/>
         </w:numPr>
-        <w:jc w:val="start"/>
-        <w:rPr>
-          <w:rFonts w:ascii="Amiri" w:hAnsi="Amiri"/>
-          <w:b w:val="false"/>
-          <w:bCs w:val="false"/>
-          <w:sz w:val="24"/>
-          <w:szCs w:val="24"/>
-        </w:rPr>
-      </w:pPr>
-      <w:r>
-        <w:rPr>
-          <w:rFonts w:ascii="Amiri" w:hAnsi="Amiri"/>
-          <w:b w:val="false"/>
-          <w:bCs w:val="false"/>
-          <w:sz w:val="24"/>
-          <w:szCs w:val="24"/>
+        <w:rPr>
+          <w:rFonts w:ascii="Amiri" w:hAnsi="Amiri"/>
+        </w:rPr>
+      </w:pPr>
+      <w:r>
+        <w:rPr>
+          <w:rFonts w:ascii="Amiri" w:hAnsi="Amiri"/>
         </w:rPr>
         <w:t>MANSOUR JALLOW MATT:22713046</w:t>
       </w:r>
@@ -156,22 +116,13 @@
           <w:ilvl w:val="0"/>
           <w:numId w:val="1"/>
         </w:numPr>
-        <w:jc w:val="start"/>
-        <w:rPr>
-          <w:rFonts w:ascii="Amiri" w:hAnsi="Amiri"/>
-          <w:b w:val="false"/>
-          <w:bCs w:val="false"/>
-          <w:sz w:val="24"/>
-          <w:szCs w:val="24"/>
-        </w:rPr>
-      </w:pPr>
-      <w:r>
-        <w:rPr>
-          <w:rFonts w:ascii="Amiri" w:hAnsi="Amiri"/>
-          <w:b w:val="false"/>
-          <w:bCs w:val="false"/>
-          <w:sz w:val="24"/>
-          <w:szCs w:val="24"/>
+        <w:rPr>
+          <w:rFonts w:ascii="Amiri" w:hAnsi="Amiri"/>
+        </w:rPr>
+      </w:pPr>
+      <w:r>
+        <w:rPr>
+          <w:rFonts w:ascii="Amiri" w:hAnsi="Amiri"/>
         </w:rPr>
         <w:t>Ebou Mendy Mat#:  22613536</w:t>
       </w:r>
@@ -183,22 +134,13 @@
           <w:ilvl w:val="0"/>
           <w:numId w:val="1"/>
         </w:numPr>
-        <w:jc w:val="start"/>
-        <w:rPr>
-          <w:rFonts w:ascii="Amiri" w:hAnsi="Amiri"/>
-          <w:b w:val="false"/>
-          <w:bCs w:val="false"/>
-          <w:sz w:val="24"/>
-          <w:szCs w:val="24"/>
-        </w:rPr>
-      </w:pPr>
-      <w:r>
-        <w:rPr>
-          <w:rFonts w:ascii="Amiri" w:hAnsi="Amiri"/>
-          <w:b w:val="false"/>
-          <w:bCs w:val="false"/>
-          <w:sz w:val="24"/>
-          <w:szCs w:val="24"/>
+        <w:rPr>
+          <w:rFonts w:ascii="Amiri" w:hAnsi="Amiri"/>
+        </w:rPr>
+      </w:pPr>
+      <w:r>
+        <w:rPr>
+          <w:rFonts w:ascii="Amiri" w:hAnsi="Amiri"/>
         </w:rPr>
         <w:t>Musa Jallow  Mat #: 22613535</w:t>
       </w:r>
@@ -210,49 +152,37 @@
           <w:ilvl w:val="0"/>
           <w:numId w:val="1"/>
         </w:numPr>
-        <w:jc w:val="start"/>
-        <w:rPr>
-          <w:rFonts w:ascii="Amiri" w:hAnsi="Amiri"/>
-          <w:b w:val="false"/>
-          <w:bCs w:val="false"/>
-          <w:sz w:val="24"/>
-          <w:szCs w:val="24"/>
-        </w:rPr>
-      </w:pPr>
-      <w:r>
-        <w:rPr>
-          <w:rFonts w:ascii="Amiri" w:hAnsi="Amiri"/>
-          <w:b w:val="false"/>
-          <w:bCs w:val="false"/>
-          <w:sz w:val="24"/>
-          <w:szCs w:val="24"/>
-        </w:rPr>
-        <w:t>Sheriff Jammeh Mat#: 22713014</w:t>
-      </w:r>
-    </w:p>
-    <w:p>
-      <w:pPr>
-        <w:pStyle w:val="BodyText"/>
-        <w:numPr>
-          <w:ilvl w:val="0"/>
-          <w:numId w:val="1"/>
-        </w:numPr>
-        <w:jc w:val="start"/>
-        <w:rPr>
-          <w:rFonts w:ascii="Amiri" w:hAnsi="Amiri"/>
-          <w:b w:val="false"/>
-          <w:bCs w:val="false"/>
-          <w:sz w:val="24"/>
-          <w:szCs w:val="24"/>
-        </w:rPr>
-      </w:pPr>
-      <w:r>
-        <w:rPr>
-          <w:rFonts w:ascii="Amiri" w:hAnsi="Amiri"/>
-          <w:b w:val="false"/>
-          <w:bCs w:val="false"/>
-          <w:sz w:val="24"/>
-          <w:szCs w:val="24"/>
+        <w:rPr>
+          <w:rFonts w:ascii="Amiri" w:hAnsi="Amiri"/>
+        </w:rPr>
+      </w:pPr>
+      <w:r>
+        <w:rPr>
+          <w:rFonts w:ascii="Amiri" w:hAnsi="Amiri"/>
+        </w:rPr>
+        <w:t xml:space="preserve">Sheriff Jammeh Mat#: </w:t>
+      </w:r>
+      <w:r>
+        <w:rPr>
+          <w:rFonts w:ascii="Amiri" w:hAnsi="Amiri"/>
+        </w:rPr>
+        <w:t>22713014</w:t>
+      </w:r>
+    </w:p>
+    <w:p>
+      <w:pPr>
+        <w:pStyle w:val="BodyText"/>
+        <w:numPr>
+          <w:ilvl w:val="0"/>
+          <w:numId w:val="1"/>
+        </w:numPr>
+        <w:rPr>
+          <w:rFonts w:ascii="Amiri" w:hAnsi="Amiri"/>
+        </w:rPr>
+      </w:pPr>
+      <w:r>
+        <w:rPr>
+          <w:rFonts w:ascii="Amiri" w:hAnsi="Amiri"/>
         </w:rPr>
         <w:t>Muhammed Kurubally  mat#: 22713022</w:t>
       </w:r>
@@ -264,96 +194,49 @@
           <w:ilvl w:val="0"/>
           <w:numId w:val="1"/>
         </w:numPr>
-        <w:jc w:val="start"/>
-        <w:rPr>
-          <w:rFonts w:ascii="Amiri" w:hAnsi="Amiri"/>
-          <w:b w:val="false"/>
-          <w:bCs w:val="false"/>
-          <w:sz w:val="24"/>
-          <w:szCs w:val="24"/>
-        </w:rPr>
-      </w:pPr>
-      <w:r>
-        <w:rPr>
-          <w:rFonts w:ascii="Amiri" w:hAnsi="Amiri"/>
-          <w:b w:val="false"/>
-          <w:bCs w:val="false"/>
-          <w:sz w:val="24"/>
-          <w:szCs w:val="24"/>
-        </w:rPr>
-        <w:t xml:space="preserve"> </w:t>
-      </w:r>
-      <w:r>
-        <w:rPr>
-          <w:rFonts w:ascii="Amiri" w:hAnsi="Amiri"/>
-          <w:b w:val="false"/>
-          <w:bCs w:val="false"/>
-          <w:sz w:val="24"/>
-          <w:szCs w:val="24"/>
-        </w:rPr>
-        <w:t>Abdoulie Cham Mat#: 22713764</w:t>
-      </w:r>
-    </w:p>
-    <w:p>
-      <w:pPr>
-        <w:pStyle w:val="BodyText"/>
-        <w:numPr>
-          <w:ilvl w:val="0"/>
-          <w:numId w:val="1"/>
-        </w:numPr>
-        <w:jc w:val="start"/>
-        <w:rPr>
-          <w:rFonts w:ascii="Amiri" w:hAnsi="Amiri"/>
-          <w:b w:val="false"/>
-          <w:bCs w:val="false"/>
-          <w:sz w:val="24"/>
-          <w:szCs w:val="24"/>
-        </w:rPr>
-      </w:pPr>
-      <w:r>
-        <w:rPr>
-          <w:rFonts w:ascii="Amiri" w:hAnsi="Amiri"/>
-          <w:b w:val="false"/>
-          <w:bCs w:val="false"/>
-          <w:sz w:val="24"/>
-          <w:szCs w:val="24"/>
-        </w:rPr>
-        <w:t xml:space="preserve"> </w:t>
-      </w:r>
-      <w:r>
-        <w:rPr>
-          <w:rFonts w:ascii="Amiri" w:hAnsi="Amiri"/>
-          <w:b w:val="false"/>
-          <w:bCs w:val="false"/>
-          <w:sz w:val="24"/>
-          <w:szCs w:val="24"/>
-        </w:rPr>
-        <w:t>John Syllah Mat#: 22713043</w:t>
-      </w:r>
-    </w:p>
-    <w:p>
-      <w:pPr>
-        <w:pStyle w:val="BodyText"/>
-        <w:numPr>
-          <w:ilvl w:val="0"/>
-          <w:numId w:val="1"/>
-        </w:numPr>
-        <w:jc w:val="start"/>
-        <w:rPr>
-          <w:rFonts w:ascii="Amiri" w:hAnsi="Amiri"/>
-          <w:b w:val="false"/>
-          <w:bCs w:val="false"/>
-          <w:sz w:val="24"/>
-          <w:szCs w:val="24"/>
-        </w:rPr>
-      </w:pPr>
-      <w:r>
-        <w:rPr>
-          <w:rFonts w:ascii="Amiri" w:hAnsi="Amiri"/>
-          <w:b w:val="false"/>
-          <w:bCs w:val="false"/>
-          <w:sz w:val="24"/>
-          <w:szCs w:val="24"/>
+        <w:rPr>
+          <w:rFonts w:ascii="Amiri" w:hAnsi="Amiri"/>
+        </w:rPr>
+      </w:pPr>
+      <w:r>
+        <w:rPr>
+          <w:rFonts w:ascii="Amiri" w:hAnsi="Amiri"/>
+        </w:rPr>
+        <w:t xml:space="preserve"> Abdoulie Cham Mat#: 22713764</w:t>
+      </w:r>
+    </w:p>
+    <w:p>
+      <w:pPr>
+        <w:pStyle w:val="BodyText"/>
+        <w:numPr>
+          <w:ilvl w:val="0"/>
+          <w:numId w:val="1"/>
+        </w:numPr>
+        <w:rPr>
+          <w:rFonts w:ascii="Amiri" w:hAnsi="Amiri"/>
+        </w:rPr>
+      </w:pPr>
+      <w:r>
+        <w:rPr>
+          <w:rFonts w:ascii="Amiri" w:hAnsi="Amiri"/>
+        </w:rPr>
+        <w:t xml:space="preserve"> John Syllah Mat#: 22713043</w:t>
+      </w:r>
+    </w:p>
+    <w:p>
+      <w:pPr>
+        <w:pStyle w:val="BodyText"/>
+        <w:numPr>
+          <w:ilvl w:val="0"/>
+          <w:numId w:val="1"/>
+        </w:numPr>
+        <w:rPr>
+          <w:rFonts w:ascii="Amiri" w:hAnsi="Amiri"/>
+        </w:rPr>
+      </w:pPr>
+      <w:r>
+        <w:rPr>
+          <w:rFonts w:ascii="Amiri" w:hAnsi="Amiri"/>
         </w:rPr>
         <w:t>Sheriff Jallow Mat# 22713024</w:t>
       </w:r>
@@ -365,173 +248,178 @@
           <w:ilvl w:val="0"/>
           <w:numId w:val="1"/>
         </w:numPr>
-        <w:spacing w:before="0" w:after="140"/>
-        <w:jc w:val="start"/>
-        <w:rPr>
-          <w:rFonts w:ascii="Amiri" w:hAnsi="Amiri"/>
-          <w:b w:val="false"/>
-          <w:bCs w:val="false"/>
-          <w:sz w:val="24"/>
-          <w:szCs w:val="24"/>
-        </w:rPr>
-      </w:pPr>
-      <w:r>
-        <w:rPr>
-          <w:rFonts w:ascii="Amiri" w:hAnsi="Amiri"/>
-          <w:b w:val="false"/>
-          <w:bCs w:val="false"/>
-          <w:sz w:val="24"/>
-          <w:szCs w:val="24"/>
+        <w:rPr>
+          <w:rFonts w:ascii="Amiri" w:hAnsi="Amiri"/>
+        </w:rPr>
+      </w:pPr>
+      <w:r>
+        <w:rPr>
+          <w:rFonts w:ascii="Amiri" w:hAnsi="Amiri"/>
         </w:rPr>
         <w:t>Musa Kebbeh Mat#: 22713026</w:t>
       </w:r>
     </w:p>
+    <w:p>
+      <w:pPr>
+        <w:pStyle w:val="BodyText"/>
+        <w:numPr>
+          <w:ilvl w:val="0"/>
+          <w:numId w:val="1"/>
+        </w:numPr>
+        <w:rPr>
+          <w:rFonts w:ascii="Amiri" w:hAnsi="Amiri"/>
+        </w:rPr>
+      </w:pPr>
+      <w:r>
+        <w:rPr>
+          <w:rFonts w:ascii="Amiri" w:hAnsi="Amiri"/>
+        </w:rPr>
+        <w:t>Ebrima S Bah Mat# 22613519</w:t>
+      </w:r>
+      <w:bookmarkStart w:id="0" w:name="_GoBack"/>
+      <w:bookmarkEnd w:id="0"/>
+    </w:p>
     <w:sectPr>
-      <w:type w:val="nextPage"/>
       <w:pgSz w:w="12240" w:h="15840"/>
-      <w:pgMar w:left="1134" w:right="1134" w:gutter="0" w:header="0" w:top="1134" w:footer="0" w:bottom="1134"/>
-      <w:pgNumType w:fmt="decimal"/>
-      <w:formProt w:val="false"/>
-      <w:textDirection w:val="lrTb"/>
-      <w:docGrid w:type="default" w:linePitch="100" w:charSpace="0"/>
+      <w:pgMar w:top="1134" w:right="1134" w:bottom="1134" w:left="1134" w:header="0" w:footer="0" w:gutter="0"/>
+      <w:cols w:space="720"/>
+      <w:formProt w:val="0"/>
+      <w:docGrid w:linePitch="100"/>
     </w:sectPr>
   </w:body>
 </w:document>
 </file>
 
 <file path=word/numbering.xml><?xml version="1.0" encoding="utf-8"?>
-<w:numbering xmlns:w="http://schemas.openxmlformats.org/wordprocessingml/2006/main" xmlns:o="urn:schemas-microsoft-com:office:office" xmlns:r="http://schemas.openxmlformats.org/officeDocument/2006/relationships" xmlns:v="urn:schemas-microsoft-com:vml" xmlns:mc="http://schemas.openxmlformats.org/markup-compatibility/2006" xmlns:w14="http://schemas.microsoft.com/office/word/2010/wordml" mc:Ignorable="w14">
-  <w:abstractNum w:abstractNumId="1">
+<w:numbering xmlns:wpc="http://schemas.microsoft.com/office/word/2010/wordprocessingCanvas" xmlns:cx="http://schemas.microsoft.com/office/drawing/2014/chartex" xmlns:cx1="http://schemas.microsoft.com/office/drawing/2015/9/8/chartex" xmlns:mc="http://schemas.openxmlformats.org/markup-compatibility/2006" xmlns:o="urn:schemas-microsoft-com:office:office" xmlns:r="http://schemas.openxmlformats.org/officeDocument/2006/relationships" xmlns:m="http://schemas.openxmlformats.org/officeDocument/2006/math" xmlns:v="urn:schemas-microsoft-com:vml" xmlns:wp14="http://schemas.microsoft.com/office/word/2010/wordprocessingDrawing" xmlns:wp="http://schemas.openxmlformats.org/drawingml/2006/wordprocessingDrawing" xmlns:w10="urn:schemas-microsoft-com:office:word" xmlns:w="http://schemas.openxmlformats.org/wordprocessingml/2006/main" xmlns:w14="http://schemas.microsoft.com/office/word/2010/wordml" xmlns:w15="http://schemas.microsoft.com/office/word/2012/wordml" xmlns:w16se="http://schemas.microsoft.com/office/word/2015/wordml/symex" xmlns:wpg="http://schemas.microsoft.com/office/word/2010/wordprocessingGroup" xmlns:wpi="http://schemas.microsoft.com/office/word/2010/wordprocessingInk" xmlns:wne="http://schemas.microsoft.com/office/word/2006/wordml" xmlns:wps="http://schemas.microsoft.com/office/word/2010/wordprocessingShape" mc:Ignorable="w14 w15 w16se wp14">
+  <w:abstractNum w:abstractNumId="0" w15:restartNumberingAfterBreak="0">
+    <w:nsid w:val="568625D1"/>
+    <w:multiLevelType w:val="multilevel"/>
+    <w:tmpl w:val="1D62C194"/>
     <w:lvl w:ilvl="0">
       <w:start w:val="1"/>
       <w:numFmt w:val="decimal"/>
       <w:lvlText w:val="%1."/>
-      <w:lvlJc w:val="start"/>
+      <w:lvlJc w:val="left"/>
       <w:pPr>
         <w:tabs>
           <w:tab w:val="num" w:pos="720"/>
         </w:tabs>
-        <w:ind w:start="720" w:hanging="360"/>
-      </w:pPr>
-      <w:rPr/>
+        <w:ind w:left="720" w:hanging="360"/>
+      </w:pPr>
     </w:lvl>
     <w:lvl w:ilvl="1">
       <w:start w:val="1"/>
       <w:numFmt w:val="decimal"/>
       <w:lvlText w:val="%2."/>
-      <w:lvlJc w:val="start"/>
+      <w:lvlJc w:val="left"/>
       <w:pPr>
         <w:tabs>
           <w:tab w:val="num" w:pos="1080"/>
         </w:tabs>
-        <w:ind w:start="1080" w:hanging="360"/>
-      </w:pPr>
-      <w:rPr/>
+        <w:ind w:left="1080" w:hanging="360"/>
+      </w:pPr>
     </w:lvl>
     <w:lvl w:ilvl="2">
       <w:start w:val="1"/>
       <w:numFmt w:val="decimal"/>
       <w:lvlText w:val="%3."/>
-      <w:lvlJc w:val="start"/>
+      <w:lvlJc w:val="left"/>
       <w:pPr>
         <w:tabs>
           <w:tab w:val="num" w:pos="1440"/>
         </w:tabs>
-        <w:ind w:start="1440" w:hanging="360"/>
-      </w:pPr>
-      <w:rPr/>
+        <w:ind w:left="1440" w:hanging="360"/>
+      </w:pPr>
     </w:lvl>
     <w:lvl w:ilvl="3">
       <w:start w:val="1"/>
       <w:numFmt w:val="decimal"/>
       <w:lvlText w:val="%4."/>
-      <w:lvlJc w:val="start"/>
+      <w:lvlJc w:val="left"/>
       <w:pPr>
         <w:tabs>
           <w:tab w:val="num" w:pos="1800"/>
         </w:tabs>
-        <w:ind w:start="1800" w:hanging="360"/>
-      </w:pPr>
-      <w:rPr/>
+        <w:ind w:left="1800" w:hanging="360"/>
+      </w:pPr>
     </w:lvl>
     <w:lvl w:ilvl="4">
       <w:start w:val="1"/>
       <w:numFmt w:val="decimal"/>
       <w:lvlText w:val="%5."/>
-      <w:lvlJc w:val="start"/>
+      <w:lvlJc w:val="left"/>
       <w:pPr>
         <w:tabs>
           <w:tab w:val="num" w:pos="2160"/>
         </w:tabs>
-        <w:ind w:start="2160" w:hanging="360"/>
-      </w:pPr>
-      <w:rPr/>
+        <w:ind w:left="2160" w:hanging="360"/>
+      </w:pPr>
     </w:lvl>
     <w:lvl w:ilvl="5">
       <w:start w:val="1"/>
       <w:numFmt w:val="decimal"/>
       <w:lvlText w:val="%6."/>
-      <w:lvlJc w:val="start"/>
+      <w:lvlJc w:val="left"/>
       <w:pPr>
         <w:tabs>
           <w:tab w:val="num" w:pos="2520"/>
         </w:tabs>
-        <w:ind w:start="2520" w:hanging="360"/>
-      </w:pPr>
-      <w:rPr/>
+        <w:ind w:left="2520" w:hanging="360"/>
+      </w:pPr>
     </w:lvl>
     <w:lvl w:ilvl="6">
       <w:start w:val="1"/>
       <w:numFmt w:val="decimal"/>
       <w:lvlText w:val="%7."/>
-      <w:lvlJc w:val="start"/>
+      <w:lvlJc w:val="left"/>
       <w:pPr>
         <w:tabs>
           <w:tab w:val="num" w:pos="2880"/>
         </w:tabs>
-        <w:ind w:start="2880" w:hanging="360"/>
-      </w:pPr>
-      <w:rPr/>
+        <w:ind w:left="2880" w:hanging="360"/>
+      </w:pPr>
     </w:lvl>
     <w:lvl w:ilvl="7">
       <w:start w:val="1"/>
       <w:numFmt w:val="decimal"/>
       <w:lvlText w:val="%8."/>
-      <w:lvlJc w:val="start"/>
+      <w:lvlJc w:val="left"/>
       <w:pPr>
         <w:tabs>
           <w:tab w:val="num" w:pos="3240"/>
         </w:tabs>
-        <w:ind w:start="3240" w:hanging="360"/>
-      </w:pPr>
-      <w:rPr/>
+        <w:ind w:left="3240" w:hanging="360"/>
+      </w:pPr>
     </w:lvl>
     <w:lvl w:ilvl="8">
       <w:start w:val="1"/>
       <w:numFmt w:val="decimal"/>
       <w:lvlText w:val="%9."/>
-      <w:lvlJc w:val="start"/>
+      <w:lvlJc w:val="left"/>
       <w:pPr>
         <w:tabs>
           <w:tab w:val="num" w:pos="3600"/>
         </w:tabs>
-        <w:ind w:start="3600" w:hanging="360"/>
-      </w:pPr>
-      <w:rPr/>
+        <w:ind w:left="3600" w:hanging="360"/>
+      </w:pPr>
     </w:lvl>
   </w:abstractNum>
-  <w:abstractNum w:abstractNumId="2">
+  <w:abstractNum w:abstractNumId="1" w15:restartNumberingAfterBreak="0">
+    <w:nsid w:val="66405F1A"/>
+    <w:multiLevelType w:val="multilevel"/>
+    <w:tmpl w:val="8C9496E8"/>
     <w:lvl w:ilvl="0">
       <w:start w:val="1"/>
       <w:numFmt w:val="none"/>
       <w:suff w:val="nothing"/>
       <w:lvlText w:val=""/>
-      <w:lvlJc w:val="start"/>
+      <w:lvlJc w:val="left"/>
       <w:pPr>
         <w:tabs>
           <w:tab w:val="num" w:pos="0"/>
         </w:tabs>
-        <w:ind w:start="0" w:hanging="0"/>
+        <w:ind w:left="0" w:firstLine="0"/>
       </w:pPr>
     </w:lvl>
     <w:lvl w:ilvl="1">
@@ -539,12 +427,12 @@
       <w:numFmt w:val="none"/>
       <w:suff w:val="nothing"/>
       <w:lvlText w:val=""/>
-      <w:lvlJc w:val="start"/>
+      <w:lvlJc w:val="left"/>
       <w:pPr>
         <w:tabs>
           <w:tab w:val="num" w:pos="0"/>
         </w:tabs>
-        <w:ind w:start="0" w:hanging="0"/>
+        <w:ind w:left="0" w:firstLine="0"/>
       </w:pPr>
     </w:lvl>
     <w:lvl w:ilvl="2">
@@ -552,12 +440,12 @@
       <w:numFmt w:val="none"/>
       <w:suff w:val="nothing"/>
       <w:lvlText w:val=""/>
-      <w:lvlJc w:val="start"/>
+      <w:lvlJc w:val="left"/>
       <w:pPr>
         <w:tabs>
           <w:tab w:val="num" w:pos="0"/>
         </w:tabs>
-        <w:ind w:start="0" w:hanging="0"/>
+        <w:ind w:left="0" w:firstLine="0"/>
       </w:pPr>
     </w:lvl>
     <w:lvl w:ilvl="3">
@@ -565,12 +453,12 @@
       <w:numFmt w:val="none"/>
       <w:suff w:val="nothing"/>
       <w:lvlText w:val=""/>
-      <w:lvlJc w:val="start"/>
+      <w:lvlJc w:val="left"/>
       <w:pPr>
         <w:tabs>
           <w:tab w:val="num" w:pos="0"/>
         </w:tabs>
-        <w:ind w:start="0" w:hanging="0"/>
+        <w:ind w:left="0" w:firstLine="0"/>
       </w:pPr>
     </w:lvl>
     <w:lvl w:ilvl="4">
@@ -578,12 +466,12 @@
       <w:numFmt w:val="none"/>
       <w:suff w:val="nothing"/>
       <w:lvlText w:val=""/>
-      <w:lvlJc w:val="start"/>
+      <w:lvlJc w:val="left"/>
       <w:pPr>
         <w:tabs>
           <w:tab w:val="num" w:pos="0"/>
         </w:tabs>
-        <w:ind w:start="0" w:hanging="0"/>
+        <w:ind w:left="0" w:firstLine="0"/>
       </w:pPr>
     </w:lvl>
     <w:lvl w:ilvl="5">
@@ -591,12 +479,12 @@
       <w:numFmt w:val="none"/>
       <w:suff w:val="nothing"/>
       <w:lvlText w:val=""/>
-      <w:lvlJc w:val="start"/>
+      <w:lvlJc w:val="left"/>
       <w:pPr>
         <w:tabs>
           <w:tab w:val="num" w:pos="0"/>
         </w:tabs>
-        <w:ind w:start="0" w:hanging="0"/>
+        <w:ind w:left="0" w:firstLine="0"/>
       </w:pPr>
     </w:lvl>
     <w:lvl w:ilvl="6">
@@ -604,12 +492,12 @@
       <w:numFmt w:val="none"/>
       <w:suff w:val="nothing"/>
       <w:lvlText w:val=""/>
-      <w:lvlJc w:val="start"/>
+      <w:lvlJc w:val="left"/>
       <w:pPr>
         <w:tabs>
           <w:tab w:val="num" w:pos="0"/>
         </w:tabs>
-        <w:ind w:start="0" w:hanging="0"/>
+        <w:ind w:left="0" w:firstLine="0"/>
       </w:pPr>
     </w:lvl>
     <w:lvl w:ilvl="7">
@@ -617,12 +505,12 @@
       <w:numFmt w:val="none"/>
       <w:suff w:val="nothing"/>
       <w:lvlText w:val=""/>
-      <w:lvlJc w:val="start"/>
+      <w:lvlJc w:val="left"/>
       <w:pPr>
         <w:tabs>
           <w:tab w:val="num" w:pos="0"/>
         </w:tabs>
-        <w:ind w:start="0" w:hanging="0"/>
+        <w:ind w:left="0" w:firstLine="0"/>
       </w:pPr>
     </w:lvl>
     <w:lvl w:ilvl="8">
@@ -630,30 +518,30 @@
       <w:numFmt w:val="none"/>
       <w:suff w:val="nothing"/>
       <w:lvlText w:val=""/>
-      <w:lvlJc w:val="start"/>
+      <w:lvlJc w:val="left"/>
       <w:pPr>
         <w:tabs>
           <w:tab w:val="num" w:pos="0"/>
         </w:tabs>
-        <w:ind w:start="0" w:hanging="0"/>
+        <w:ind w:left="0" w:firstLine="0"/>
       </w:pPr>
     </w:lvl>
   </w:abstractNum>
   <w:num w:numId="1">
-    <w:abstractNumId w:val="1"/>
+    <w:abstractNumId w:val="0"/>
   </w:num>
   <w:num w:numId="2">
-    <w:abstractNumId w:val="2"/>
+    <w:abstractNumId w:val="1"/>
   </w:num>
 </w:numbering>
 </file>
 
 <file path=word/styles.xml><?xml version="1.0" encoding="utf-8"?>
-<w:styles xmlns:w="http://schemas.openxmlformats.org/wordprocessingml/2006/main" xmlns:w14="http://schemas.microsoft.com/office/word/2010/wordml" xmlns:mc="http://schemas.openxmlformats.org/markup-compatibility/2006" mc:Ignorable="w14">
+<w:styles xmlns:mc="http://schemas.openxmlformats.org/markup-compatibility/2006" xmlns:r="http://schemas.openxmlformats.org/officeDocument/2006/relationships" xmlns:w="http://schemas.openxmlformats.org/wordprocessingml/2006/main" xmlns:w14="http://schemas.microsoft.com/office/word/2010/wordml" xmlns:w15="http://schemas.microsoft.com/office/word/2012/wordml" xmlns:w16se="http://schemas.microsoft.com/office/word/2015/wordml/symex" mc:Ignorable="w14 w15 w16se">
   <w:docDefaults>
     <w:rPrDefault>
       <w:rPr>
-        <w:rFonts w:ascii="Liberation Serif" w:hAnsi="Liberation Serif" w:eastAsia="Noto Serif CJK SC" w:cs="Noto Sans Devanagari"/>
+        <w:rFonts w:ascii="Liberation Serif" w:eastAsia="Noto Serif CJK SC" w:hAnsi="Liberation Serif" w:cs="Noto Sans Devanagari"/>
         <w:kern w:val="2"/>
         <w:sz w:val="24"/>
         <w:szCs w:val="24"/>
@@ -662,21 +550,21 @@
     </w:rPrDefault>
     <w:pPrDefault>
       <w:pPr>
-        <w:suppressAutoHyphens w:val="true"/>
+        <w:suppressAutoHyphens/>
       </w:pPr>
     </w:pPrDefault>
   </w:docDefaults>
-  <w:latentStyles w:defLockedState="0" w:defUIPriority="99" w:defSemiHidden="0" w:defUnhideWhenUsed="0" w:defQFormat="0" w:count="376">
+  <w:latentStyles w:defLockedState="0" w:defUIPriority="99" w:defSemiHidden="0" w:defUnhideWhenUsed="0" w:defQFormat="0" w:count="371">
     <w:lsdException w:name="Normal" w:uiPriority="0" w:qFormat="1"/>
     <w:lsdException w:name="heading 1" w:uiPriority="9" w:qFormat="1"/>
-    <w:lsdException w:name="heading 2" w:uiPriority="9" w:semiHidden="1" w:unhideWhenUsed="1" w:qFormat="1"/>
-    <w:lsdException w:name="heading 3" w:uiPriority="9" w:semiHidden="1" w:unhideWhenUsed="1" w:qFormat="1"/>
-    <w:lsdException w:name="heading 4" w:uiPriority="9" w:semiHidden="1" w:unhideWhenUsed="1" w:qFormat="1"/>
-    <w:lsdException w:name="heading 5" w:uiPriority="9" w:semiHidden="1" w:unhideWhenUsed="1" w:qFormat="1"/>
-    <w:lsdException w:name="heading 6" w:uiPriority="9" w:semiHidden="1" w:unhideWhenUsed="1" w:qFormat="1"/>
-    <w:lsdException w:name="heading 7" w:uiPriority="9" w:semiHidden="1" w:unhideWhenUsed="1" w:qFormat="1"/>
-    <w:lsdException w:name="heading 8" w:uiPriority="9" w:semiHidden="1" w:unhideWhenUsed="1" w:qFormat="1"/>
-    <w:lsdException w:name="heading 9" w:uiPriority="9" w:semiHidden="1" w:unhideWhenUsed="1" w:qFormat="1"/>
+    <w:lsdException w:name="heading 2" w:semiHidden="1" w:uiPriority="9" w:unhideWhenUsed="1" w:qFormat="1"/>
+    <w:lsdException w:name="heading 3" w:semiHidden="1" w:uiPriority="9" w:unhideWhenUsed="1" w:qFormat="1"/>
+    <w:lsdException w:name="heading 4" w:semiHidden="1" w:uiPriority="9" w:unhideWhenUsed="1" w:qFormat="1"/>
+    <w:lsdException w:name="heading 5" w:semiHidden="1" w:uiPriority="9" w:unhideWhenUsed="1" w:qFormat="1"/>
+    <w:lsdException w:name="heading 6" w:semiHidden="1" w:uiPriority="9" w:unhideWhenUsed="1" w:qFormat="1"/>
+    <w:lsdException w:name="heading 7" w:semiHidden="1" w:uiPriority="9" w:unhideWhenUsed="1" w:qFormat="1"/>
+    <w:lsdException w:name="heading 8" w:semiHidden="1" w:uiPriority="9" w:unhideWhenUsed="1" w:qFormat="1"/>
+    <w:lsdException w:name="heading 9" w:semiHidden="1" w:uiPriority="9" w:unhideWhenUsed="1" w:qFormat="1"/>
     <w:lsdException w:name="index 1" w:semiHidden="1" w:unhideWhenUsed="1"/>
     <w:lsdException w:name="index 2" w:semiHidden="1" w:unhideWhenUsed="1"/>
     <w:lsdException w:name="index 3" w:semiHidden="1" w:unhideWhenUsed="1"/>
@@ -686,22 +574,22 @@
     <w:lsdException w:name="index 7" w:semiHidden="1" w:unhideWhenUsed="1"/>
     <w:lsdException w:name="index 8" w:semiHidden="1" w:unhideWhenUsed="1"/>
     <w:lsdException w:name="index 9" w:semiHidden="1" w:unhideWhenUsed="1"/>
-    <w:lsdException w:name="toc 1" w:uiPriority="39" w:semiHidden="1" w:unhideWhenUsed="1"/>
-    <w:lsdException w:name="toc 2" w:uiPriority="39" w:semiHidden="1" w:unhideWhenUsed="1"/>
-    <w:lsdException w:name="toc 3" w:uiPriority="39" w:semiHidden="1" w:unhideWhenUsed="1"/>
-    <w:lsdException w:name="toc 4" w:uiPriority="39" w:semiHidden="1" w:unhideWhenUsed="1"/>
-    <w:lsdException w:name="toc 5" w:uiPriority="39" w:semiHidden="1" w:unhideWhenUsed="1"/>
-    <w:lsdException w:name="toc 6" w:uiPriority="39" w:semiHidden="1" w:unhideWhenUsed="1"/>
-    <w:lsdException w:name="toc 7" w:uiPriority="39" w:semiHidden="1" w:unhideWhenUsed="1"/>
-    <w:lsdException w:name="toc 8" w:uiPriority="39" w:semiHidden="1" w:unhideWhenUsed="1"/>
-    <w:lsdException w:name="toc 9" w:uiPriority="39" w:semiHidden="1" w:unhideWhenUsed="1"/>
+    <w:lsdException w:name="toc 1" w:semiHidden="1" w:uiPriority="39" w:unhideWhenUsed="1"/>
+    <w:lsdException w:name="toc 2" w:semiHidden="1" w:uiPriority="39" w:unhideWhenUsed="1"/>
+    <w:lsdException w:name="toc 3" w:semiHidden="1" w:uiPriority="39" w:unhideWhenUsed="1"/>
+    <w:lsdException w:name="toc 4" w:semiHidden="1" w:uiPriority="39" w:unhideWhenUsed="1"/>
+    <w:lsdException w:name="toc 5" w:semiHidden="1" w:uiPriority="39" w:unhideWhenUsed="1"/>
+    <w:lsdException w:name="toc 6" w:semiHidden="1" w:uiPriority="39" w:unhideWhenUsed="1"/>
+    <w:lsdException w:name="toc 7" w:semiHidden="1" w:uiPriority="39" w:unhideWhenUsed="1"/>
+    <w:lsdException w:name="toc 8" w:semiHidden="1" w:uiPriority="39" w:unhideWhenUsed="1"/>
+    <w:lsdException w:name="toc 9" w:semiHidden="1" w:uiPriority="39" w:unhideWhenUsed="1"/>
     <w:lsdException w:name="Normal Indent" w:semiHidden="1" w:unhideWhenUsed="1"/>
     <w:lsdException w:name="footnote text" w:semiHidden="1" w:unhideWhenUsed="1"/>
     <w:lsdException w:name="annotation text" w:semiHidden="1" w:unhideWhenUsed="1"/>
     <w:lsdException w:name="header" w:semiHidden="1" w:unhideWhenUsed="1"/>
     <w:lsdException w:name="footer" w:semiHidden="1" w:unhideWhenUsed="1"/>
     <w:lsdException w:name="index heading" w:semiHidden="1" w:unhideWhenUsed="1"/>
-    <w:lsdException w:name="caption" w:uiPriority="35" w:semiHidden="1" w:unhideWhenUsed="1" w:qFormat="1"/>
+    <w:lsdException w:name="caption" w:semiHidden="1" w:uiPriority="35" w:unhideWhenUsed="1" w:qFormat="1"/>
     <w:lsdException w:name="table of figures" w:semiHidden="1" w:unhideWhenUsed="1"/>
     <w:lsdException w:name="envelope address" w:semiHidden="1" w:unhideWhenUsed="1"/>
     <w:lsdException w:name="envelope return" w:semiHidden="1" w:unhideWhenUsed="1"/>
@@ -732,7 +620,7 @@
     <w:lsdException w:name="Title" w:uiPriority="10" w:qFormat="1"/>
     <w:lsdException w:name="Closing" w:semiHidden="1" w:unhideWhenUsed="1"/>
     <w:lsdException w:name="Signature" w:semiHidden="1" w:unhideWhenUsed="1"/>
-    <w:lsdException w:name="Default Paragraph Font" w:uiPriority="1" w:semiHidden="1" w:unhideWhenUsed="1"/>
+    <w:lsdException w:name="Default Paragraph Font" w:semiHidden="1" w:uiPriority="1" w:unhideWhenUsed="1"/>
     <w:lsdException w:name="Body Text" w:semiHidden="1" w:unhideWhenUsed="1"/>
     <w:lsdException w:name="Body Text Indent" w:semiHidden="1" w:unhideWhenUsed="1"/>
     <w:lsdException w:name="List Continue" w:semiHidden="1" w:unhideWhenUsed="1"/>
@@ -932,8 +820,8 @@
     <w:lsdException w:name="Subtle Reference" w:uiPriority="31" w:qFormat="1"/>
     <w:lsdException w:name="Intense Reference" w:uiPriority="32" w:qFormat="1"/>
     <w:lsdException w:name="Book Title" w:uiPriority="33" w:qFormat="1"/>
-    <w:lsdException w:name="Bibliography" w:uiPriority="37" w:semiHidden="1" w:unhideWhenUsed="1"/>
-    <w:lsdException w:name="TOC Heading" w:uiPriority="39" w:semiHidden="1" w:unhideWhenUsed="1" w:qFormat="1"/>
+    <w:lsdException w:name="Bibliography" w:semiHidden="1" w:uiPriority="37" w:unhideWhenUsed="1"/>
+    <w:lsdException w:name="TOC Heading" w:semiHidden="1" w:uiPriority="39" w:unhideWhenUsed="1" w:qFormat="1"/>
     <w:lsdException w:name="Plain Table 1" w:uiPriority="41"/>
     <w:lsdException w:name="Plain Table 2" w:uiPriority="42"/>
     <w:lsdException w:name="Plain Table 3" w:uiPriority="43"/>
@@ -1038,55 +926,53 @@
     <w:lsdException w:name="List Table 5 Dark Accent 6" w:uiPriority="50"/>
     <w:lsdException w:name="List Table 6 Colorful Accent 6" w:uiPriority="51"/>
     <w:lsdException w:name="List Table 7 Colorful Accent 6" w:uiPriority="52"/>
-    <w:lsdException w:name="Mention" w:semiHidden="1" w:unhideWhenUsed="1"/>
-    <w:lsdException w:name="Smart Hyperlink" w:semiHidden="1" w:unhideWhenUsed="1"/>
-    <w:lsdException w:name="Hashtag" w:semiHidden="1" w:unhideWhenUsed="1"/>
-    <w:lsdException w:name="Unresolved Mention" w:semiHidden="1" w:unhideWhenUsed="1"/>
-    <w:lsdException w:name="Smart Link" w:semiHidden="1" w:unhideWhenUsed="1"/>
   </w:latentStyles>
-  <w:style w:type="paragraph" w:styleId="Normal" w:default="1">
+  <w:style w:type="paragraph" w:default="1" w:styleId="Normal">
     <w:name w:val="Normal"/>
     <w:qFormat/>
-    <w:pPr>
-      <w:widowControl/>
-      <w:suppressAutoHyphens w:val="true"/>
-      <w:bidi w:val="0"/>
-      <w:spacing w:before="0" w:after="0"/>
-      <w:jc w:val="start"/>
-    </w:pPr>
-    <w:rPr>
-      <w:rFonts w:ascii="Liberation Serif" w:hAnsi="Liberation Serif" w:eastAsia="Noto Serif CJK SC" w:cs="Noto Sans Devanagari"/>
-      <w:color w:val="auto"/>
-      <w:kern w:val="2"/>
-      <w:sz w:val="24"/>
-      <w:szCs w:val="24"/>
-      <w:lang w:val="en-US" w:eastAsia="zh-CN" w:bidi="hi-IN"/>
-    </w:rPr>
   </w:style>
-  <w:style w:type="character" w:styleId="DefaultParagraphFont" w:default="1">
+  <w:style w:type="character" w:default="1" w:styleId="DefaultParagraphFont">
     <w:name w:val="Default Paragraph Font"/>
     <w:uiPriority w:val="1"/>
     <w:semiHidden/>
     <w:unhideWhenUsed/>
-    <w:qFormat/>
-    <w:rPr/>
   </w:style>
-  <w:style w:type="character" w:styleId="NumberingSymbols">
+  <w:style w:type="table" w:default="1" w:styleId="TableNormal">
+    <w:name w:val="Normal Table"/>
+    <w:uiPriority w:val="99"/>
+    <w:semiHidden/>
+    <w:unhideWhenUsed/>
+    <w:tblPr>
+      <w:tblInd w:w="0" w:type="dxa"/>
+      <w:tblCellMar>
+        <w:top w:w="0" w:type="dxa"/>
+        <w:left w:w="108" w:type="dxa"/>
+        <w:bottom w:w="0" w:type="dxa"/>
+        <w:right w:w="108" w:type="dxa"/>
+      </w:tblCellMar>
+    </w:tblPr>
+  </w:style>
+  <w:style w:type="numbering" w:default="1" w:styleId="NoList">
+    <w:name w:val="No List"/>
+    <w:uiPriority w:val="99"/>
+    <w:semiHidden/>
+    <w:unhideWhenUsed/>
+  </w:style>
+  <w:style w:type="character" w:customStyle="1" w:styleId="NumberingSymbols">
     <w:name w:val="Numbering Symbols"/>
     <w:qFormat/>
-    <w:rPr/>
   </w:style>
-  <w:style w:type="paragraph" w:styleId="Heading" w:customStyle="1">
+  <w:style w:type="paragraph" w:customStyle="1" w:styleId="Heading">
     <w:name w:val="Heading"/>
     <w:basedOn w:val="Normal"/>
     <w:next w:val="BodyText"/>
     <w:qFormat/>
     <w:pPr>
-      <w:keepNext w:val="true"/>
+      <w:keepNext/>
       <w:spacing w:before="240" w:after="120"/>
     </w:pPr>
     <w:rPr>
-      <w:rFonts w:ascii="Liberation Sans" w:hAnsi="Liberation Sans" w:eastAsia="Noto Sans CJK SC"/>
+      <w:rFonts w:ascii="Liberation Sans" w:eastAsia="Noto Sans CJK SC" w:hAnsi="Liberation Sans"/>
       <w:sz w:val="28"/>
       <w:szCs w:val="28"/>
     </w:rPr>
@@ -1095,18 +981,15 @@
     <w:name w:val="Body Text"/>
     <w:basedOn w:val="Normal"/>
     <w:pPr>
-      <w:spacing w:lineRule="auto" w:line="276" w:before="0" w:after="140"/>
+      <w:spacing w:after="140" w:line="276" w:lineRule="auto"/>
     </w:pPr>
-    <w:rPr/>
   </w:style>
   <w:style w:type="paragraph" w:styleId="List">
     <w:name w:val="List"/>
     <w:basedOn w:val="BodyText"/>
-    <w:pPr/>
-    <w:rPr/>
   </w:style>
   <w:style w:type="paragraph" w:styleId="Caption">
-    <w:name w:val="Caption"/>
+    <w:name w:val="caption"/>
     <w:basedOn w:val="Normal"/>
     <w:qFormat/>
     <w:pPr>
@@ -1118,14 +1001,13 @@
       <w:iCs/>
     </w:rPr>
   </w:style>
-  <w:style w:type="paragraph" w:styleId="Index" w:customStyle="1">
+  <w:style w:type="paragraph" w:customStyle="1" w:styleId="Index">
     <w:name w:val="Index"/>
     <w:basedOn w:val="Normal"/>
     <w:qFormat/>
     <w:pPr>
       <w:suppressLineNumbers/>
     </w:pPr>
-    <w:rPr/>
   </w:style>
   <w:style w:type="paragraph" w:styleId="Title">
     <w:name w:val="Title"/>
@@ -1143,91 +1025,69 @@
       <w:szCs w:val="56"/>
     </w:rPr>
   </w:style>
-  <w:style w:type="paragraph" w:styleId="TableContents" w:customStyle="1">
+  <w:style w:type="paragraph" w:customStyle="1" w:styleId="TableContents">
     <w:name w:val="Table Contents"/>
     <w:basedOn w:val="Normal"/>
     <w:qFormat/>
     <w:pPr>
-      <w:widowControl w:val="false"/>
+      <w:widowControl w:val="0"/>
       <w:suppressLineNumbers/>
     </w:pPr>
-    <w:rPr/>
-  </w:style>
-  <w:style w:type="numbering" w:styleId="NoList" w:default="1">
-    <w:name w:val="No List"/>
-    <w:uiPriority w:val="99"/>
-    <w:semiHidden/>
-    <w:unhideWhenUsed/>
-    <w:qFormat/>
-  </w:style>
-  <w:style w:type="table" w:default="1" w:styleId="TableNormal">
-    <w:name w:val="Normal Table"/>
-    <w:uiPriority w:val="99"/>
-    <w:semiHidden/>
-    <w:unhideWhenUsed/>
-    <w:tblPr>
-      <w:tblCellMar>
-        <w:top w:w="0" w:type="dxa"/>
-        <w:left w:w="108" w:type="dxa"/>
-        <w:bottom w:w="0" w:type="dxa"/>
-        <w:right w:w="108" w:type="dxa"/>
-      </w:tblCellMar>
-    </w:tblPr>
   </w:style>
 </w:styles>
 </file>
 
 <file path=word/theme/theme1.xml><?xml version="1.0" encoding="utf-8"?>
-<a:theme xmlns:a="http://schemas.openxmlformats.org/drawingml/2006/main" xmlns:r="http://schemas.openxmlformats.org/officeDocument/2006/relationships" name="Office">
+<a:theme xmlns:a="http://schemas.openxmlformats.org/drawingml/2006/main" name="Office">
   <a:themeElements>
     <a:clrScheme name="LibreOffice">
       <a:dk1>
         <a:srgbClr val="000000"/>
       </a:dk1>
       <a:lt1>
-        <a:srgbClr val="ffffff"/>
+        <a:srgbClr val="FFFFFF"/>
       </a:lt1>
       <a:dk2>
         <a:srgbClr val="000000"/>
       </a:dk2>
       <a:lt2>
-        <a:srgbClr val="ffffff"/>
+        <a:srgbClr val="FFFFFF"/>
       </a:lt2>
       <a:accent1>
-        <a:srgbClr val="18a303"/>
+        <a:srgbClr val="18A303"/>
       </a:accent1>
       <a:accent2>
-        <a:srgbClr val="0369a3"/>
+        <a:srgbClr val="0369A3"/>
       </a:accent2>
       <a:accent3>
-        <a:srgbClr val="a33e03"/>
+        <a:srgbClr val="A33E03"/>
       </a:accent3>
       <a:accent4>
-        <a:srgbClr val="8e03a3"/>
+        <a:srgbClr val="8E03A3"/>
       </a:accent4>
       <a:accent5>
-        <a:srgbClr val="c99c00"/>
+        <a:srgbClr val="C99C00"/>
       </a:accent5>
       <a:accent6>
-        <a:srgbClr val="c9211e"/>
+        <a:srgbClr val="C9211E"/>
       </a:accent6>
       <a:hlink>
-        <a:srgbClr val="0000ee"/>
+        <a:srgbClr val="0000EE"/>
       </a:hlink>
       <a:folHlink>
-        <a:srgbClr val="551a8b"/>
+        <a:srgbClr val="551A8B"/>
       </a:folHlink>
     </a:clrScheme>
     <a:fontScheme name="Office">
       <a:majorFont>
-        <a:latin typeface="Arial" pitchFamily="0" charset="1"/>
-        <a:ea typeface="DejaVu Sans" pitchFamily="0" charset="1"/>
-        <a:cs typeface="DejaVu Sans" pitchFamily="0" charset="1"/>
+        <a:latin typeface="Arial"/>
+        <a:ea typeface="DejaVu Sans"/>
+        <a:cs typeface="DejaVu Sans"/>
       </a:majorFont>
       <a:minorFont>
-        <a:latin typeface="Arial" pitchFamily="0" charset="1"/>
-        <a:ea typeface="DejaVu Sans" pitchFamily="0" charset="1"/>
-        <a:cs typeface="DejaVu Sans" pitchFamily="0" charset="1"/>
+        <a:latin typeface="Arial"/>
+        <a:ea typeface="DejaVu Sans"/>
+        <a:cs typeface="DejaVu Sans"/>
       </a:minorFont>
     </a:fontScheme>
     <a:fmtScheme>
@@ -1280,5 +1140,7 @@
       </a:bgFillStyleLst>
     </a:fmtScheme>
   </a:themeElements>
+  <a:objectDefaults/>
+  <a:extraClrSchemeLst/>
 </a:theme>
 </file>
</xml_diff>